<commit_message>
Punto 1,2, y 4 Word
Agregue la primera gráfica en el punto 1 al igual que la tabla del punto 2 e hice el analisis de los resultados basado en las gráficas obtenidas dentro del código
</commit_message>
<xml_diff>
--- a/Caso Web Analytics .docx
+++ b/Caso Web Analytics .docx
@@ -29,20 +29,17 @@
       <w:pPr>
         <w:rPr>
           <w:rFonts w:ascii="Times New Roman" w:hAnsi="Times New Roman" w:cs="Times New Roman"/>
-          <w:lang w:val="es-CO"/>
         </w:rPr>
       </w:pPr>
       <w:r>
         <w:rPr>
           <w:rFonts w:ascii="Times New Roman" w:hAnsi="Times New Roman" w:cs="Times New Roman"/>
-          <w:lang w:val="es-CO"/>
         </w:rPr>
         <w:t>Juan Esteban Daza, Mariana Hernán</w:t>
       </w:r>
       <w:r>
         <w:rPr>
           <w:rFonts w:ascii="Times New Roman" w:hAnsi="Times New Roman" w:cs="Times New Roman"/>
-          <w:lang w:val="es-CO"/>
         </w:rPr>
         <w:t>dez y Sofia Acuña</w:t>
       </w:r>
@@ -51,13 +48,12 @@
       <w:pPr>
         <w:rPr>
           <w:rFonts w:ascii="Times New Roman" w:hAnsi="Times New Roman" w:cs="Times New Roman"/>
-          <w:lang w:val="es-CO"/>
-        </w:rPr>
-      </w:pPr>
-    </w:p>
-    <w:p>
-      <w:pPr>
-        <w:pStyle w:val="ListParagraph"/>
+        </w:rPr>
+      </w:pPr>
+    </w:p>
+    <w:p>
+      <w:pPr>
+        <w:pStyle w:val="Prrafodelista"/>
         <w:numPr>
           <w:ilvl w:val="0"/>
           <w:numId w:val="1"/>
@@ -68,7 +64,6 @@
           <w:bCs/>
           <w:sz w:val="28"/>
           <w:szCs w:val="28"/>
-          <w:lang w:val="es-CO"/>
         </w:rPr>
       </w:pPr>
       <w:r>
@@ -78,7 +73,6 @@
           <w:bCs/>
           <w:sz w:val="28"/>
           <w:szCs w:val="28"/>
-          <w:lang w:val="es-CO"/>
         </w:rPr>
         <w:t xml:space="preserve">Resumen Ejecutivo </w:t>
       </w:r>
@@ -87,37 +81,33 @@
       <w:pPr>
         <w:rPr>
           <w:rFonts w:ascii="Times New Roman" w:hAnsi="Times New Roman" w:cs="Times New Roman"/>
-          <w:lang w:val="es-CO"/>
-        </w:rPr>
-      </w:pPr>
-    </w:p>
-    <w:p>
-      <w:pPr>
-        <w:rPr>
-          <w:rFonts w:ascii="Times New Roman" w:hAnsi="Times New Roman" w:cs="Times New Roman"/>
-          <w:lang w:val="es-CO"/>
-        </w:rPr>
-      </w:pPr>
-    </w:p>
-    <w:p>
-      <w:pPr>
-        <w:rPr>
-          <w:rFonts w:ascii="Times New Roman" w:hAnsi="Times New Roman" w:cs="Times New Roman"/>
-          <w:lang w:val="es-CO"/>
-        </w:rPr>
-      </w:pPr>
-    </w:p>
-    <w:p>
-      <w:pPr>
-        <w:rPr>
-          <w:rFonts w:ascii="Times New Roman" w:hAnsi="Times New Roman" w:cs="Times New Roman"/>
-          <w:lang w:val="es-CO"/>
-        </w:rPr>
-      </w:pPr>
-    </w:p>
-    <w:p>
-      <w:pPr>
-        <w:pStyle w:val="ListParagraph"/>
+        </w:rPr>
+      </w:pPr>
+    </w:p>
+    <w:p>
+      <w:pPr>
+        <w:rPr>
+          <w:rFonts w:ascii="Times New Roman" w:hAnsi="Times New Roman" w:cs="Times New Roman"/>
+        </w:rPr>
+      </w:pPr>
+    </w:p>
+    <w:p>
+      <w:pPr>
+        <w:rPr>
+          <w:rFonts w:ascii="Times New Roman" w:hAnsi="Times New Roman" w:cs="Times New Roman"/>
+        </w:rPr>
+      </w:pPr>
+    </w:p>
+    <w:p>
+      <w:pPr>
+        <w:rPr>
+          <w:rFonts w:ascii="Times New Roman" w:hAnsi="Times New Roman" w:cs="Times New Roman"/>
+        </w:rPr>
+      </w:pPr>
+    </w:p>
+    <w:p>
+      <w:pPr>
+        <w:pStyle w:val="Prrafodelista"/>
         <w:numPr>
           <w:ilvl w:val="0"/>
           <w:numId w:val="1"/>
@@ -128,7 +118,6 @@
           <w:bCs/>
           <w:sz w:val="28"/>
           <w:szCs w:val="28"/>
-          <w:lang w:val="es-CO"/>
         </w:rPr>
       </w:pPr>
       <w:r>
@@ -138,7 +127,6 @@
           <w:bCs/>
           <w:sz w:val="28"/>
           <w:szCs w:val="28"/>
-          <w:lang w:val="es-CO"/>
         </w:rPr>
         <w:t xml:space="preserve">Análisis datos </w:t>
       </w:r>
@@ -147,15 +135,1999 @@
       <w:pPr>
         <w:rPr>
           <w:rFonts w:ascii="Times New Roman" w:hAnsi="Times New Roman" w:cs="Times New Roman"/>
-          <w:lang w:val="es-CO"/>
-        </w:rPr>
-      </w:pPr>
-    </w:p>
-    <w:p>
-      <w:pPr>
-        <w:rPr>
-          <w:rFonts w:ascii="Times New Roman" w:hAnsi="Times New Roman" w:cs="Times New Roman"/>
-          <w:lang w:val="es-CO"/>
+        </w:rPr>
+      </w:pPr>
+    </w:p>
+    <w:p>
+      <w:pPr>
+        <w:rPr>
+          <w:rFonts w:ascii="Times New Roman" w:hAnsi="Times New Roman" w:cs="Times New Roman"/>
+        </w:rPr>
+      </w:pPr>
+    </w:p>
+    <w:p>
+      <w:pPr>
+        <w:rPr>
+          <w:rFonts w:ascii="Times New Roman" w:hAnsi="Times New Roman" w:cs="Times New Roman"/>
+        </w:rPr>
+      </w:pPr>
+    </w:p>
+    <w:p>
+      <w:pPr>
+        <w:rPr>
+          <w:rFonts w:ascii="Times New Roman" w:hAnsi="Times New Roman" w:cs="Times New Roman"/>
+        </w:rPr>
+      </w:pPr>
+    </w:p>
+    <w:p>
+      <w:pPr>
+        <w:rPr>
+          <w:rFonts w:ascii="Times New Roman" w:hAnsi="Times New Roman" w:cs="Times New Roman"/>
+        </w:rPr>
+      </w:pPr>
+    </w:p>
+    <w:p>
+      <w:pPr>
+        <w:rPr>
+          <w:rFonts w:ascii="Times New Roman" w:hAnsi="Times New Roman" w:cs="Times New Roman"/>
+        </w:rPr>
+      </w:pPr>
+    </w:p>
+    <w:p>
+      <w:pPr>
+        <w:rPr>
+          <w:rFonts w:ascii="Times New Roman" w:hAnsi="Times New Roman" w:cs="Times New Roman"/>
+        </w:rPr>
+      </w:pPr>
+    </w:p>
+    <w:p>
+      <w:pPr>
+        <w:rPr>
+          <w:rFonts w:ascii="Times New Roman" w:hAnsi="Times New Roman" w:cs="Times New Roman"/>
+        </w:rPr>
+      </w:pPr>
+    </w:p>
+    <w:p>
+      <w:pPr>
+        <w:rPr>
+          <w:rFonts w:ascii="Times New Roman" w:hAnsi="Times New Roman" w:cs="Times New Roman"/>
+        </w:rPr>
+      </w:pPr>
+    </w:p>
+    <w:p>
+      <w:pPr>
+        <w:rPr>
+          <w:rFonts w:ascii="Times New Roman" w:hAnsi="Times New Roman" w:cs="Times New Roman"/>
+        </w:rPr>
+      </w:pPr>
+    </w:p>
+    <w:p>
+      <w:pPr>
+        <w:rPr>
+          <w:rFonts w:ascii="Times New Roman" w:hAnsi="Times New Roman" w:cs="Times New Roman"/>
+        </w:rPr>
+      </w:pPr>
+    </w:p>
+    <w:p>
+      <w:pPr>
+        <w:rPr>
+          <w:rFonts w:ascii="Times New Roman" w:hAnsi="Times New Roman" w:cs="Times New Roman"/>
+        </w:rPr>
+      </w:pPr>
+    </w:p>
+    <w:p>
+      <w:pPr>
+        <w:rPr>
+          <w:rFonts w:ascii="Times New Roman" w:hAnsi="Times New Roman" w:cs="Times New Roman"/>
+        </w:rPr>
+      </w:pPr>
+    </w:p>
+    <w:p>
+      <w:pPr>
+        <w:rPr>
+          <w:rFonts w:ascii="Times New Roman" w:hAnsi="Times New Roman" w:cs="Times New Roman"/>
+        </w:rPr>
+      </w:pPr>
+    </w:p>
+    <w:p>
+      <w:pPr>
+        <w:rPr>
+          <w:rFonts w:ascii="Times New Roman" w:hAnsi="Times New Roman" w:cs="Times New Roman"/>
+        </w:rPr>
+      </w:pPr>
+    </w:p>
+    <w:p>
+      <w:pPr>
+        <w:rPr>
+          <w:rFonts w:ascii="Times New Roman" w:hAnsi="Times New Roman" w:cs="Times New Roman"/>
+        </w:rPr>
+      </w:pPr>
+    </w:p>
+    <w:p>
+      <w:pPr>
+        <w:rPr>
+          <w:rFonts w:ascii="Times New Roman" w:hAnsi="Times New Roman" w:cs="Times New Roman"/>
+        </w:rPr>
+      </w:pPr>
+    </w:p>
+    <w:p>
+      <w:pPr>
+        <w:pStyle w:val="Prrafodelista"/>
+        <w:numPr>
+          <w:ilvl w:val="0"/>
+          <w:numId w:val="2"/>
+        </w:numPr>
+        <w:rPr>
+          <w:rFonts w:ascii="Times New Roman" w:hAnsi="Times New Roman" w:cs="Times New Roman"/>
+          <w:b/>
+          <w:bCs/>
+        </w:rPr>
+      </w:pPr>
+      <w:r>
+        <w:rPr>
+          <w:rFonts w:ascii="Times New Roman" w:hAnsi="Times New Roman" w:cs="Times New Roman"/>
+          <w:b/>
+          <w:bCs/>
+        </w:rPr>
+        <w:lastRenderedPageBreak/>
+        <w:t>Gráficas</w:t>
+      </w:r>
+      <w:r>
+        <w:rPr>
+          <w:rFonts w:ascii="Times New Roman" w:hAnsi="Times New Roman" w:cs="Times New Roman"/>
+          <w:b/>
+          <w:bCs/>
+        </w:rPr>
+        <w:t xml:space="preserve"> </w:t>
+      </w:r>
+      <w:proofErr w:type="spellStart"/>
+      <w:r>
+        <w:rPr>
+          <w:rFonts w:ascii="Times New Roman" w:hAnsi="Times New Roman" w:cs="Times New Roman"/>
+          <w:b/>
+          <w:bCs/>
+        </w:rPr>
+        <w:t>Column</w:t>
+      </w:r>
+      <w:proofErr w:type="spellEnd"/>
+      <w:r>
+        <w:rPr>
+          <w:rFonts w:ascii="Times New Roman" w:hAnsi="Times New Roman" w:cs="Times New Roman"/>
+          <w:b/>
+          <w:bCs/>
+        </w:rPr>
+        <w:t xml:space="preserve"> Charts </w:t>
+      </w:r>
+    </w:p>
+    <w:p>
+      <w:pPr>
+        <w:ind w:left="360"/>
+        <w:rPr>
+          <w:rFonts w:ascii="Times New Roman" w:hAnsi="Times New Roman" w:cs="Times New Roman"/>
+        </w:rPr>
+      </w:pPr>
+      <w:r>
+        <w:rPr>
+          <w:rFonts w:ascii="Times New Roman" w:hAnsi="Times New Roman" w:cs="Times New Roman"/>
+          <w:noProof/>
+        </w:rPr>
+        <w:drawing>
+          <wp:inline distT="0" distB="0" distL="0" distR="0" wp14:anchorId="2299A339" wp14:editId="12154A32">
+            <wp:extent cx="5943600" cy="5943600"/>
+            <wp:effectExtent l="0" t="0" r="0" b="0"/>
+            <wp:docPr id="221474726" name="Imagen 1"/>
+            <wp:cNvGraphicFramePr>
+              <a:graphicFrameLocks xmlns:a="http://schemas.openxmlformats.org/drawingml/2006/main" noChangeAspect="1"/>
+            </wp:cNvGraphicFramePr>
+            <a:graphic xmlns:a="http://schemas.openxmlformats.org/drawingml/2006/main">
+              <a:graphicData uri="http://schemas.openxmlformats.org/drawingml/2006/picture">
+                <pic:pic xmlns:pic="http://schemas.openxmlformats.org/drawingml/2006/picture">
+                  <pic:nvPicPr>
+                    <pic:cNvPr id="221474726" name="Imagen 221474726"/>
+                    <pic:cNvPicPr/>
+                  </pic:nvPicPr>
+                  <pic:blipFill>
+                    <a:blip r:embed="rId7" cstate="print">
+                      <a:extLst>
+                        <a:ext uri="{28A0092B-C50C-407E-A947-70E740481C1C}">
+                          <a14:useLocalDpi xmlns:a14="http://schemas.microsoft.com/office/drawing/2010/main" val="0"/>
+                        </a:ext>
+                      </a:extLst>
+                    </a:blip>
+                    <a:stretch>
+                      <a:fillRect/>
+                    </a:stretch>
+                  </pic:blipFill>
+                  <pic:spPr>
+                    <a:xfrm>
+                      <a:off x="0" y="0"/>
+                      <a:ext cx="5943600" cy="5943600"/>
+                    </a:xfrm>
+                    <a:prstGeom prst="rect">
+                      <a:avLst/>
+                    </a:prstGeom>
+                  </pic:spPr>
+                </pic:pic>
+              </a:graphicData>
+            </a:graphic>
+          </wp:inline>
+        </w:drawing>
+      </w:r>
+    </w:p>
+    <w:p>
+      <w:pPr>
+        <w:pStyle w:val="Prrafodelista"/>
+        <w:numPr>
+          <w:ilvl w:val="0"/>
+          <w:numId w:val="2"/>
+        </w:numPr>
+        <w:rPr>
+          <w:rFonts w:ascii="Times New Roman" w:hAnsi="Times New Roman" w:cs="Times New Roman"/>
+          <w:b/>
+          <w:bCs/>
+        </w:rPr>
+      </w:pPr>
+      <w:r>
+        <w:rPr>
+          <w:rFonts w:ascii="Times New Roman" w:hAnsi="Times New Roman" w:cs="Times New Roman"/>
+          <w:b/>
+          <w:bCs/>
+        </w:rPr>
+        <w:t xml:space="preserve">Tablas resumen estadísticos descriptivos </w:t>
+      </w:r>
+    </w:p>
+    <w:p>
+      <w:pPr>
+        <w:rPr>
+          <w:rFonts w:ascii="Times New Roman" w:hAnsi="Times New Roman" w:cs="Times New Roman"/>
+          <w:b/>
+          <w:bCs/>
+          <w:sz w:val="21"/>
+          <w:szCs w:val="21"/>
+        </w:rPr>
+      </w:pPr>
+      <w:r>
+        <w:rPr>
+          <w:rFonts w:ascii="Times New Roman" w:hAnsi="Times New Roman" w:cs="Times New Roman"/>
+          <w:b/>
+          <w:bCs/>
+          <w:sz w:val="21"/>
+          <w:szCs w:val="21"/>
+        </w:rPr>
+        <w:t>Taba 1. Periodo inicial</w:t>
+      </w:r>
+    </w:p>
+    <w:tbl>
+      <w:tblPr>
+        <w:tblW w:w="0" w:type="auto"/>
+        <w:tblCellMar>
+          <w:left w:w="0" w:type="dxa"/>
+          <w:right w:w="0" w:type="dxa"/>
+        </w:tblCellMar>
+        <w:tblLook w:val="04A0" w:firstRow="1" w:lastRow="0" w:firstColumn="1" w:lastColumn="0" w:noHBand="0" w:noVBand="1"/>
+      </w:tblPr>
+      <w:tblGrid>
+        <w:gridCol w:w="822"/>
+        <w:gridCol w:w="663"/>
+        <w:gridCol w:w="1053"/>
+        <w:gridCol w:w="829"/>
+        <w:gridCol w:w="829"/>
+        <w:gridCol w:w="746"/>
+      </w:tblGrid>
+      <w:tr>
+        <w:trPr>
+          <w:trHeight w:val="165"/>
+        </w:trPr>
+        <w:tc>
+          <w:tcPr>
+            <w:tcW w:w="705" w:type="dxa"/>
+            <w:tcBorders>
+              <w:top w:val="single" w:sz="6" w:space="0" w:color="000000"/>
+              <w:left w:val="single" w:sz="6" w:space="0" w:color="000000"/>
+              <w:bottom w:val="single" w:sz="6" w:space="0" w:color="000000"/>
+              <w:right w:val="single" w:sz="6" w:space="0" w:color="000000"/>
+            </w:tcBorders>
+            <w:shd w:val="clear" w:color="auto" w:fill="B0B3B2"/>
+            <w:tcMar>
+              <w:top w:w="60" w:type="dxa"/>
+              <w:left w:w="60" w:type="dxa"/>
+              <w:bottom w:w="60" w:type="dxa"/>
+              <w:right w:w="60" w:type="dxa"/>
+            </w:tcMar>
+            <w:hideMark/>
+          </w:tcPr>
+          <w:p>
+            <w:pPr>
+              <w:spacing w:after="0" w:line="240" w:lineRule="auto"/>
+              <w:rPr>
+                <w:rFonts w:ascii="Helvetica" w:eastAsia="Times New Roman" w:hAnsi="Helvetica" w:cs="Times New Roman"/>
+                <w:kern w:val="0"/>
+                <w:sz w:val="18"/>
+                <w:szCs w:val="18"/>
+                <w:lang w:eastAsia="es-MX"/>
+                <w14:ligatures w14:val="none"/>
+              </w:rPr>
+            </w:pPr>
+          </w:p>
+        </w:tc>
+        <w:tc>
+          <w:tcPr>
+            <w:tcW w:w="540" w:type="dxa"/>
+            <w:tcBorders>
+              <w:top w:val="single" w:sz="6" w:space="0" w:color="000000"/>
+              <w:left w:val="single" w:sz="6" w:space="0" w:color="000000"/>
+              <w:bottom w:val="single" w:sz="6" w:space="0" w:color="000000"/>
+              <w:right w:val="single" w:sz="6" w:space="0" w:color="000000"/>
+            </w:tcBorders>
+            <w:shd w:val="clear" w:color="auto" w:fill="B0B3B2"/>
+            <w:tcMar>
+              <w:top w:w="60" w:type="dxa"/>
+              <w:left w:w="60" w:type="dxa"/>
+              <w:bottom w:w="60" w:type="dxa"/>
+              <w:right w:w="60" w:type="dxa"/>
+            </w:tcMar>
+            <w:hideMark/>
+          </w:tcPr>
+          <w:p>
+            <w:pPr>
+              <w:spacing w:after="0" w:line="240" w:lineRule="auto"/>
+              <w:rPr>
+                <w:rFonts w:ascii="Times New Roman" w:eastAsia="Times New Roman" w:hAnsi="Times New Roman" w:cs="Times New Roman"/>
+                <w:kern w:val="0"/>
+                <w:lang w:eastAsia="es-MX"/>
+                <w14:ligatures w14:val="none"/>
+              </w:rPr>
+            </w:pPr>
+            <w:proofErr w:type="spellStart"/>
+            <w:r>
+              <w:rPr>
+                <w:rFonts w:ascii="Helvetica Neue" w:eastAsia="Times New Roman" w:hAnsi="Helvetica Neue" w:cs="Times New Roman"/>
+                <w:b/>
+                <w:bCs/>
+                <w:color w:val="000000"/>
+                <w:kern w:val="0"/>
+                <w:sz w:val="15"/>
+                <w:szCs w:val="15"/>
+                <w:lang w:eastAsia="es-MX"/>
+                <w14:ligatures w14:val="none"/>
+              </w:rPr>
+              <w:t>Visits</w:t>
+            </w:r>
+            <w:proofErr w:type="spellEnd"/>
+          </w:p>
+        </w:tc>
+        <w:tc>
+          <w:tcPr>
+            <w:tcW w:w="930" w:type="dxa"/>
+            <w:tcBorders>
+              <w:top w:val="single" w:sz="6" w:space="0" w:color="000000"/>
+              <w:left w:val="single" w:sz="6" w:space="0" w:color="000000"/>
+              <w:bottom w:val="single" w:sz="6" w:space="0" w:color="000000"/>
+              <w:right w:val="single" w:sz="6" w:space="0" w:color="000000"/>
+            </w:tcBorders>
+            <w:shd w:val="clear" w:color="auto" w:fill="B0B3B2"/>
+            <w:tcMar>
+              <w:top w:w="60" w:type="dxa"/>
+              <w:left w:w="60" w:type="dxa"/>
+              <w:bottom w:w="60" w:type="dxa"/>
+              <w:right w:w="60" w:type="dxa"/>
+            </w:tcMar>
+            <w:hideMark/>
+          </w:tcPr>
+          <w:p>
+            <w:pPr>
+              <w:spacing w:after="0" w:line="240" w:lineRule="auto"/>
+              <w:rPr>
+                <w:rFonts w:ascii="Times New Roman" w:eastAsia="Times New Roman" w:hAnsi="Times New Roman" w:cs="Times New Roman"/>
+                <w:kern w:val="0"/>
+                <w:lang w:eastAsia="es-MX"/>
+                <w14:ligatures w14:val="none"/>
+              </w:rPr>
+            </w:pPr>
+            <w:proofErr w:type="spellStart"/>
+            <w:r>
+              <w:rPr>
+                <w:rFonts w:ascii="Helvetica Neue" w:eastAsia="Times New Roman" w:hAnsi="Helvetica Neue" w:cs="Times New Roman"/>
+                <w:b/>
+                <w:bCs/>
+                <w:color w:val="000000"/>
+                <w:kern w:val="0"/>
+                <w:sz w:val="15"/>
+                <w:szCs w:val="15"/>
+                <w:lang w:eastAsia="es-MX"/>
+                <w14:ligatures w14:val="none"/>
+              </w:rPr>
+              <w:t>Unique.Visits</w:t>
+            </w:r>
+            <w:proofErr w:type="spellEnd"/>
+          </w:p>
+        </w:tc>
+        <w:tc>
+          <w:tcPr>
+            <w:tcW w:w="705" w:type="dxa"/>
+            <w:tcBorders>
+              <w:top w:val="single" w:sz="6" w:space="0" w:color="000000"/>
+              <w:left w:val="single" w:sz="6" w:space="0" w:color="000000"/>
+              <w:bottom w:val="single" w:sz="6" w:space="0" w:color="000000"/>
+              <w:right w:val="single" w:sz="6" w:space="0" w:color="000000"/>
+            </w:tcBorders>
+            <w:shd w:val="clear" w:color="auto" w:fill="B0B3B2"/>
+            <w:tcMar>
+              <w:top w:w="60" w:type="dxa"/>
+              <w:left w:w="60" w:type="dxa"/>
+              <w:bottom w:w="60" w:type="dxa"/>
+              <w:right w:w="60" w:type="dxa"/>
+            </w:tcMar>
+            <w:hideMark/>
+          </w:tcPr>
+          <w:p>
+            <w:pPr>
+              <w:spacing w:after="0" w:line="240" w:lineRule="auto"/>
+              <w:rPr>
+                <w:rFonts w:ascii="Times New Roman" w:eastAsia="Times New Roman" w:hAnsi="Times New Roman" w:cs="Times New Roman"/>
+                <w:kern w:val="0"/>
+                <w:lang w:eastAsia="es-MX"/>
+                <w14:ligatures w14:val="none"/>
+              </w:rPr>
+            </w:pPr>
+            <w:proofErr w:type="spellStart"/>
+            <w:r>
+              <w:rPr>
+                <w:rFonts w:ascii="Helvetica Neue" w:eastAsia="Times New Roman" w:hAnsi="Helvetica Neue" w:cs="Times New Roman"/>
+                <w:b/>
+                <w:bCs/>
+                <w:color w:val="000000"/>
+                <w:kern w:val="0"/>
+                <w:sz w:val="15"/>
+                <w:szCs w:val="15"/>
+                <w:lang w:eastAsia="es-MX"/>
+                <w14:ligatures w14:val="none"/>
+              </w:rPr>
+              <w:t>Revenue</w:t>
+            </w:r>
+            <w:proofErr w:type="spellEnd"/>
+          </w:p>
+        </w:tc>
+        <w:tc>
+          <w:tcPr>
+            <w:tcW w:w="705" w:type="dxa"/>
+            <w:tcBorders>
+              <w:top w:val="single" w:sz="6" w:space="0" w:color="000000"/>
+              <w:left w:val="single" w:sz="6" w:space="0" w:color="000000"/>
+              <w:bottom w:val="single" w:sz="6" w:space="0" w:color="000000"/>
+              <w:right w:val="single" w:sz="6" w:space="0" w:color="000000"/>
+            </w:tcBorders>
+            <w:shd w:val="clear" w:color="auto" w:fill="B0B3B2"/>
+            <w:tcMar>
+              <w:top w:w="60" w:type="dxa"/>
+              <w:left w:w="60" w:type="dxa"/>
+              <w:bottom w:w="60" w:type="dxa"/>
+              <w:right w:w="60" w:type="dxa"/>
+            </w:tcMar>
+            <w:hideMark/>
+          </w:tcPr>
+          <w:p>
+            <w:pPr>
+              <w:spacing w:after="0" w:line="240" w:lineRule="auto"/>
+              <w:rPr>
+                <w:rFonts w:ascii="Times New Roman" w:eastAsia="Times New Roman" w:hAnsi="Times New Roman" w:cs="Times New Roman"/>
+                <w:kern w:val="0"/>
+                <w:lang w:eastAsia="es-MX"/>
+                <w14:ligatures w14:val="none"/>
+              </w:rPr>
+            </w:pPr>
+            <w:proofErr w:type="spellStart"/>
+            <w:r>
+              <w:rPr>
+                <w:rFonts w:ascii="Helvetica Neue" w:eastAsia="Times New Roman" w:hAnsi="Helvetica Neue" w:cs="Times New Roman"/>
+                <w:b/>
+                <w:bCs/>
+                <w:color w:val="000000"/>
+                <w:kern w:val="0"/>
+                <w:sz w:val="15"/>
+                <w:szCs w:val="15"/>
+                <w:lang w:eastAsia="es-MX"/>
+                <w14:ligatures w14:val="none"/>
+              </w:rPr>
+              <w:t>Profit</w:t>
+            </w:r>
+            <w:proofErr w:type="spellEnd"/>
+          </w:p>
+        </w:tc>
+        <w:tc>
+          <w:tcPr>
+            <w:tcW w:w="630" w:type="dxa"/>
+            <w:tcBorders>
+              <w:top w:val="single" w:sz="6" w:space="0" w:color="000000"/>
+              <w:left w:val="single" w:sz="6" w:space="0" w:color="000000"/>
+              <w:bottom w:val="single" w:sz="6" w:space="0" w:color="000000"/>
+              <w:right w:val="single" w:sz="6" w:space="0" w:color="000000"/>
+            </w:tcBorders>
+            <w:shd w:val="clear" w:color="auto" w:fill="B0B3B2"/>
+            <w:tcMar>
+              <w:top w:w="60" w:type="dxa"/>
+              <w:left w:w="60" w:type="dxa"/>
+              <w:bottom w:w="60" w:type="dxa"/>
+              <w:right w:w="60" w:type="dxa"/>
+            </w:tcMar>
+            <w:hideMark/>
+          </w:tcPr>
+          <w:p>
+            <w:pPr>
+              <w:spacing w:after="0" w:line="240" w:lineRule="auto"/>
+              <w:rPr>
+                <w:rFonts w:ascii="Times New Roman" w:eastAsia="Times New Roman" w:hAnsi="Times New Roman" w:cs="Times New Roman"/>
+                <w:kern w:val="0"/>
+                <w:lang w:eastAsia="es-MX"/>
+                <w14:ligatures w14:val="none"/>
+              </w:rPr>
+            </w:pPr>
+            <w:proofErr w:type="spellStart"/>
+            <w:r>
+              <w:rPr>
+                <w:rFonts w:ascii="Helvetica Neue" w:eastAsia="Times New Roman" w:hAnsi="Helvetica Neue" w:cs="Times New Roman"/>
+                <w:b/>
+                <w:bCs/>
+                <w:color w:val="000000"/>
+                <w:kern w:val="0"/>
+                <w:sz w:val="15"/>
+                <w:szCs w:val="15"/>
+                <w:lang w:eastAsia="es-MX"/>
+                <w14:ligatures w14:val="none"/>
+              </w:rPr>
+              <w:t>Lbs.Sold</w:t>
+            </w:r>
+            <w:proofErr w:type="spellEnd"/>
+          </w:p>
+        </w:tc>
+      </w:tr>
+      <w:tr>
+        <w:trPr>
+          <w:trHeight w:val="180"/>
+        </w:trPr>
+        <w:tc>
+          <w:tcPr>
+            <w:tcW w:w="705" w:type="dxa"/>
+            <w:tcBorders>
+              <w:top w:val="single" w:sz="6" w:space="0" w:color="000000"/>
+              <w:left w:val="single" w:sz="6" w:space="0" w:color="000000"/>
+              <w:bottom w:val="single" w:sz="6" w:space="0" w:color="000000"/>
+              <w:right w:val="single" w:sz="6" w:space="0" w:color="000000"/>
+            </w:tcBorders>
+            <w:shd w:val="clear" w:color="auto" w:fill="D4D4D4"/>
+            <w:tcMar>
+              <w:top w:w="60" w:type="dxa"/>
+              <w:left w:w="60" w:type="dxa"/>
+              <w:bottom w:w="60" w:type="dxa"/>
+              <w:right w:w="60" w:type="dxa"/>
+            </w:tcMar>
+            <w:hideMark/>
+          </w:tcPr>
+          <w:p>
+            <w:pPr>
+              <w:spacing w:after="0" w:line="240" w:lineRule="auto"/>
+              <w:rPr>
+                <w:rFonts w:ascii="Times New Roman" w:eastAsia="Times New Roman" w:hAnsi="Times New Roman" w:cs="Times New Roman"/>
+                <w:kern w:val="0"/>
+                <w:lang w:eastAsia="es-MX"/>
+                <w14:ligatures w14:val="none"/>
+              </w:rPr>
+            </w:pPr>
+            <w:r>
+              <w:rPr>
+                <w:rFonts w:ascii="Helvetica Neue" w:eastAsia="Times New Roman" w:hAnsi="Helvetica Neue" w:cs="Times New Roman"/>
+                <w:b/>
+                <w:bCs/>
+                <w:color w:val="000000"/>
+                <w:kern w:val="0"/>
+                <w:sz w:val="15"/>
+                <w:szCs w:val="15"/>
+                <w:lang w:eastAsia="es-MX"/>
+                <w14:ligatures w14:val="none"/>
+              </w:rPr>
+              <w:t>mean</w:t>
+            </w:r>
+          </w:p>
+        </w:tc>
+        <w:tc>
+          <w:tcPr>
+            <w:tcW w:w="540" w:type="dxa"/>
+            <w:tcBorders>
+              <w:top w:val="single" w:sz="6" w:space="0" w:color="000000"/>
+              <w:left w:val="single" w:sz="6" w:space="0" w:color="000000"/>
+              <w:bottom w:val="single" w:sz="6" w:space="0" w:color="000000"/>
+              <w:right w:val="single" w:sz="6" w:space="0" w:color="000000"/>
+            </w:tcBorders>
+            <w:tcMar>
+              <w:top w:w="60" w:type="dxa"/>
+              <w:left w:w="60" w:type="dxa"/>
+              <w:bottom w:w="60" w:type="dxa"/>
+              <w:right w:w="60" w:type="dxa"/>
+            </w:tcMar>
+            <w:hideMark/>
+          </w:tcPr>
+          <w:p>
+            <w:pPr>
+              <w:spacing w:after="0" w:line="240" w:lineRule="auto"/>
+              <w:rPr>
+                <w:rFonts w:ascii="Times New Roman" w:eastAsia="Times New Roman" w:hAnsi="Times New Roman" w:cs="Times New Roman"/>
+                <w:kern w:val="0"/>
+                <w:lang w:eastAsia="es-MX"/>
+                <w14:ligatures w14:val="none"/>
+              </w:rPr>
+            </w:pPr>
+            <w:r>
+              <w:rPr>
+                <w:rFonts w:ascii="Helvetica Neue" w:eastAsia="Times New Roman" w:hAnsi="Helvetica Neue" w:cs="Times New Roman"/>
+                <w:color w:val="000000"/>
+                <w:kern w:val="0"/>
+                <w:sz w:val="15"/>
+                <w:szCs w:val="15"/>
+                <w:lang w:eastAsia="es-MX"/>
+                <w14:ligatures w14:val="none"/>
+              </w:rPr>
+              <w:t>1055.21</w:t>
+            </w:r>
+          </w:p>
+        </w:tc>
+        <w:tc>
+          <w:tcPr>
+            <w:tcW w:w="930" w:type="dxa"/>
+            <w:tcBorders>
+              <w:top w:val="single" w:sz="6" w:space="0" w:color="000000"/>
+              <w:left w:val="single" w:sz="6" w:space="0" w:color="000000"/>
+              <w:bottom w:val="single" w:sz="6" w:space="0" w:color="000000"/>
+              <w:right w:val="single" w:sz="6" w:space="0" w:color="000000"/>
+            </w:tcBorders>
+            <w:tcMar>
+              <w:top w:w="60" w:type="dxa"/>
+              <w:left w:w="60" w:type="dxa"/>
+              <w:bottom w:w="60" w:type="dxa"/>
+              <w:right w:w="60" w:type="dxa"/>
+            </w:tcMar>
+            <w:hideMark/>
+          </w:tcPr>
+          <w:p>
+            <w:pPr>
+              <w:spacing w:after="0" w:line="240" w:lineRule="auto"/>
+              <w:rPr>
+                <w:rFonts w:ascii="Times New Roman" w:eastAsia="Times New Roman" w:hAnsi="Times New Roman" w:cs="Times New Roman"/>
+                <w:kern w:val="0"/>
+                <w:lang w:eastAsia="es-MX"/>
+                <w14:ligatures w14:val="none"/>
+              </w:rPr>
+            </w:pPr>
+            <w:r>
+              <w:rPr>
+                <w:rFonts w:ascii="Helvetica Neue" w:eastAsia="Times New Roman" w:hAnsi="Helvetica Neue" w:cs="Times New Roman"/>
+                <w:color w:val="000000"/>
+                <w:kern w:val="0"/>
+                <w:sz w:val="15"/>
+                <w:szCs w:val="15"/>
+                <w:lang w:eastAsia="es-MX"/>
+                <w14:ligatures w14:val="none"/>
+              </w:rPr>
+              <w:t>975.93</w:t>
+            </w:r>
+          </w:p>
+        </w:tc>
+        <w:tc>
+          <w:tcPr>
+            <w:tcW w:w="705" w:type="dxa"/>
+            <w:tcBorders>
+              <w:top w:val="single" w:sz="6" w:space="0" w:color="000000"/>
+              <w:left w:val="single" w:sz="6" w:space="0" w:color="000000"/>
+              <w:bottom w:val="single" w:sz="6" w:space="0" w:color="000000"/>
+              <w:right w:val="single" w:sz="6" w:space="0" w:color="000000"/>
+            </w:tcBorders>
+            <w:tcMar>
+              <w:top w:w="60" w:type="dxa"/>
+              <w:left w:w="60" w:type="dxa"/>
+              <w:bottom w:w="60" w:type="dxa"/>
+              <w:right w:w="60" w:type="dxa"/>
+            </w:tcMar>
+            <w:hideMark/>
+          </w:tcPr>
+          <w:p>
+            <w:pPr>
+              <w:spacing w:after="0" w:line="240" w:lineRule="auto"/>
+              <w:rPr>
+                <w:rFonts w:ascii="Times New Roman" w:eastAsia="Times New Roman" w:hAnsi="Times New Roman" w:cs="Times New Roman"/>
+                <w:kern w:val="0"/>
+                <w:lang w:eastAsia="es-MX"/>
+                <w14:ligatures w14:val="none"/>
+              </w:rPr>
+            </w:pPr>
+            <w:r>
+              <w:rPr>
+                <w:rFonts w:ascii="Helvetica Neue" w:eastAsia="Times New Roman" w:hAnsi="Helvetica Neue" w:cs="Times New Roman"/>
+                <w:color w:val="000000"/>
+                <w:kern w:val="0"/>
+                <w:sz w:val="15"/>
+                <w:szCs w:val="15"/>
+                <w:lang w:eastAsia="es-MX"/>
+                <w14:ligatures w14:val="none"/>
+              </w:rPr>
+              <w:t>608250.12</w:t>
+            </w:r>
+          </w:p>
+        </w:tc>
+        <w:tc>
+          <w:tcPr>
+            <w:tcW w:w="705" w:type="dxa"/>
+            <w:tcBorders>
+              <w:top w:val="single" w:sz="6" w:space="0" w:color="000000"/>
+              <w:left w:val="single" w:sz="6" w:space="0" w:color="000000"/>
+              <w:bottom w:val="single" w:sz="6" w:space="0" w:color="000000"/>
+              <w:right w:val="single" w:sz="6" w:space="0" w:color="000000"/>
+            </w:tcBorders>
+            <w:tcMar>
+              <w:top w:w="60" w:type="dxa"/>
+              <w:left w:w="60" w:type="dxa"/>
+              <w:bottom w:w="60" w:type="dxa"/>
+              <w:right w:w="60" w:type="dxa"/>
+            </w:tcMar>
+            <w:hideMark/>
+          </w:tcPr>
+          <w:p>
+            <w:pPr>
+              <w:spacing w:after="0" w:line="240" w:lineRule="auto"/>
+              <w:rPr>
+                <w:rFonts w:ascii="Times New Roman" w:eastAsia="Times New Roman" w:hAnsi="Times New Roman" w:cs="Times New Roman"/>
+                <w:kern w:val="0"/>
+                <w:lang w:eastAsia="es-MX"/>
+                <w14:ligatures w14:val="none"/>
+              </w:rPr>
+            </w:pPr>
+            <w:r>
+              <w:rPr>
+                <w:rFonts w:ascii="Helvetica Neue" w:eastAsia="Times New Roman" w:hAnsi="Helvetica Neue" w:cs="Times New Roman"/>
+                <w:color w:val="000000"/>
+                <w:kern w:val="0"/>
+                <w:sz w:val="15"/>
+                <w:szCs w:val="15"/>
+                <w:lang w:eastAsia="es-MX"/>
+                <w14:ligatures w14:val="none"/>
+              </w:rPr>
+              <w:t>200233.41</w:t>
+            </w:r>
+          </w:p>
+        </w:tc>
+        <w:tc>
+          <w:tcPr>
+            <w:tcW w:w="630" w:type="dxa"/>
+            <w:tcBorders>
+              <w:top w:val="single" w:sz="6" w:space="0" w:color="000000"/>
+              <w:left w:val="single" w:sz="6" w:space="0" w:color="000000"/>
+              <w:bottom w:val="single" w:sz="6" w:space="0" w:color="000000"/>
+              <w:right w:val="single" w:sz="6" w:space="0" w:color="000000"/>
+            </w:tcBorders>
+            <w:tcMar>
+              <w:top w:w="60" w:type="dxa"/>
+              <w:left w:w="60" w:type="dxa"/>
+              <w:bottom w:w="60" w:type="dxa"/>
+              <w:right w:w="60" w:type="dxa"/>
+            </w:tcMar>
+            <w:hideMark/>
+          </w:tcPr>
+          <w:p>
+            <w:pPr>
+              <w:spacing w:after="0" w:line="240" w:lineRule="auto"/>
+              <w:rPr>
+                <w:rFonts w:ascii="Times New Roman" w:eastAsia="Times New Roman" w:hAnsi="Times New Roman" w:cs="Times New Roman"/>
+                <w:kern w:val="0"/>
+                <w:lang w:eastAsia="es-MX"/>
+                <w14:ligatures w14:val="none"/>
+              </w:rPr>
+            </w:pPr>
+            <w:r>
+              <w:rPr>
+                <w:rFonts w:ascii="Helvetica Neue" w:eastAsia="Times New Roman" w:hAnsi="Helvetica Neue" w:cs="Times New Roman"/>
+                <w:color w:val="000000"/>
+                <w:kern w:val="0"/>
+                <w:sz w:val="15"/>
+                <w:szCs w:val="15"/>
+                <w:lang w:eastAsia="es-MX"/>
+                <w14:ligatures w14:val="none"/>
+              </w:rPr>
+              <w:t>18736.73</w:t>
+            </w:r>
+          </w:p>
+        </w:tc>
+      </w:tr>
+      <w:tr>
+        <w:trPr>
+          <w:trHeight w:val="165"/>
+        </w:trPr>
+        <w:tc>
+          <w:tcPr>
+            <w:tcW w:w="705" w:type="dxa"/>
+            <w:tcBorders>
+              <w:top w:val="single" w:sz="6" w:space="0" w:color="000000"/>
+              <w:left w:val="single" w:sz="6" w:space="0" w:color="000000"/>
+              <w:bottom w:val="single" w:sz="6" w:space="0" w:color="000000"/>
+              <w:right w:val="single" w:sz="6" w:space="0" w:color="000000"/>
+            </w:tcBorders>
+            <w:shd w:val="clear" w:color="auto" w:fill="D4D4D4"/>
+            <w:tcMar>
+              <w:top w:w="60" w:type="dxa"/>
+              <w:left w:w="60" w:type="dxa"/>
+              <w:bottom w:w="60" w:type="dxa"/>
+              <w:right w:w="60" w:type="dxa"/>
+            </w:tcMar>
+            <w:hideMark/>
+          </w:tcPr>
+          <w:p>
+            <w:pPr>
+              <w:spacing w:after="0" w:line="240" w:lineRule="auto"/>
+              <w:rPr>
+                <w:rFonts w:ascii="Times New Roman" w:eastAsia="Times New Roman" w:hAnsi="Times New Roman" w:cs="Times New Roman"/>
+                <w:kern w:val="0"/>
+                <w:lang w:eastAsia="es-MX"/>
+                <w14:ligatures w14:val="none"/>
+              </w:rPr>
+            </w:pPr>
+            <w:r>
+              <w:rPr>
+                <w:rFonts w:ascii="Helvetica Neue" w:eastAsia="Times New Roman" w:hAnsi="Helvetica Neue" w:cs="Times New Roman"/>
+                <w:b/>
+                <w:bCs/>
+                <w:color w:val="000000"/>
+                <w:kern w:val="0"/>
+                <w:sz w:val="15"/>
+                <w:szCs w:val="15"/>
+                <w:lang w:eastAsia="es-MX"/>
+                <w14:ligatures w14:val="none"/>
+              </w:rPr>
+              <w:t>median</w:t>
+            </w:r>
+          </w:p>
+        </w:tc>
+        <w:tc>
+          <w:tcPr>
+            <w:tcW w:w="540" w:type="dxa"/>
+            <w:tcBorders>
+              <w:top w:val="single" w:sz="6" w:space="0" w:color="000000"/>
+              <w:left w:val="single" w:sz="6" w:space="0" w:color="000000"/>
+              <w:bottom w:val="single" w:sz="6" w:space="0" w:color="000000"/>
+              <w:right w:val="single" w:sz="6" w:space="0" w:color="000000"/>
+            </w:tcBorders>
+            <w:tcMar>
+              <w:top w:w="60" w:type="dxa"/>
+              <w:left w:w="60" w:type="dxa"/>
+              <w:bottom w:w="60" w:type="dxa"/>
+              <w:right w:w="60" w:type="dxa"/>
+            </w:tcMar>
+            <w:hideMark/>
+          </w:tcPr>
+          <w:p>
+            <w:pPr>
+              <w:spacing w:after="0" w:line="240" w:lineRule="auto"/>
+              <w:rPr>
+                <w:rFonts w:ascii="Times New Roman" w:eastAsia="Times New Roman" w:hAnsi="Times New Roman" w:cs="Times New Roman"/>
+                <w:kern w:val="0"/>
+                <w:lang w:eastAsia="es-MX"/>
+                <w14:ligatures w14:val="none"/>
+              </w:rPr>
+            </w:pPr>
+            <w:r>
+              <w:rPr>
+                <w:rFonts w:ascii="Helvetica Neue" w:eastAsia="Times New Roman" w:hAnsi="Helvetica Neue" w:cs="Times New Roman"/>
+                <w:color w:val="000000"/>
+                <w:kern w:val="0"/>
+                <w:sz w:val="15"/>
+                <w:szCs w:val="15"/>
+                <w:lang w:eastAsia="es-MX"/>
+                <w14:ligatures w14:val="none"/>
+              </w:rPr>
+              <w:t>899</w:t>
+            </w:r>
+          </w:p>
+        </w:tc>
+        <w:tc>
+          <w:tcPr>
+            <w:tcW w:w="930" w:type="dxa"/>
+            <w:tcBorders>
+              <w:top w:val="single" w:sz="6" w:space="0" w:color="000000"/>
+              <w:left w:val="single" w:sz="6" w:space="0" w:color="000000"/>
+              <w:bottom w:val="single" w:sz="6" w:space="0" w:color="000000"/>
+              <w:right w:val="single" w:sz="6" w:space="0" w:color="000000"/>
+            </w:tcBorders>
+            <w:tcMar>
+              <w:top w:w="60" w:type="dxa"/>
+              <w:left w:w="60" w:type="dxa"/>
+              <w:bottom w:w="60" w:type="dxa"/>
+              <w:right w:w="60" w:type="dxa"/>
+            </w:tcMar>
+            <w:hideMark/>
+          </w:tcPr>
+          <w:p>
+            <w:pPr>
+              <w:spacing w:after="0" w:line="240" w:lineRule="auto"/>
+              <w:rPr>
+                <w:rFonts w:ascii="Times New Roman" w:eastAsia="Times New Roman" w:hAnsi="Times New Roman" w:cs="Times New Roman"/>
+                <w:kern w:val="0"/>
+                <w:lang w:eastAsia="es-MX"/>
+                <w14:ligatures w14:val="none"/>
+              </w:rPr>
+            </w:pPr>
+            <w:r>
+              <w:rPr>
+                <w:rFonts w:ascii="Helvetica Neue" w:eastAsia="Times New Roman" w:hAnsi="Helvetica Neue" w:cs="Times New Roman"/>
+                <w:color w:val="000000"/>
+                <w:kern w:val="0"/>
+                <w:sz w:val="15"/>
+                <w:szCs w:val="15"/>
+                <w:lang w:eastAsia="es-MX"/>
+                <w14:ligatures w14:val="none"/>
+              </w:rPr>
+              <w:t>845.5</w:t>
+            </w:r>
+          </w:p>
+        </w:tc>
+        <w:tc>
+          <w:tcPr>
+            <w:tcW w:w="705" w:type="dxa"/>
+            <w:tcBorders>
+              <w:top w:val="single" w:sz="6" w:space="0" w:color="000000"/>
+              <w:left w:val="single" w:sz="6" w:space="0" w:color="000000"/>
+              <w:bottom w:val="single" w:sz="6" w:space="0" w:color="000000"/>
+              <w:right w:val="single" w:sz="6" w:space="0" w:color="000000"/>
+            </w:tcBorders>
+            <w:tcMar>
+              <w:top w:w="60" w:type="dxa"/>
+              <w:left w:w="60" w:type="dxa"/>
+              <w:bottom w:w="60" w:type="dxa"/>
+              <w:right w:w="60" w:type="dxa"/>
+            </w:tcMar>
+            <w:hideMark/>
+          </w:tcPr>
+          <w:p>
+            <w:pPr>
+              <w:spacing w:after="0" w:line="240" w:lineRule="auto"/>
+              <w:rPr>
+                <w:rFonts w:ascii="Times New Roman" w:eastAsia="Times New Roman" w:hAnsi="Times New Roman" w:cs="Times New Roman"/>
+                <w:kern w:val="0"/>
+                <w:lang w:eastAsia="es-MX"/>
+                <w14:ligatures w14:val="none"/>
+              </w:rPr>
+            </w:pPr>
+            <w:r>
+              <w:rPr>
+                <w:rFonts w:ascii="Helvetica Neue" w:eastAsia="Times New Roman" w:hAnsi="Helvetica Neue" w:cs="Times New Roman"/>
+                <w:color w:val="000000"/>
+                <w:kern w:val="0"/>
+                <w:sz w:val="15"/>
+                <w:szCs w:val="15"/>
+                <w:lang w:eastAsia="es-MX"/>
+                <w14:ligatures w14:val="none"/>
+              </w:rPr>
+              <w:t>586169.66</w:t>
+            </w:r>
+          </w:p>
+        </w:tc>
+        <w:tc>
+          <w:tcPr>
+            <w:tcW w:w="705" w:type="dxa"/>
+            <w:tcBorders>
+              <w:top w:val="single" w:sz="6" w:space="0" w:color="000000"/>
+              <w:left w:val="single" w:sz="6" w:space="0" w:color="000000"/>
+              <w:bottom w:val="single" w:sz="6" w:space="0" w:color="000000"/>
+              <w:right w:val="single" w:sz="6" w:space="0" w:color="000000"/>
+            </w:tcBorders>
+            <w:tcMar>
+              <w:top w:w="60" w:type="dxa"/>
+              <w:left w:w="60" w:type="dxa"/>
+              <w:bottom w:w="60" w:type="dxa"/>
+              <w:right w:w="60" w:type="dxa"/>
+            </w:tcMar>
+            <w:hideMark/>
+          </w:tcPr>
+          <w:p>
+            <w:pPr>
+              <w:spacing w:after="0" w:line="240" w:lineRule="auto"/>
+              <w:rPr>
+                <w:rFonts w:ascii="Times New Roman" w:eastAsia="Times New Roman" w:hAnsi="Times New Roman" w:cs="Times New Roman"/>
+                <w:kern w:val="0"/>
+                <w:lang w:eastAsia="es-MX"/>
+                <w14:ligatures w14:val="none"/>
+              </w:rPr>
+            </w:pPr>
+            <w:r>
+              <w:rPr>
+                <w:rFonts w:ascii="Helvetica Neue" w:eastAsia="Times New Roman" w:hAnsi="Helvetica Neue" w:cs="Times New Roman"/>
+                <w:color w:val="000000"/>
+                <w:kern w:val="0"/>
+                <w:sz w:val="15"/>
+                <w:szCs w:val="15"/>
+                <w:lang w:eastAsia="es-MX"/>
+                <w14:ligatures w14:val="none"/>
+              </w:rPr>
+              <w:t>208913</w:t>
+            </w:r>
+          </w:p>
+        </w:tc>
+        <w:tc>
+          <w:tcPr>
+            <w:tcW w:w="630" w:type="dxa"/>
+            <w:tcBorders>
+              <w:top w:val="single" w:sz="6" w:space="0" w:color="000000"/>
+              <w:left w:val="single" w:sz="6" w:space="0" w:color="000000"/>
+              <w:bottom w:val="single" w:sz="6" w:space="0" w:color="000000"/>
+              <w:right w:val="single" w:sz="6" w:space="0" w:color="000000"/>
+            </w:tcBorders>
+            <w:tcMar>
+              <w:top w:w="60" w:type="dxa"/>
+              <w:left w:w="60" w:type="dxa"/>
+              <w:bottom w:w="60" w:type="dxa"/>
+              <w:right w:w="60" w:type="dxa"/>
+            </w:tcMar>
+            <w:hideMark/>
+          </w:tcPr>
+          <w:p>
+            <w:pPr>
+              <w:spacing w:after="0" w:line="240" w:lineRule="auto"/>
+              <w:rPr>
+                <w:rFonts w:ascii="Times New Roman" w:eastAsia="Times New Roman" w:hAnsi="Times New Roman" w:cs="Times New Roman"/>
+                <w:kern w:val="0"/>
+                <w:lang w:eastAsia="es-MX"/>
+                <w14:ligatures w14:val="none"/>
+              </w:rPr>
+            </w:pPr>
+            <w:r>
+              <w:rPr>
+                <w:rFonts w:ascii="Helvetica Neue" w:eastAsia="Times New Roman" w:hAnsi="Helvetica Neue" w:cs="Times New Roman"/>
+                <w:color w:val="000000"/>
+                <w:kern w:val="0"/>
+                <w:sz w:val="15"/>
+                <w:szCs w:val="15"/>
+                <w:lang w:eastAsia="es-MX"/>
+                <w14:ligatures w14:val="none"/>
+              </w:rPr>
+              <w:t>17269.7</w:t>
+            </w:r>
+          </w:p>
+        </w:tc>
+      </w:tr>
+      <w:tr>
+        <w:trPr>
+          <w:trHeight w:val="165"/>
+        </w:trPr>
+        <w:tc>
+          <w:tcPr>
+            <w:tcW w:w="705" w:type="dxa"/>
+            <w:tcBorders>
+              <w:top w:val="single" w:sz="6" w:space="0" w:color="000000"/>
+              <w:left w:val="single" w:sz="6" w:space="0" w:color="000000"/>
+              <w:bottom w:val="single" w:sz="6" w:space="0" w:color="000000"/>
+              <w:right w:val="single" w:sz="6" w:space="0" w:color="000000"/>
+            </w:tcBorders>
+            <w:shd w:val="clear" w:color="auto" w:fill="D4D4D4"/>
+            <w:tcMar>
+              <w:top w:w="60" w:type="dxa"/>
+              <w:left w:w="60" w:type="dxa"/>
+              <w:bottom w:w="60" w:type="dxa"/>
+              <w:right w:w="60" w:type="dxa"/>
+            </w:tcMar>
+            <w:hideMark/>
+          </w:tcPr>
+          <w:p>
+            <w:pPr>
+              <w:spacing w:after="0" w:line="240" w:lineRule="auto"/>
+              <w:rPr>
+                <w:rFonts w:ascii="Times New Roman" w:eastAsia="Times New Roman" w:hAnsi="Times New Roman" w:cs="Times New Roman"/>
+                <w:kern w:val="0"/>
+                <w:lang w:eastAsia="es-MX"/>
+                <w14:ligatures w14:val="none"/>
+              </w:rPr>
+            </w:pPr>
+            <w:proofErr w:type="spellStart"/>
+            <w:r>
+              <w:rPr>
+                <w:rFonts w:ascii="Helvetica Neue" w:eastAsia="Times New Roman" w:hAnsi="Helvetica Neue" w:cs="Times New Roman"/>
+                <w:b/>
+                <w:bCs/>
+                <w:color w:val="000000"/>
+                <w:kern w:val="0"/>
+                <w:sz w:val="15"/>
+                <w:szCs w:val="15"/>
+                <w:lang w:eastAsia="es-MX"/>
+                <w14:ligatures w14:val="none"/>
+              </w:rPr>
+              <w:t>std</w:t>
+            </w:r>
+            <w:proofErr w:type="spellEnd"/>
+            <w:r>
+              <w:rPr>
+                <w:rFonts w:ascii="Helvetica Neue" w:eastAsia="Times New Roman" w:hAnsi="Helvetica Neue" w:cs="Times New Roman"/>
+                <w:b/>
+                <w:bCs/>
+                <w:color w:val="000000"/>
+                <w:kern w:val="0"/>
+                <w:sz w:val="15"/>
+                <w:szCs w:val="15"/>
+                <w:lang w:eastAsia="es-MX"/>
+                <w14:ligatures w14:val="none"/>
+              </w:rPr>
+              <w:t xml:space="preserve">. </w:t>
+            </w:r>
+            <w:proofErr w:type="spellStart"/>
+            <w:r>
+              <w:rPr>
+                <w:rFonts w:ascii="Helvetica Neue" w:eastAsia="Times New Roman" w:hAnsi="Helvetica Neue" w:cs="Times New Roman"/>
+                <w:b/>
+                <w:bCs/>
+                <w:color w:val="000000"/>
+                <w:kern w:val="0"/>
+                <w:sz w:val="15"/>
+                <w:szCs w:val="15"/>
+                <w:lang w:eastAsia="es-MX"/>
+                <w14:ligatures w14:val="none"/>
+              </w:rPr>
+              <w:t>dev</w:t>
+            </w:r>
+            <w:proofErr w:type="spellEnd"/>
+            <w:r>
+              <w:rPr>
+                <w:rFonts w:ascii="Helvetica Neue" w:eastAsia="Times New Roman" w:hAnsi="Helvetica Neue" w:cs="Times New Roman"/>
+                <w:b/>
+                <w:bCs/>
+                <w:color w:val="000000"/>
+                <w:kern w:val="0"/>
+                <w:sz w:val="15"/>
+                <w:szCs w:val="15"/>
+                <w:lang w:eastAsia="es-MX"/>
+                <w14:ligatures w14:val="none"/>
+              </w:rPr>
+              <w:t>.</w:t>
+            </w:r>
+          </w:p>
+        </w:tc>
+        <w:tc>
+          <w:tcPr>
+            <w:tcW w:w="540" w:type="dxa"/>
+            <w:tcBorders>
+              <w:top w:val="single" w:sz="6" w:space="0" w:color="000000"/>
+              <w:left w:val="single" w:sz="6" w:space="0" w:color="000000"/>
+              <w:bottom w:val="single" w:sz="6" w:space="0" w:color="000000"/>
+              <w:right w:val="single" w:sz="6" w:space="0" w:color="000000"/>
+            </w:tcBorders>
+            <w:tcMar>
+              <w:top w:w="60" w:type="dxa"/>
+              <w:left w:w="60" w:type="dxa"/>
+              <w:bottom w:w="60" w:type="dxa"/>
+              <w:right w:w="60" w:type="dxa"/>
+            </w:tcMar>
+            <w:hideMark/>
+          </w:tcPr>
+          <w:p>
+            <w:pPr>
+              <w:spacing w:after="0" w:line="240" w:lineRule="auto"/>
+              <w:rPr>
+                <w:rFonts w:ascii="Times New Roman" w:eastAsia="Times New Roman" w:hAnsi="Times New Roman" w:cs="Times New Roman"/>
+                <w:kern w:val="0"/>
+                <w:lang w:eastAsia="es-MX"/>
+                <w14:ligatures w14:val="none"/>
+              </w:rPr>
+            </w:pPr>
+            <w:r>
+              <w:rPr>
+                <w:rFonts w:ascii="Helvetica Neue" w:eastAsia="Times New Roman" w:hAnsi="Helvetica Neue" w:cs="Times New Roman"/>
+                <w:color w:val="000000"/>
+                <w:kern w:val="0"/>
+                <w:sz w:val="15"/>
+                <w:szCs w:val="15"/>
+                <w:lang w:eastAsia="es-MX"/>
+                <w14:ligatures w14:val="none"/>
+              </w:rPr>
+              <w:t>355.03</w:t>
+            </w:r>
+          </w:p>
+        </w:tc>
+        <w:tc>
+          <w:tcPr>
+            <w:tcW w:w="930" w:type="dxa"/>
+            <w:tcBorders>
+              <w:top w:val="single" w:sz="6" w:space="0" w:color="000000"/>
+              <w:left w:val="single" w:sz="6" w:space="0" w:color="000000"/>
+              <w:bottom w:val="single" w:sz="6" w:space="0" w:color="000000"/>
+              <w:right w:val="single" w:sz="6" w:space="0" w:color="000000"/>
+            </w:tcBorders>
+            <w:tcMar>
+              <w:top w:w="60" w:type="dxa"/>
+              <w:left w:w="60" w:type="dxa"/>
+              <w:bottom w:w="60" w:type="dxa"/>
+              <w:right w:w="60" w:type="dxa"/>
+            </w:tcMar>
+            <w:hideMark/>
+          </w:tcPr>
+          <w:p>
+            <w:pPr>
+              <w:spacing w:after="0" w:line="240" w:lineRule="auto"/>
+              <w:rPr>
+                <w:rFonts w:ascii="Times New Roman" w:eastAsia="Times New Roman" w:hAnsi="Times New Roman" w:cs="Times New Roman"/>
+                <w:kern w:val="0"/>
+                <w:lang w:eastAsia="es-MX"/>
+                <w14:ligatures w14:val="none"/>
+              </w:rPr>
+            </w:pPr>
+            <w:r>
+              <w:rPr>
+                <w:rFonts w:ascii="Helvetica Neue" w:eastAsia="Times New Roman" w:hAnsi="Helvetica Neue" w:cs="Times New Roman"/>
+                <w:color w:val="000000"/>
+                <w:kern w:val="0"/>
+                <w:sz w:val="15"/>
+                <w:szCs w:val="15"/>
+                <w:lang w:eastAsia="es-MX"/>
+                <w14:ligatures w14:val="none"/>
+              </w:rPr>
+              <w:t>319.6</w:t>
+            </w:r>
+          </w:p>
+        </w:tc>
+        <w:tc>
+          <w:tcPr>
+            <w:tcW w:w="705" w:type="dxa"/>
+            <w:tcBorders>
+              <w:top w:val="single" w:sz="6" w:space="0" w:color="000000"/>
+              <w:left w:val="single" w:sz="6" w:space="0" w:color="000000"/>
+              <w:bottom w:val="single" w:sz="6" w:space="0" w:color="000000"/>
+              <w:right w:val="single" w:sz="6" w:space="0" w:color="000000"/>
+            </w:tcBorders>
+            <w:tcMar>
+              <w:top w:w="60" w:type="dxa"/>
+              <w:left w:w="60" w:type="dxa"/>
+              <w:bottom w:w="60" w:type="dxa"/>
+              <w:right w:w="60" w:type="dxa"/>
+            </w:tcMar>
+            <w:hideMark/>
+          </w:tcPr>
+          <w:p>
+            <w:pPr>
+              <w:spacing w:after="0" w:line="240" w:lineRule="auto"/>
+              <w:rPr>
+                <w:rFonts w:ascii="Times New Roman" w:eastAsia="Times New Roman" w:hAnsi="Times New Roman" w:cs="Times New Roman"/>
+                <w:kern w:val="0"/>
+                <w:lang w:eastAsia="es-MX"/>
+                <w14:ligatures w14:val="none"/>
+              </w:rPr>
+            </w:pPr>
+            <w:r>
+              <w:rPr>
+                <w:rFonts w:ascii="Helvetica Neue" w:eastAsia="Times New Roman" w:hAnsi="Helvetica Neue" w:cs="Times New Roman"/>
+                <w:color w:val="000000"/>
+                <w:kern w:val="0"/>
+                <w:sz w:val="15"/>
+                <w:szCs w:val="15"/>
+                <w:lang w:eastAsia="es-MX"/>
+                <w14:ligatures w14:val="none"/>
+              </w:rPr>
+              <w:t>155930.4</w:t>
+            </w:r>
+          </w:p>
+        </w:tc>
+        <w:tc>
+          <w:tcPr>
+            <w:tcW w:w="705" w:type="dxa"/>
+            <w:tcBorders>
+              <w:top w:val="single" w:sz="6" w:space="0" w:color="000000"/>
+              <w:left w:val="single" w:sz="6" w:space="0" w:color="000000"/>
+              <w:bottom w:val="single" w:sz="6" w:space="0" w:color="000000"/>
+              <w:right w:val="single" w:sz="6" w:space="0" w:color="000000"/>
+            </w:tcBorders>
+            <w:tcMar>
+              <w:top w:w="60" w:type="dxa"/>
+              <w:left w:w="60" w:type="dxa"/>
+              <w:bottom w:w="60" w:type="dxa"/>
+              <w:right w:w="60" w:type="dxa"/>
+            </w:tcMar>
+            <w:hideMark/>
+          </w:tcPr>
+          <w:p>
+            <w:pPr>
+              <w:spacing w:after="0" w:line="240" w:lineRule="auto"/>
+              <w:rPr>
+                <w:rFonts w:ascii="Times New Roman" w:eastAsia="Times New Roman" w:hAnsi="Times New Roman" w:cs="Times New Roman"/>
+                <w:kern w:val="0"/>
+                <w:lang w:eastAsia="es-MX"/>
+                <w14:ligatures w14:val="none"/>
+              </w:rPr>
+            </w:pPr>
+            <w:r>
+              <w:rPr>
+                <w:rFonts w:ascii="Helvetica Neue" w:eastAsia="Times New Roman" w:hAnsi="Helvetica Neue" w:cs="Times New Roman"/>
+                <w:color w:val="000000"/>
+                <w:kern w:val="0"/>
+                <w:sz w:val="15"/>
+                <w:szCs w:val="15"/>
+                <w:lang w:eastAsia="es-MX"/>
+                <w14:ligatures w14:val="none"/>
+              </w:rPr>
+              <w:t>60691.55</w:t>
+            </w:r>
+          </w:p>
+        </w:tc>
+        <w:tc>
+          <w:tcPr>
+            <w:tcW w:w="630" w:type="dxa"/>
+            <w:tcBorders>
+              <w:top w:val="single" w:sz="6" w:space="0" w:color="000000"/>
+              <w:left w:val="single" w:sz="6" w:space="0" w:color="000000"/>
+              <w:bottom w:val="single" w:sz="6" w:space="0" w:color="000000"/>
+              <w:right w:val="single" w:sz="6" w:space="0" w:color="000000"/>
+            </w:tcBorders>
+            <w:tcMar>
+              <w:top w:w="60" w:type="dxa"/>
+              <w:left w:w="60" w:type="dxa"/>
+              <w:bottom w:w="60" w:type="dxa"/>
+              <w:right w:w="60" w:type="dxa"/>
+            </w:tcMar>
+            <w:hideMark/>
+          </w:tcPr>
+          <w:p>
+            <w:pPr>
+              <w:spacing w:after="0" w:line="240" w:lineRule="auto"/>
+              <w:rPr>
+                <w:rFonts w:ascii="Times New Roman" w:eastAsia="Times New Roman" w:hAnsi="Times New Roman" w:cs="Times New Roman"/>
+                <w:kern w:val="0"/>
+                <w:lang w:eastAsia="es-MX"/>
+                <w14:ligatures w14:val="none"/>
+              </w:rPr>
+            </w:pPr>
+            <w:r>
+              <w:rPr>
+                <w:rFonts w:ascii="Helvetica Neue" w:eastAsia="Times New Roman" w:hAnsi="Helvetica Neue" w:cs="Times New Roman"/>
+                <w:color w:val="000000"/>
+                <w:kern w:val="0"/>
+                <w:sz w:val="15"/>
+                <w:szCs w:val="15"/>
+                <w:lang w:eastAsia="es-MX"/>
+                <w14:ligatures w14:val="none"/>
+              </w:rPr>
+              <w:t>5427.39</w:t>
+            </w:r>
+          </w:p>
+        </w:tc>
+      </w:tr>
+      <w:tr>
+        <w:trPr>
+          <w:trHeight w:val="165"/>
+        </w:trPr>
+        <w:tc>
+          <w:tcPr>
+            <w:tcW w:w="705" w:type="dxa"/>
+            <w:tcBorders>
+              <w:top w:val="single" w:sz="6" w:space="0" w:color="000000"/>
+              <w:left w:val="single" w:sz="6" w:space="0" w:color="000000"/>
+              <w:bottom w:val="single" w:sz="6" w:space="0" w:color="000000"/>
+              <w:right w:val="single" w:sz="6" w:space="0" w:color="000000"/>
+            </w:tcBorders>
+            <w:shd w:val="clear" w:color="auto" w:fill="D4D4D4"/>
+            <w:tcMar>
+              <w:top w:w="60" w:type="dxa"/>
+              <w:left w:w="60" w:type="dxa"/>
+              <w:bottom w:w="60" w:type="dxa"/>
+              <w:right w:w="60" w:type="dxa"/>
+            </w:tcMar>
+            <w:hideMark/>
+          </w:tcPr>
+          <w:p>
+            <w:pPr>
+              <w:spacing w:after="0" w:line="240" w:lineRule="auto"/>
+              <w:rPr>
+                <w:rFonts w:ascii="Times New Roman" w:eastAsia="Times New Roman" w:hAnsi="Times New Roman" w:cs="Times New Roman"/>
+                <w:kern w:val="0"/>
+                <w:lang w:eastAsia="es-MX"/>
+                <w14:ligatures w14:val="none"/>
+              </w:rPr>
+            </w:pPr>
+            <w:proofErr w:type="spellStart"/>
+            <w:r>
+              <w:rPr>
+                <w:rFonts w:ascii="Helvetica Neue" w:eastAsia="Times New Roman" w:hAnsi="Helvetica Neue" w:cs="Times New Roman"/>
+                <w:b/>
+                <w:bCs/>
+                <w:color w:val="000000"/>
+                <w:kern w:val="0"/>
+                <w:sz w:val="15"/>
+                <w:szCs w:val="15"/>
+                <w:lang w:eastAsia="es-MX"/>
+                <w14:ligatures w14:val="none"/>
+              </w:rPr>
+              <w:t>minimum</w:t>
+            </w:r>
+            <w:proofErr w:type="spellEnd"/>
+          </w:p>
+        </w:tc>
+        <w:tc>
+          <w:tcPr>
+            <w:tcW w:w="540" w:type="dxa"/>
+            <w:tcBorders>
+              <w:top w:val="single" w:sz="6" w:space="0" w:color="000000"/>
+              <w:left w:val="single" w:sz="6" w:space="0" w:color="000000"/>
+              <w:bottom w:val="single" w:sz="6" w:space="0" w:color="000000"/>
+              <w:right w:val="single" w:sz="6" w:space="0" w:color="000000"/>
+            </w:tcBorders>
+            <w:tcMar>
+              <w:top w:w="60" w:type="dxa"/>
+              <w:left w:w="60" w:type="dxa"/>
+              <w:bottom w:w="60" w:type="dxa"/>
+              <w:right w:w="60" w:type="dxa"/>
+            </w:tcMar>
+            <w:hideMark/>
+          </w:tcPr>
+          <w:p>
+            <w:pPr>
+              <w:spacing w:after="0" w:line="240" w:lineRule="auto"/>
+              <w:rPr>
+                <w:rFonts w:ascii="Times New Roman" w:eastAsia="Times New Roman" w:hAnsi="Times New Roman" w:cs="Times New Roman"/>
+                <w:kern w:val="0"/>
+                <w:lang w:eastAsia="es-MX"/>
+                <w14:ligatures w14:val="none"/>
+              </w:rPr>
+            </w:pPr>
+            <w:r>
+              <w:rPr>
+                <w:rFonts w:ascii="Helvetica Neue" w:eastAsia="Times New Roman" w:hAnsi="Helvetica Neue" w:cs="Times New Roman"/>
+                <w:color w:val="000000"/>
+                <w:kern w:val="0"/>
+                <w:sz w:val="15"/>
+                <w:szCs w:val="15"/>
+                <w:lang w:eastAsia="es-MX"/>
+                <w14:ligatures w14:val="none"/>
+              </w:rPr>
+              <w:t>626</w:t>
+            </w:r>
+          </w:p>
+        </w:tc>
+        <w:tc>
+          <w:tcPr>
+            <w:tcW w:w="930" w:type="dxa"/>
+            <w:tcBorders>
+              <w:top w:val="single" w:sz="6" w:space="0" w:color="000000"/>
+              <w:left w:val="single" w:sz="6" w:space="0" w:color="000000"/>
+              <w:bottom w:val="single" w:sz="6" w:space="0" w:color="000000"/>
+              <w:right w:val="single" w:sz="6" w:space="0" w:color="000000"/>
+            </w:tcBorders>
+            <w:tcMar>
+              <w:top w:w="60" w:type="dxa"/>
+              <w:left w:w="60" w:type="dxa"/>
+              <w:bottom w:w="60" w:type="dxa"/>
+              <w:right w:w="60" w:type="dxa"/>
+            </w:tcMar>
+            <w:hideMark/>
+          </w:tcPr>
+          <w:p>
+            <w:pPr>
+              <w:spacing w:after="0" w:line="240" w:lineRule="auto"/>
+              <w:rPr>
+                <w:rFonts w:ascii="Times New Roman" w:eastAsia="Times New Roman" w:hAnsi="Times New Roman" w:cs="Times New Roman"/>
+                <w:kern w:val="0"/>
+                <w:lang w:eastAsia="es-MX"/>
+                <w14:ligatures w14:val="none"/>
+              </w:rPr>
+            </w:pPr>
+            <w:r>
+              <w:rPr>
+                <w:rFonts w:ascii="Helvetica Neue" w:eastAsia="Times New Roman" w:hAnsi="Helvetica Neue" w:cs="Times New Roman"/>
+                <w:color w:val="000000"/>
+                <w:kern w:val="0"/>
+                <w:sz w:val="15"/>
+                <w:szCs w:val="15"/>
+                <w:lang w:eastAsia="es-MX"/>
+                <w14:ligatures w14:val="none"/>
+              </w:rPr>
+              <w:t>594</w:t>
+            </w:r>
+          </w:p>
+        </w:tc>
+        <w:tc>
+          <w:tcPr>
+            <w:tcW w:w="705" w:type="dxa"/>
+            <w:tcBorders>
+              <w:top w:val="single" w:sz="6" w:space="0" w:color="000000"/>
+              <w:left w:val="single" w:sz="6" w:space="0" w:color="000000"/>
+              <w:bottom w:val="single" w:sz="6" w:space="0" w:color="000000"/>
+              <w:right w:val="single" w:sz="6" w:space="0" w:color="000000"/>
+            </w:tcBorders>
+            <w:tcMar>
+              <w:top w:w="60" w:type="dxa"/>
+              <w:left w:w="60" w:type="dxa"/>
+              <w:bottom w:w="60" w:type="dxa"/>
+              <w:right w:w="60" w:type="dxa"/>
+            </w:tcMar>
+            <w:hideMark/>
+          </w:tcPr>
+          <w:p>
+            <w:pPr>
+              <w:spacing w:after="0" w:line="240" w:lineRule="auto"/>
+              <w:rPr>
+                <w:rFonts w:ascii="Times New Roman" w:eastAsia="Times New Roman" w:hAnsi="Times New Roman" w:cs="Times New Roman"/>
+                <w:kern w:val="0"/>
+                <w:lang w:eastAsia="es-MX"/>
+                <w14:ligatures w14:val="none"/>
+              </w:rPr>
+            </w:pPr>
+            <w:r>
+              <w:rPr>
+                <w:rFonts w:ascii="Helvetica Neue" w:eastAsia="Times New Roman" w:hAnsi="Helvetica Neue" w:cs="Times New Roman"/>
+                <w:color w:val="000000"/>
+                <w:kern w:val="0"/>
+                <w:sz w:val="15"/>
+                <w:szCs w:val="15"/>
+                <w:lang w:eastAsia="es-MX"/>
+                <w14:ligatures w14:val="none"/>
+              </w:rPr>
+              <w:t>274567.61</w:t>
+            </w:r>
+          </w:p>
+        </w:tc>
+        <w:tc>
+          <w:tcPr>
+            <w:tcW w:w="705" w:type="dxa"/>
+            <w:tcBorders>
+              <w:top w:val="single" w:sz="6" w:space="0" w:color="000000"/>
+              <w:left w:val="single" w:sz="6" w:space="0" w:color="000000"/>
+              <w:bottom w:val="single" w:sz="6" w:space="0" w:color="000000"/>
+              <w:right w:val="single" w:sz="6" w:space="0" w:color="000000"/>
+            </w:tcBorders>
+            <w:tcMar>
+              <w:top w:w="60" w:type="dxa"/>
+              <w:left w:w="60" w:type="dxa"/>
+              <w:bottom w:w="60" w:type="dxa"/>
+              <w:right w:w="60" w:type="dxa"/>
+            </w:tcMar>
+            <w:hideMark/>
+          </w:tcPr>
+          <w:p>
+            <w:pPr>
+              <w:spacing w:after="0" w:line="240" w:lineRule="auto"/>
+              <w:rPr>
+                <w:rFonts w:ascii="Times New Roman" w:eastAsia="Times New Roman" w:hAnsi="Times New Roman" w:cs="Times New Roman"/>
+                <w:kern w:val="0"/>
+                <w:lang w:eastAsia="es-MX"/>
+                <w14:ligatures w14:val="none"/>
+              </w:rPr>
+            </w:pPr>
+            <w:r>
+              <w:rPr>
+                <w:rFonts w:ascii="Helvetica Neue" w:eastAsia="Times New Roman" w:hAnsi="Helvetica Neue" w:cs="Times New Roman"/>
+                <w:color w:val="000000"/>
+                <w:kern w:val="0"/>
+                <w:sz w:val="15"/>
+                <w:szCs w:val="15"/>
+                <w:lang w:eastAsia="es-MX"/>
+                <w14:ligatures w14:val="none"/>
+              </w:rPr>
+              <w:t>62580.4</w:t>
+            </w:r>
+          </w:p>
+        </w:tc>
+        <w:tc>
+          <w:tcPr>
+            <w:tcW w:w="630" w:type="dxa"/>
+            <w:tcBorders>
+              <w:top w:val="single" w:sz="6" w:space="0" w:color="000000"/>
+              <w:left w:val="single" w:sz="6" w:space="0" w:color="000000"/>
+              <w:bottom w:val="single" w:sz="6" w:space="0" w:color="000000"/>
+              <w:right w:val="single" w:sz="6" w:space="0" w:color="000000"/>
+            </w:tcBorders>
+            <w:tcMar>
+              <w:top w:w="60" w:type="dxa"/>
+              <w:left w:w="60" w:type="dxa"/>
+              <w:bottom w:w="60" w:type="dxa"/>
+              <w:right w:w="60" w:type="dxa"/>
+            </w:tcMar>
+            <w:hideMark/>
+          </w:tcPr>
+          <w:p>
+            <w:pPr>
+              <w:spacing w:after="0" w:line="240" w:lineRule="auto"/>
+              <w:rPr>
+                <w:rFonts w:ascii="Times New Roman" w:eastAsia="Times New Roman" w:hAnsi="Times New Roman" w:cs="Times New Roman"/>
+                <w:kern w:val="0"/>
+                <w:lang w:eastAsia="es-MX"/>
+                <w14:ligatures w14:val="none"/>
+              </w:rPr>
+            </w:pPr>
+            <w:r>
+              <w:rPr>
+                <w:rFonts w:ascii="Helvetica Neue" w:eastAsia="Times New Roman" w:hAnsi="Helvetica Neue" w:cs="Times New Roman"/>
+                <w:color w:val="000000"/>
+                <w:kern w:val="0"/>
+                <w:sz w:val="15"/>
+                <w:szCs w:val="15"/>
+                <w:lang w:eastAsia="es-MX"/>
+                <w14:ligatures w14:val="none"/>
+              </w:rPr>
+              <w:t>8633.06</w:t>
+            </w:r>
+          </w:p>
+        </w:tc>
+      </w:tr>
+      <w:tr>
+        <w:trPr>
+          <w:trHeight w:val="165"/>
+        </w:trPr>
+        <w:tc>
+          <w:tcPr>
+            <w:tcW w:w="705" w:type="dxa"/>
+            <w:tcBorders>
+              <w:top w:val="single" w:sz="6" w:space="0" w:color="000000"/>
+              <w:left w:val="single" w:sz="6" w:space="0" w:color="000000"/>
+              <w:bottom w:val="single" w:sz="6" w:space="0" w:color="000000"/>
+              <w:right w:val="single" w:sz="6" w:space="0" w:color="000000"/>
+            </w:tcBorders>
+            <w:shd w:val="clear" w:color="auto" w:fill="D4D4D4"/>
+            <w:tcMar>
+              <w:top w:w="60" w:type="dxa"/>
+              <w:left w:w="60" w:type="dxa"/>
+              <w:bottom w:w="60" w:type="dxa"/>
+              <w:right w:w="60" w:type="dxa"/>
+            </w:tcMar>
+            <w:hideMark/>
+          </w:tcPr>
+          <w:p>
+            <w:pPr>
+              <w:spacing w:after="0" w:line="240" w:lineRule="auto"/>
+              <w:rPr>
+                <w:rFonts w:ascii="Times New Roman" w:eastAsia="Times New Roman" w:hAnsi="Times New Roman" w:cs="Times New Roman"/>
+                <w:kern w:val="0"/>
+                <w:lang w:eastAsia="es-MX"/>
+                <w14:ligatures w14:val="none"/>
+              </w:rPr>
+            </w:pPr>
+            <w:proofErr w:type="spellStart"/>
+            <w:r>
+              <w:rPr>
+                <w:rFonts w:ascii="Helvetica Neue" w:eastAsia="Times New Roman" w:hAnsi="Helvetica Neue" w:cs="Times New Roman"/>
+                <w:b/>
+                <w:bCs/>
+                <w:color w:val="000000"/>
+                <w:kern w:val="0"/>
+                <w:sz w:val="15"/>
+                <w:szCs w:val="15"/>
+                <w:lang w:eastAsia="es-MX"/>
+                <w14:ligatures w14:val="none"/>
+              </w:rPr>
+              <w:t>maximum</w:t>
+            </w:r>
+            <w:proofErr w:type="spellEnd"/>
+          </w:p>
+        </w:tc>
+        <w:tc>
+          <w:tcPr>
+            <w:tcW w:w="540" w:type="dxa"/>
+            <w:tcBorders>
+              <w:top w:val="single" w:sz="6" w:space="0" w:color="000000"/>
+              <w:left w:val="single" w:sz="6" w:space="0" w:color="000000"/>
+              <w:bottom w:val="single" w:sz="6" w:space="0" w:color="000000"/>
+              <w:right w:val="single" w:sz="6" w:space="0" w:color="000000"/>
+            </w:tcBorders>
+            <w:tcMar>
+              <w:top w:w="60" w:type="dxa"/>
+              <w:left w:w="60" w:type="dxa"/>
+              <w:bottom w:w="60" w:type="dxa"/>
+              <w:right w:w="60" w:type="dxa"/>
+            </w:tcMar>
+            <w:hideMark/>
+          </w:tcPr>
+          <w:p>
+            <w:pPr>
+              <w:spacing w:after="0" w:line="240" w:lineRule="auto"/>
+              <w:rPr>
+                <w:rFonts w:ascii="Times New Roman" w:eastAsia="Times New Roman" w:hAnsi="Times New Roman" w:cs="Times New Roman"/>
+                <w:kern w:val="0"/>
+                <w:lang w:eastAsia="es-MX"/>
+                <w14:ligatures w14:val="none"/>
+              </w:rPr>
+            </w:pPr>
+            <w:r>
+              <w:rPr>
+                <w:rFonts w:ascii="Helvetica Neue" w:eastAsia="Times New Roman" w:hAnsi="Helvetica Neue" w:cs="Times New Roman"/>
+                <w:color w:val="000000"/>
+                <w:kern w:val="0"/>
+                <w:sz w:val="15"/>
+                <w:szCs w:val="15"/>
+                <w:lang w:eastAsia="es-MX"/>
+                <w14:ligatures w14:val="none"/>
+              </w:rPr>
+              <w:t>1632</w:t>
+            </w:r>
+          </w:p>
+        </w:tc>
+        <w:tc>
+          <w:tcPr>
+            <w:tcW w:w="930" w:type="dxa"/>
+            <w:tcBorders>
+              <w:top w:val="single" w:sz="6" w:space="0" w:color="000000"/>
+              <w:left w:val="single" w:sz="6" w:space="0" w:color="000000"/>
+              <w:bottom w:val="single" w:sz="6" w:space="0" w:color="000000"/>
+              <w:right w:val="single" w:sz="6" w:space="0" w:color="000000"/>
+            </w:tcBorders>
+            <w:tcMar>
+              <w:top w:w="60" w:type="dxa"/>
+              <w:left w:w="60" w:type="dxa"/>
+              <w:bottom w:w="60" w:type="dxa"/>
+              <w:right w:w="60" w:type="dxa"/>
+            </w:tcMar>
+            <w:hideMark/>
+          </w:tcPr>
+          <w:p>
+            <w:pPr>
+              <w:spacing w:after="0" w:line="240" w:lineRule="auto"/>
+              <w:rPr>
+                <w:rFonts w:ascii="Times New Roman" w:eastAsia="Times New Roman" w:hAnsi="Times New Roman" w:cs="Times New Roman"/>
+                <w:kern w:val="0"/>
+                <w:lang w:eastAsia="es-MX"/>
+                <w14:ligatures w14:val="none"/>
+              </w:rPr>
+            </w:pPr>
+            <w:r>
+              <w:rPr>
+                <w:rFonts w:ascii="Helvetica Neue" w:eastAsia="Times New Roman" w:hAnsi="Helvetica Neue" w:cs="Times New Roman"/>
+                <w:color w:val="000000"/>
+                <w:kern w:val="0"/>
+                <w:sz w:val="15"/>
+                <w:szCs w:val="15"/>
+                <w:lang w:eastAsia="es-MX"/>
+                <w14:ligatures w14:val="none"/>
+              </w:rPr>
+              <w:t>1509</w:t>
+            </w:r>
+          </w:p>
+        </w:tc>
+        <w:tc>
+          <w:tcPr>
+            <w:tcW w:w="705" w:type="dxa"/>
+            <w:tcBorders>
+              <w:top w:val="single" w:sz="6" w:space="0" w:color="000000"/>
+              <w:left w:val="single" w:sz="6" w:space="0" w:color="000000"/>
+              <w:bottom w:val="single" w:sz="6" w:space="0" w:color="000000"/>
+              <w:right w:val="single" w:sz="6" w:space="0" w:color="000000"/>
+            </w:tcBorders>
+            <w:tcMar>
+              <w:top w:w="60" w:type="dxa"/>
+              <w:left w:w="60" w:type="dxa"/>
+              <w:bottom w:w="60" w:type="dxa"/>
+              <w:right w:w="60" w:type="dxa"/>
+            </w:tcMar>
+            <w:hideMark/>
+          </w:tcPr>
+          <w:p>
+            <w:pPr>
+              <w:spacing w:after="0" w:line="240" w:lineRule="auto"/>
+              <w:rPr>
+                <w:rFonts w:ascii="Times New Roman" w:eastAsia="Times New Roman" w:hAnsi="Times New Roman" w:cs="Times New Roman"/>
+                <w:kern w:val="0"/>
+                <w:lang w:eastAsia="es-MX"/>
+                <w14:ligatures w14:val="none"/>
+              </w:rPr>
+            </w:pPr>
+            <w:r>
+              <w:rPr>
+                <w:rFonts w:ascii="Helvetica Neue" w:eastAsia="Times New Roman" w:hAnsi="Helvetica Neue" w:cs="Times New Roman"/>
+                <w:color w:val="000000"/>
+                <w:kern w:val="0"/>
+                <w:sz w:val="15"/>
+                <w:szCs w:val="15"/>
+                <w:lang w:eastAsia="es-MX"/>
+                <w14:ligatures w14:val="none"/>
+              </w:rPr>
+              <w:t>890076.65</w:t>
+            </w:r>
+          </w:p>
+        </w:tc>
+        <w:tc>
+          <w:tcPr>
+            <w:tcW w:w="705" w:type="dxa"/>
+            <w:tcBorders>
+              <w:top w:val="single" w:sz="6" w:space="0" w:color="000000"/>
+              <w:left w:val="single" w:sz="6" w:space="0" w:color="000000"/>
+              <w:bottom w:val="single" w:sz="6" w:space="0" w:color="000000"/>
+              <w:right w:val="single" w:sz="6" w:space="0" w:color="000000"/>
+            </w:tcBorders>
+            <w:tcMar>
+              <w:top w:w="60" w:type="dxa"/>
+              <w:left w:w="60" w:type="dxa"/>
+              <w:bottom w:w="60" w:type="dxa"/>
+              <w:right w:w="60" w:type="dxa"/>
+            </w:tcMar>
+            <w:hideMark/>
+          </w:tcPr>
+          <w:p>
+            <w:pPr>
+              <w:spacing w:after="0" w:line="240" w:lineRule="auto"/>
+              <w:rPr>
+                <w:rFonts w:ascii="Times New Roman" w:eastAsia="Times New Roman" w:hAnsi="Times New Roman" w:cs="Times New Roman"/>
+                <w:kern w:val="0"/>
+                <w:lang w:eastAsia="es-MX"/>
+                <w14:ligatures w14:val="none"/>
+              </w:rPr>
+            </w:pPr>
+            <w:r>
+              <w:rPr>
+                <w:rFonts w:ascii="Helvetica Neue" w:eastAsia="Times New Roman" w:hAnsi="Helvetica Neue" w:cs="Times New Roman"/>
+                <w:color w:val="000000"/>
+                <w:kern w:val="0"/>
+                <w:sz w:val="15"/>
+                <w:szCs w:val="15"/>
+                <w:lang w:eastAsia="es-MX"/>
+                <w14:ligatures w14:val="none"/>
+              </w:rPr>
+              <w:t>275218.1</w:t>
+            </w:r>
+          </w:p>
+        </w:tc>
+        <w:tc>
+          <w:tcPr>
+            <w:tcW w:w="630" w:type="dxa"/>
+            <w:tcBorders>
+              <w:top w:val="single" w:sz="6" w:space="0" w:color="000000"/>
+              <w:left w:val="single" w:sz="6" w:space="0" w:color="000000"/>
+              <w:bottom w:val="single" w:sz="6" w:space="0" w:color="000000"/>
+              <w:right w:val="single" w:sz="6" w:space="0" w:color="000000"/>
+            </w:tcBorders>
+            <w:tcMar>
+              <w:top w:w="60" w:type="dxa"/>
+              <w:left w:w="60" w:type="dxa"/>
+              <w:bottom w:w="60" w:type="dxa"/>
+              <w:right w:w="60" w:type="dxa"/>
+            </w:tcMar>
+            <w:hideMark/>
+          </w:tcPr>
+          <w:p>
+            <w:pPr>
+              <w:spacing w:after="0" w:line="240" w:lineRule="auto"/>
+              <w:rPr>
+                <w:rFonts w:ascii="Times New Roman" w:eastAsia="Times New Roman" w:hAnsi="Times New Roman" w:cs="Times New Roman"/>
+                <w:kern w:val="0"/>
+                <w:lang w:eastAsia="es-MX"/>
+                <w14:ligatures w14:val="none"/>
+              </w:rPr>
+            </w:pPr>
+            <w:r>
+              <w:rPr>
+                <w:rFonts w:ascii="Helvetica Neue" w:eastAsia="Times New Roman" w:hAnsi="Helvetica Neue" w:cs="Times New Roman"/>
+                <w:color w:val="000000"/>
+                <w:kern w:val="0"/>
+                <w:sz w:val="15"/>
+                <w:szCs w:val="15"/>
+                <w:lang w:eastAsia="es-MX"/>
+                <w14:ligatures w14:val="none"/>
+              </w:rPr>
+              <w:t>28052.92</w:t>
+            </w:r>
+          </w:p>
+        </w:tc>
+      </w:tr>
+    </w:tbl>
+    <w:p>
+      <w:pPr>
+        <w:pStyle w:val="Prrafodelista"/>
+        <w:numPr>
+          <w:ilvl w:val="0"/>
+          <w:numId w:val="2"/>
+        </w:numPr>
+        <w:rPr>
+          <w:rFonts w:ascii="Times New Roman" w:hAnsi="Times New Roman" w:cs="Times New Roman"/>
+        </w:rPr>
+      </w:pPr>
+      <w:r>
+        <w:rPr>
+          <w:rFonts w:ascii="Times New Roman" w:hAnsi="Times New Roman" w:cs="Times New Roman"/>
+        </w:rPr>
+        <w:lastRenderedPageBreak/>
+        <w:t xml:space="preserve">Tabla promedio periodos </w:t>
+      </w:r>
+    </w:p>
+    <w:p>
+      <w:pPr>
+        <w:pStyle w:val="Prrafodelista"/>
+        <w:numPr>
+          <w:ilvl w:val="0"/>
+          <w:numId w:val="2"/>
+        </w:numPr>
+        <w:rPr>
+          <w:rFonts w:ascii="Times New Roman" w:hAnsi="Times New Roman" w:cs="Times New Roman"/>
+        </w:rPr>
+      </w:pPr>
+      <w:r>
+        <w:rPr>
+          <w:rFonts w:ascii="Times New Roman" w:hAnsi="Times New Roman" w:cs="Times New Roman"/>
+        </w:rPr>
+        <w:t>Análisis resultados descriptivos</w:t>
+      </w:r>
+    </w:p>
+    <w:p>
+      <w:pPr>
+        <w:pStyle w:val="paragraph"/>
+        <w:spacing w:before="0" w:beforeAutospacing="0" w:after="0" w:afterAutospacing="0"/>
+        <w:jc w:val="both"/>
+        <w:textAlignment w:val="baseline"/>
+        <w:rPr>
+          <w:rFonts w:ascii="Segoe UI" w:hAnsi="Segoe UI" w:cs="Segoe UI"/>
+          <w:sz w:val="18"/>
+          <w:szCs w:val="18"/>
+        </w:rPr>
+      </w:pPr>
+      <w:r>
+        <w:rPr>
+          <w:rStyle w:val="normaltextrun"/>
+          <w:rFonts w:eastAsiaTheme="majorEastAsia"/>
+          <w:lang w:val="es-ES"/>
+        </w:rPr>
+        <w:t>El análisis descriptivo de las variables visitas, visitas únicas, ingresos, utilidad y libras vendidas muestra cambios importantes a lo largo de los cuatro periodos analizados. En el periodo inicial, el sitio web presenta niveles relativamente altos de tráfico, con un promedio de 1.055 visitas y 976 visitas únicas, acompañado también por los niveles más altos de ingresos promedio ($608.250) y utilidad promedio ($200.233). Sin embargo, en el periodo pre-promoción se observa una disminución considerable en el tráfico del sitio, con promedios de 563 visitas y 517 visitas únicas, mientras que los ingresos y las libras vendidas se mantienen relativamente estables en comparación con el periodo inicial. Durante el periodo de promoción, el tráfico del sitio aumenta significativamente, alcanzando promedios de 1.814 visitas y 1.739 visitas únicas, lo que coincide con el envío de la campaña promocional. No obstante, a pesar del aumento del tráfico, los ingresos promedio ($456.399) y la utilidad ($131.930) no muestran un incremento proporcional. Finalmente, en el periodo post-promoción, el tráfico vuelve a disminuir considerablemente, registrando niveles incluso menores que en periodos anteriores, con promedios de 372 visitas y 111 visitas únicas, junto con reducciones adicionales en ingresos, utilidades y libras vendidas.</w:t>
+      </w:r>
+      <w:r>
+        <w:rPr>
+          <w:rStyle w:val="eop"/>
+          <w:rFonts w:eastAsiaTheme="majorEastAsia"/>
+        </w:rPr>
+        <w:t> </w:t>
+      </w:r>
+    </w:p>
+    <w:p>
+      <w:pPr>
+        <w:pStyle w:val="paragraph"/>
+        <w:spacing w:before="0" w:beforeAutospacing="0" w:after="0" w:afterAutospacing="0"/>
+        <w:jc w:val="both"/>
+        <w:textAlignment w:val="baseline"/>
+        <w:rPr>
+          <w:rStyle w:val="normaltextrun"/>
+          <w:rFonts w:eastAsiaTheme="majorEastAsia"/>
+          <w:lang w:val="es-ES"/>
+        </w:rPr>
+      </w:pPr>
+    </w:p>
+    <w:p>
+      <w:pPr>
+        <w:pStyle w:val="paragraph"/>
+        <w:spacing w:before="0" w:beforeAutospacing="0" w:after="0" w:afterAutospacing="0"/>
+        <w:jc w:val="both"/>
+        <w:textAlignment w:val="baseline"/>
+        <w:rPr>
+          <w:rFonts w:ascii="Segoe UI" w:hAnsi="Segoe UI" w:cs="Segoe UI"/>
+          <w:sz w:val="18"/>
+          <w:szCs w:val="18"/>
+        </w:rPr>
+      </w:pPr>
+      <w:r>
+        <w:rPr>
+          <w:rStyle w:val="normaltextrun"/>
+          <w:rFonts w:eastAsiaTheme="majorEastAsia"/>
+          <w:lang w:val="es-ES"/>
+        </w:rPr>
+        <w:t>En general, los resultados sugieren que la promoción tuvo un efecto claro en el aumento del tráfico hacia el sitio web, como se observa en el incremento notable de visitas y visitas únicas durante el periodo promocional. Sin embargo, este aumento en el tráfico no se traduce directamente en mayores ingresos, utilidades o volumen de ventas, lo que indica que la relación entre visitas al sitio y resultados financieros parece ser limitada. Además, se observa que los ingresos y las libras vendidas presentan un comportamiento más estable entre periodos, lo cual sugiere que las ventas pueden depender más de factores comerciales tradicionales que del tráfico web. Estos resultados indican que el sitio web podría estar funcionando principalmente como una herramienta de información o generación de interés, más que como un canal directo de conversión en ventas.</w:t>
+      </w:r>
+      <w:r>
+        <w:rPr>
+          <w:rStyle w:val="eop"/>
+          <w:rFonts w:eastAsiaTheme="majorEastAsia"/>
+          <w:bdr w:val="none" w:sz="0" w:space="0" w:color="auto" w:frame="1"/>
+          <w:shd w:val="clear" w:color="auto" w:fill="C6C6C6"/>
+        </w:rPr>
+        <w:t> </w:t>
+      </w:r>
+    </w:p>
+    <w:p>
+      <w:pPr>
+        <w:rPr>
+          <w:rFonts w:ascii="Times New Roman" w:hAnsi="Times New Roman" w:cs="Times New Roman"/>
+        </w:rPr>
+      </w:pPr>
+    </w:p>
+    <w:p>
+      <w:pPr>
+        <w:rPr>
+          <w:rFonts w:ascii="Times New Roman" w:hAnsi="Times New Roman" w:cs="Times New Roman"/>
+        </w:rPr>
+      </w:pPr>
+    </w:p>
+    <w:p>
+      <w:pPr>
+        <w:rPr>
+          <w:rFonts w:ascii="Times New Roman" w:hAnsi="Times New Roman" w:cs="Times New Roman"/>
         </w:rPr>
       </w:pPr>
     </w:p>
@@ -222,6 +2194,95 @@
 <file path=word/numbering.xml><?xml version="1.0" encoding="utf-8"?>
 <w:numbering xmlns:wpc="http://schemas.microsoft.com/office/word/2010/wordprocessingCanvas" xmlns:cx="http://schemas.microsoft.com/office/drawing/2014/chartex" xmlns:cx1="http://schemas.microsoft.com/office/drawing/2015/9/8/chartex" xmlns:cx2="http://schemas.microsoft.com/office/drawing/2015/10/21/chartex" xmlns:cx3="http://schemas.microsoft.com/office/drawing/2016/5/9/chartex" xmlns:cx4="http://schemas.microsoft.com/office/drawing/2016/5/10/chartex" xmlns:cx5="http://schemas.microsoft.com/office/drawing/2016/5/11/chartex" xmlns:cx6="http://schemas.microsoft.com/office/drawing/2016/5/12/chartex" xmlns:cx7="http://schemas.microsoft.com/office/drawing/2016/5/13/chartex" xmlns:cx8="http://schemas.microsoft.com/office/drawing/2016/5/14/chartex" xmlns:mc="http://schemas.openxmlformats.org/markup-compatibility/2006" xmlns:aink="http://schemas.microsoft.com/office/drawing/2016/ink" xmlns:am3d="http://schemas.microsoft.com/office/drawing/2017/model3d" xmlns:o="urn:schemas-microsoft-com:office:office" xmlns:oel="http://schemas.microsoft.com/office/2019/extlst" xmlns:r="http://schemas.openxmlformats.org/officeDocument/2006/relationships" xmlns:m="http://schemas.openxmlformats.org/officeDocument/2006/math" xmlns:v="urn:schemas-microsoft-com:vml" xmlns:wp14="http://schemas.microsoft.com/office/word/2010/wordprocessingDrawing" xmlns:wp="http://schemas.openxmlformats.org/drawingml/2006/wordprocessingDrawing" xmlns:w10="urn:schemas-microsoft-com:office:word" xmlns:w="http://schemas.openxmlformats.org/wordprocessingml/2006/main" xmlns:w14="http://schemas.microsoft.com/office/word/2010/wordml" xmlns:w15="http://schemas.microsoft.com/office/word/2012/wordml" xmlns:w16cex="http://schemas.microsoft.com/office/word/2018/wordml/cex" xmlns:w16cid="http://schemas.microsoft.com/office/word/2016/wordml/cid" xmlns:w16="http://schemas.microsoft.com/office/word/2018/wordml" xmlns:w16du="http://schemas.microsoft.com/office/word/2023/wordml/word16du" xmlns:w16sdtdh="http://schemas.microsoft.com/office/word/2020/wordml/sdtdatahash" xmlns:w16sdtfl="http://schemas.microsoft.com/office/word/2024/wordml/sdtformatlock" xmlns:w16se="http://schemas.microsoft.com/office/word/2015/wordml/symex" xmlns:wpg="http://schemas.microsoft.com/office/word/2010/wordprocessingGroup" xmlns:wpi="http://schemas.microsoft.com/office/word/2010/wordprocessingInk" xmlns:wne="http://schemas.microsoft.com/office/word/2006/wordml" xmlns:wps="http://schemas.microsoft.com/office/word/2010/wordprocessingShape" mc:Ignorable="w14 w15 w16se w16cid w16 w16cex w16sdtdh w16sdtfl w16du wp14">
   <w:abstractNum w:abstractNumId="0" w15:restartNumberingAfterBreak="0">
+    <w:nsid w:val="1CF16EFC"/>
+    <w:multiLevelType w:val="hybridMultilevel"/>
+    <w:tmpl w:val="5A6EA73C"/>
+    <w:lvl w:ilvl="0" w:tplc="080A000F">
+      <w:start w:val="1"/>
+      <w:numFmt w:val="decimal"/>
+      <w:lvlText w:val="%1."/>
+      <w:lvlJc w:val="left"/>
+      <w:pPr>
+        <w:ind w:left="720" w:hanging="360"/>
+      </w:pPr>
+      <w:rPr>
+        <w:rFonts w:hint="default"/>
+      </w:rPr>
+    </w:lvl>
+    <w:lvl w:ilvl="1" w:tplc="080A0019" w:tentative="1">
+      <w:start w:val="1"/>
+      <w:numFmt w:val="lowerLetter"/>
+      <w:lvlText w:val="%2."/>
+      <w:lvlJc w:val="left"/>
+      <w:pPr>
+        <w:ind w:left="1440" w:hanging="360"/>
+      </w:pPr>
+    </w:lvl>
+    <w:lvl w:ilvl="2" w:tplc="080A001B" w:tentative="1">
+      <w:start w:val="1"/>
+      <w:numFmt w:val="lowerRoman"/>
+      <w:lvlText w:val="%3."/>
+      <w:lvlJc w:val="right"/>
+      <w:pPr>
+        <w:ind w:left="2160" w:hanging="180"/>
+      </w:pPr>
+    </w:lvl>
+    <w:lvl w:ilvl="3" w:tplc="080A000F" w:tentative="1">
+      <w:start w:val="1"/>
+      <w:numFmt w:val="decimal"/>
+      <w:lvlText w:val="%4."/>
+      <w:lvlJc w:val="left"/>
+      <w:pPr>
+        <w:ind w:left="2880" w:hanging="360"/>
+      </w:pPr>
+    </w:lvl>
+    <w:lvl w:ilvl="4" w:tplc="080A0019" w:tentative="1">
+      <w:start w:val="1"/>
+      <w:numFmt w:val="lowerLetter"/>
+      <w:lvlText w:val="%5."/>
+      <w:lvlJc w:val="left"/>
+      <w:pPr>
+        <w:ind w:left="3600" w:hanging="360"/>
+      </w:pPr>
+    </w:lvl>
+    <w:lvl w:ilvl="5" w:tplc="080A001B" w:tentative="1">
+      <w:start w:val="1"/>
+      <w:numFmt w:val="lowerRoman"/>
+      <w:lvlText w:val="%6."/>
+      <w:lvlJc w:val="right"/>
+      <w:pPr>
+        <w:ind w:left="4320" w:hanging="180"/>
+      </w:pPr>
+    </w:lvl>
+    <w:lvl w:ilvl="6" w:tplc="080A000F" w:tentative="1">
+      <w:start w:val="1"/>
+      <w:numFmt w:val="decimal"/>
+      <w:lvlText w:val="%7."/>
+      <w:lvlJc w:val="left"/>
+      <w:pPr>
+        <w:ind w:left="5040" w:hanging="360"/>
+      </w:pPr>
+    </w:lvl>
+    <w:lvl w:ilvl="7" w:tplc="080A0019" w:tentative="1">
+      <w:start w:val="1"/>
+      <w:numFmt w:val="lowerLetter"/>
+      <w:lvlText w:val="%8."/>
+      <w:lvlJc w:val="left"/>
+      <w:pPr>
+        <w:ind w:left="5760" w:hanging="360"/>
+      </w:pPr>
+    </w:lvl>
+    <w:lvl w:ilvl="8" w:tplc="080A001B" w:tentative="1">
+      <w:start w:val="1"/>
+      <w:numFmt w:val="lowerRoman"/>
+      <w:lvlText w:val="%9."/>
+      <w:lvlJc w:val="right"/>
+      <w:pPr>
+        <w:ind w:left="6480" w:hanging="180"/>
+      </w:pPr>
+    </w:lvl>
+  </w:abstractNum>
+  <w:abstractNum w:abstractNumId="1" w15:restartNumberingAfterBreak="0">
     <w:nsid w:val="4C7151E4"/>
     <w:multiLevelType w:val="hybridMultilevel"/>
     <w:tmpl w:val="F77022D0"/>
@@ -311,6 +2372,9 @@
     </w:lvl>
   </w:abstractNum>
   <w:num w:numId="1" w16cid:durableId="1645549328">
+    <w:abstractNumId w:val="1"/>
+  </w:num>
+  <w:num w:numId="2" w16cid:durableId="258567206">
     <w:abstractNumId w:val="0"/>
   </w:num>
 </w:numbering>
@@ -325,7 +2389,7 @@
         <w:kern w:val="2"/>
         <w:sz w:val="24"/>
         <w:szCs w:val="24"/>
-        <w:lang w:val="en-CO" w:eastAsia="en-US" w:bidi="ar-SA"/>
+        <w:lang w:val="es-CO" w:eastAsia="en-US" w:bidi="ar-SA"/>
         <w14:ligatures w14:val="standardContextual"/>
       </w:rPr>
     </w:rPrDefault>
@@ -717,11 +2781,11 @@
     <w:name w:val="Normal"/>
     <w:qFormat/>
   </w:style>
-  <w:style w:type="paragraph" w:styleId="Heading1">
+  <w:style w:type="paragraph" w:styleId="Ttulo1">
     <w:name w:val="heading 1"/>
     <w:basedOn w:val="Normal"/>
     <w:next w:val="Normal"/>
-    <w:link w:val="Heading1Char"/>
+    <w:link w:val="Ttulo1Car"/>
     <w:uiPriority w:val="9"/>
     <w:qFormat/>
     <w:rsid w:val="002F1EE9"/>
@@ -738,11 +2802,11 @@
       <w:szCs w:val="40"/>
     </w:rPr>
   </w:style>
-  <w:style w:type="paragraph" w:styleId="Heading2">
+  <w:style w:type="paragraph" w:styleId="Ttulo2">
     <w:name w:val="heading 2"/>
     <w:basedOn w:val="Normal"/>
     <w:next w:val="Normal"/>
-    <w:link w:val="Heading2Char"/>
+    <w:link w:val="Ttulo2Car"/>
     <w:uiPriority w:val="9"/>
     <w:semiHidden/>
     <w:unhideWhenUsed/>
@@ -761,11 +2825,11 @@
       <w:szCs w:val="32"/>
     </w:rPr>
   </w:style>
-  <w:style w:type="paragraph" w:styleId="Heading3">
+  <w:style w:type="paragraph" w:styleId="Ttulo3">
     <w:name w:val="heading 3"/>
     <w:basedOn w:val="Normal"/>
     <w:next w:val="Normal"/>
-    <w:link w:val="Heading3Char"/>
+    <w:link w:val="Ttulo3Car"/>
     <w:uiPriority w:val="9"/>
     <w:semiHidden/>
     <w:unhideWhenUsed/>
@@ -784,11 +2848,11 @@
       <w:szCs w:val="28"/>
     </w:rPr>
   </w:style>
-  <w:style w:type="paragraph" w:styleId="Heading4">
+  <w:style w:type="paragraph" w:styleId="Ttulo4">
     <w:name w:val="heading 4"/>
     <w:basedOn w:val="Normal"/>
     <w:next w:val="Normal"/>
-    <w:link w:val="Heading4Char"/>
+    <w:link w:val="Ttulo4Car"/>
     <w:uiPriority w:val="9"/>
     <w:semiHidden/>
     <w:unhideWhenUsed/>
@@ -807,11 +2871,11 @@
       <w:color w:val="0F4761" w:themeColor="accent1" w:themeShade="BF"/>
     </w:rPr>
   </w:style>
-  <w:style w:type="paragraph" w:styleId="Heading5">
+  <w:style w:type="paragraph" w:styleId="Ttulo5">
     <w:name w:val="heading 5"/>
     <w:basedOn w:val="Normal"/>
     <w:next w:val="Normal"/>
-    <w:link w:val="Heading5Char"/>
+    <w:link w:val="Ttulo5Car"/>
     <w:uiPriority w:val="9"/>
     <w:semiHidden/>
     <w:unhideWhenUsed/>
@@ -828,11 +2892,11 @@
       <w:color w:val="0F4761" w:themeColor="accent1" w:themeShade="BF"/>
     </w:rPr>
   </w:style>
-  <w:style w:type="paragraph" w:styleId="Heading6">
+  <w:style w:type="paragraph" w:styleId="Ttulo6">
     <w:name w:val="heading 6"/>
     <w:basedOn w:val="Normal"/>
     <w:next w:val="Normal"/>
-    <w:link w:val="Heading6Char"/>
+    <w:link w:val="Ttulo6Car"/>
     <w:uiPriority w:val="9"/>
     <w:semiHidden/>
     <w:unhideWhenUsed/>
@@ -851,11 +2915,11 @@
       <w:color w:val="595959" w:themeColor="text1" w:themeTint="A6"/>
     </w:rPr>
   </w:style>
-  <w:style w:type="paragraph" w:styleId="Heading7">
+  <w:style w:type="paragraph" w:styleId="Ttulo7">
     <w:name w:val="heading 7"/>
     <w:basedOn w:val="Normal"/>
     <w:next w:val="Normal"/>
-    <w:link w:val="Heading7Char"/>
+    <w:link w:val="Ttulo7Car"/>
     <w:uiPriority w:val="9"/>
     <w:semiHidden/>
     <w:unhideWhenUsed/>
@@ -872,11 +2936,11 @@
       <w:color w:val="595959" w:themeColor="text1" w:themeTint="A6"/>
     </w:rPr>
   </w:style>
-  <w:style w:type="paragraph" w:styleId="Heading8">
+  <w:style w:type="paragraph" w:styleId="Ttulo8">
     <w:name w:val="heading 8"/>
     <w:basedOn w:val="Normal"/>
     <w:next w:val="Normal"/>
-    <w:link w:val="Heading8Char"/>
+    <w:link w:val="Ttulo8Car"/>
     <w:uiPriority w:val="9"/>
     <w:semiHidden/>
     <w:unhideWhenUsed/>
@@ -895,11 +2959,11 @@
       <w:color w:val="272727" w:themeColor="text1" w:themeTint="D8"/>
     </w:rPr>
   </w:style>
-  <w:style w:type="paragraph" w:styleId="Heading9">
+  <w:style w:type="paragraph" w:styleId="Ttulo9">
     <w:name w:val="heading 9"/>
     <w:basedOn w:val="Normal"/>
     <w:next w:val="Normal"/>
-    <w:link w:val="Heading9Char"/>
+    <w:link w:val="Ttulo9Car"/>
     <w:uiPriority w:val="9"/>
     <w:semiHidden/>
     <w:unhideWhenUsed/>
@@ -916,13 +2980,13 @@
       <w:color w:val="272727" w:themeColor="text1" w:themeTint="D8"/>
     </w:rPr>
   </w:style>
-  <w:style w:type="character" w:default="1" w:styleId="DefaultParagraphFont">
+  <w:style w:type="character" w:default="1" w:styleId="Fuentedeprrafopredeter">
     <w:name w:val="Default Paragraph Font"/>
     <w:uiPriority w:val="1"/>
     <w:semiHidden/>
     <w:unhideWhenUsed/>
   </w:style>
-  <w:style w:type="table" w:default="1" w:styleId="TableNormal">
+  <w:style w:type="table" w:default="1" w:styleId="Tablanormal">
     <w:name w:val="Normal Table"/>
     <w:uiPriority w:val="99"/>
     <w:semiHidden/>
@@ -937,16 +3001,16 @@
       </w:tblCellMar>
     </w:tblPr>
   </w:style>
-  <w:style w:type="numbering" w:default="1" w:styleId="NoList">
+  <w:style w:type="numbering" w:default="1" w:styleId="Sinlista">
     <w:name w:val="No List"/>
     <w:uiPriority w:val="99"/>
     <w:semiHidden/>
     <w:unhideWhenUsed/>
   </w:style>
-  <w:style w:type="character" w:customStyle="1" w:styleId="Heading1Char">
-    <w:name w:val="Heading 1 Char"/>
-    <w:basedOn w:val="DefaultParagraphFont"/>
-    <w:link w:val="Heading1"/>
+  <w:style w:type="character" w:customStyle="1" w:styleId="Ttulo1Car">
+    <w:name w:val="Título 1 Car"/>
+    <w:basedOn w:val="Fuentedeprrafopredeter"/>
+    <w:link w:val="Ttulo1"/>
     <w:uiPriority w:val="9"/>
     <w:rsid w:val="002F1EE9"/>
     <w:rPr>
@@ -956,10 +3020,10 @@
       <w:szCs w:val="40"/>
     </w:rPr>
   </w:style>
-  <w:style w:type="character" w:customStyle="1" w:styleId="Heading2Char">
-    <w:name w:val="Heading 2 Char"/>
-    <w:basedOn w:val="DefaultParagraphFont"/>
-    <w:link w:val="Heading2"/>
+  <w:style w:type="character" w:customStyle="1" w:styleId="Ttulo2Car">
+    <w:name w:val="Título 2 Car"/>
+    <w:basedOn w:val="Fuentedeprrafopredeter"/>
+    <w:link w:val="Ttulo2"/>
     <w:uiPriority w:val="9"/>
     <w:semiHidden/>
     <w:rsid w:val="002F1EE9"/>
@@ -970,10 +3034,10 @@
       <w:szCs w:val="32"/>
     </w:rPr>
   </w:style>
-  <w:style w:type="character" w:customStyle="1" w:styleId="Heading3Char">
-    <w:name w:val="Heading 3 Char"/>
-    <w:basedOn w:val="DefaultParagraphFont"/>
-    <w:link w:val="Heading3"/>
+  <w:style w:type="character" w:customStyle="1" w:styleId="Ttulo3Car">
+    <w:name w:val="Título 3 Car"/>
+    <w:basedOn w:val="Fuentedeprrafopredeter"/>
+    <w:link w:val="Ttulo3"/>
     <w:uiPriority w:val="9"/>
     <w:semiHidden/>
     <w:rsid w:val="002F1EE9"/>
@@ -984,10 +3048,10 @@
       <w:szCs w:val="28"/>
     </w:rPr>
   </w:style>
-  <w:style w:type="character" w:customStyle="1" w:styleId="Heading4Char">
-    <w:name w:val="Heading 4 Char"/>
-    <w:basedOn w:val="DefaultParagraphFont"/>
-    <w:link w:val="Heading4"/>
+  <w:style w:type="character" w:customStyle="1" w:styleId="Ttulo4Car">
+    <w:name w:val="Título 4 Car"/>
+    <w:basedOn w:val="Fuentedeprrafopredeter"/>
+    <w:link w:val="Ttulo4"/>
     <w:uiPriority w:val="9"/>
     <w:semiHidden/>
     <w:rsid w:val="002F1EE9"/>
@@ -998,10 +3062,10 @@
       <w:color w:val="0F4761" w:themeColor="accent1" w:themeShade="BF"/>
     </w:rPr>
   </w:style>
-  <w:style w:type="character" w:customStyle="1" w:styleId="Heading5Char">
-    <w:name w:val="Heading 5 Char"/>
-    <w:basedOn w:val="DefaultParagraphFont"/>
-    <w:link w:val="Heading5"/>
+  <w:style w:type="character" w:customStyle="1" w:styleId="Ttulo5Car">
+    <w:name w:val="Título 5 Car"/>
+    <w:basedOn w:val="Fuentedeprrafopredeter"/>
+    <w:link w:val="Ttulo5"/>
     <w:uiPriority w:val="9"/>
     <w:semiHidden/>
     <w:rsid w:val="002F1EE9"/>
@@ -1010,10 +3074,10 @@
       <w:color w:val="0F4761" w:themeColor="accent1" w:themeShade="BF"/>
     </w:rPr>
   </w:style>
-  <w:style w:type="character" w:customStyle="1" w:styleId="Heading6Char">
-    <w:name w:val="Heading 6 Char"/>
-    <w:basedOn w:val="DefaultParagraphFont"/>
-    <w:link w:val="Heading6"/>
+  <w:style w:type="character" w:customStyle="1" w:styleId="Ttulo6Car">
+    <w:name w:val="Título 6 Car"/>
+    <w:basedOn w:val="Fuentedeprrafopredeter"/>
+    <w:link w:val="Ttulo6"/>
     <w:uiPriority w:val="9"/>
     <w:semiHidden/>
     <w:rsid w:val="002F1EE9"/>
@@ -1024,10 +3088,10 @@
       <w:color w:val="595959" w:themeColor="text1" w:themeTint="A6"/>
     </w:rPr>
   </w:style>
-  <w:style w:type="character" w:customStyle="1" w:styleId="Heading7Char">
-    <w:name w:val="Heading 7 Char"/>
-    <w:basedOn w:val="DefaultParagraphFont"/>
-    <w:link w:val="Heading7"/>
+  <w:style w:type="character" w:customStyle="1" w:styleId="Ttulo7Car">
+    <w:name w:val="Título 7 Car"/>
+    <w:basedOn w:val="Fuentedeprrafopredeter"/>
+    <w:link w:val="Ttulo7"/>
     <w:uiPriority w:val="9"/>
     <w:semiHidden/>
     <w:rsid w:val="002F1EE9"/>
@@ -1036,10 +3100,10 @@
       <w:color w:val="595959" w:themeColor="text1" w:themeTint="A6"/>
     </w:rPr>
   </w:style>
-  <w:style w:type="character" w:customStyle="1" w:styleId="Heading8Char">
-    <w:name w:val="Heading 8 Char"/>
-    <w:basedOn w:val="DefaultParagraphFont"/>
-    <w:link w:val="Heading8"/>
+  <w:style w:type="character" w:customStyle="1" w:styleId="Ttulo8Car">
+    <w:name w:val="Título 8 Car"/>
+    <w:basedOn w:val="Fuentedeprrafopredeter"/>
+    <w:link w:val="Ttulo8"/>
     <w:uiPriority w:val="9"/>
     <w:semiHidden/>
     <w:rsid w:val="002F1EE9"/>
@@ -1050,10 +3114,10 @@
       <w:color w:val="272727" w:themeColor="text1" w:themeTint="D8"/>
     </w:rPr>
   </w:style>
-  <w:style w:type="character" w:customStyle="1" w:styleId="Heading9Char">
-    <w:name w:val="Heading 9 Char"/>
-    <w:basedOn w:val="DefaultParagraphFont"/>
-    <w:link w:val="Heading9"/>
+  <w:style w:type="character" w:customStyle="1" w:styleId="Ttulo9Car">
+    <w:name w:val="Título 9 Car"/>
+    <w:basedOn w:val="Fuentedeprrafopredeter"/>
+    <w:link w:val="Ttulo9"/>
     <w:uiPriority w:val="9"/>
     <w:semiHidden/>
     <w:rsid w:val="002F1EE9"/>
@@ -1062,11 +3126,11 @@
       <w:color w:val="272727" w:themeColor="text1" w:themeTint="D8"/>
     </w:rPr>
   </w:style>
-  <w:style w:type="paragraph" w:styleId="Title">
+  <w:style w:type="paragraph" w:styleId="Ttulo">
     <w:name w:val="Title"/>
     <w:basedOn w:val="Normal"/>
     <w:next w:val="Normal"/>
-    <w:link w:val="TitleChar"/>
+    <w:link w:val="TtuloCar"/>
     <w:uiPriority w:val="10"/>
     <w:qFormat/>
     <w:rsid w:val="002F1EE9"/>
@@ -1082,10 +3146,10 @@
       <w:szCs w:val="56"/>
     </w:rPr>
   </w:style>
-  <w:style w:type="character" w:customStyle="1" w:styleId="TitleChar">
-    <w:name w:val="Title Char"/>
-    <w:basedOn w:val="DefaultParagraphFont"/>
-    <w:link w:val="Title"/>
+  <w:style w:type="character" w:customStyle="1" w:styleId="TtuloCar">
+    <w:name w:val="Título Car"/>
+    <w:basedOn w:val="Fuentedeprrafopredeter"/>
+    <w:link w:val="Ttulo"/>
     <w:uiPriority w:val="10"/>
     <w:rsid w:val="002F1EE9"/>
     <w:rPr>
@@ -1096,11 +3160,11 @@
       <w:szCs w:val="56"/>
     </w:rPr>
   </w:style>
-  <w:style w:type="paragraph" w:styleId="Subtitle">
+  <w:style w:type="paragraph" w:styleId="Subttulo">
     <w:name w:val="Subtitle"/>
     <w:basedOn w:val="Normal"/>
     <w:next w:val="Normal"/>
-    <w:link w:val="SubtitleChar"/>
+    <w:link w:val="SubttuloCar"/>
     <w:uiPriority w:val="11"/>
     <w:qFormat/>
     <w:rsid w:val="002F1EE9"/>
@@ -1117,10 +3181,10 @@
       <w:szCs w:val="28"/>
     </w:rPr>
   </w:style>
-  <w:style w:type="character" w:customStyle="1" w:styleId="SubtitleChar">
-    <w:name w:val="Subtitle Char"/>
-    <w:basedOn w:val="DefaultParagraphFont"/>
-    <w:link w:val="Subtitle"/>
+  <w:style w:type="character" w:customStyle="1" w:styleId="SubttuloCar">
+    <w:name w:val="Subtítulo Car"/>
+    <w:basedOn w:val="Fuentedeprrafopredeter"/>
+    <w:link w:val="Subttulo"/>
     <w:uiPriority w:val="11"/>
     <w:rsid w:val="002F1EE9"/>
     <w:rPr>
@@ -1131,11 +3195,11 @@
       <w:szCs w:val="28"/>
     </w:rPr>
   </w:style>
-  <w:style w:type="paragraph" w:styleId="Quote">
+  <w:style w:type="paragraph" w:styleId="Cita">
     <w:name w:val="Quote"/>
     <w:basedOn w:val="Normal"/>
     <w:next w:val="Normal"/>
-    <w:link w:val="QuoteChar"/>
+    <w:link w:val="CitaCar"/>
     <w:uiPriority w:val="29"/>
     <w:qFormat/>
     <w:rsid w:val="002F1EE9"/>
@@ -1149,10 +3213,10 @@
       <w:color w:val="404040" w:themeColor="text1" w:themeTint="BF"/>
     </w:rPr>
   </w:style>
-  <w:style w:type="character" w:customStyle="1" w:styleId="QuoteChar">
-    <w:name w:val="Quote Char"/>
-    <w:basedOn w:val="DefaultParagraphFont"/>
-    <w:link w:val="Quote"/>
+  <w:style w:type="character" w:customStyle="1" w:styleId="CitaCar">
+    <w:name w:val="Cita Car"/>
+    <w:basedOn w:val="Fuentedeprrafopredeter"/>
+    <w:link w:val="Cita"/>
     <w:uiPriority w:val="29"/>
     <w:rsid w:val="002F1EE9"/>
     <w:rPr>
@@ -1161,7 +3225,7 @@
       <w:color w:val="404040" w:themeColor="text1" w:themeTint="BF"/>
     </w:rPr>
   </w:style>
-  <w:style w:type="paragraph" w:styleId="ListParagraph">
+  <w:style w:type="paragraph" w:styleId="Prrafodelista">
     <w:name w:val="List Paragraph"/>
     <w:basedOn w:val="Normal"/>
     <w:uiPriority w:val="34"/>
@@ -1172,9 +3236,9 @@
       <w:contextualSpacing/>
     </w:pPr>
   </w:style>
-  <w:style w:type="character" w:styleId="IntenseEmphasis">
+  <w:style w:type="character" w:styleId="nfasisintenso">
     <w:name w:val="Intense Emphasis"/>
-    <w:basedOn w:val="DefaultParagraphFont"/>
+    <w:basedOn w:val="Fuentedeprrafopredeter"/>
     <w:uiPriority w:val="21"/>
     <w:qFormat/>
     <w:rsid w:val="002F1EE9"/>
@@ -1184,11 +3248,11 @@
       <w:color w:val="0F4761" w:themeColor="accent1" w:themeShade="BF"/>
     </w:rPr>
   </w:style>
-  <w:style w:type="paragraph" w:styleId="IntenseQuote">
+  <w:style w:type="paragraph" w:styleId="Citadestacada">
     <w:name w:val="Intense Quote"/>
     <w:basedOn w:val="Normal"/>
     <w:next w:val="Normal"/>
-    <w:link w:val="IntenseQuoteChar"/>
+    <w:link w:val="CitadestacadaCar"/>
     <w:uiPriority w:val="30"/>
     <w:qFormat/>
     <w:rsid w:val="002F1EE9"/>
@@ -1207,10 +3271,10 @@
       <w:color w:val="0F4761" w:themeColor="accent1" w:themeShade="BF"/>
     </w:rPr>
   </w:style>
-  <w:style w:type="character" w:customStyle="1" w:styleId="IntenseQuoteChar">
-    <w:name w:val="Intense Quote Char"/>
-    <w:basedOn w:val="DefaultParagraphFont"/>
-    <w:link w:val="IntenseQuote"/>
+  <w:style w:type="character" w:customStyle="1" w:styleId="CitadestacadaCar">
+    <w:name w:val="Cita destacada Car"/>
+    <w:basedOn w:val="Fuentedeprrafopredeter"/>
+    <w:link w:val="Citadestacada"/>
     <w:uiPriority w:val="30"/>
     <w:rsid w:val="002F1EE9"/>
     <w:rPr>
@@ -1219,9 +3283,9 @@
       <w:color w:val="0F4761" w:themeColor="accent1" w:themeShade="BF"/>
     </w:rPr>
   </w:style>
-  <w:style w:type="character" w:styleId="IntenseReference">
+  <w:style w:type="character" w:styleId="Referenciaintensa">
     <w:name w:val="Intense Reference"/>
-    <w:basedOn w:val="DefaultParagraphFont"/>
+    <w:basedOn w:val="Fuentedeprrafopredeter"/>
     <w:uiPriority w:val="32"/>
     <w:qFormat/>
     <w:rsid w:val="002F1EE9"/>
@@ -1233,10 +3297,10 @@
       <w:spacing w:val="5"/>
     </w:rPr>
   </w:style>
-  <w:style w:type="paragraph" w:styleId="Header">
+  <w:style w:type="paragraph" w:styleId="Encabezado">
     <w:name w:val="header"/>
     <w:basedOn w:val="Normal"/>
-    <w:link w:val="HeaderChar"/>
+    <w:link w:val="EncabezadoCar"/>
     <w:uiPriority w:val="99"/>
     <w:unhideWhenUsed/>
     <w:rsid w:val="00424255"/>
@@ -1248,17 +3312,17 @@
       <w:spacing w:after="0" w:line="240" w:lineRule="auto"/>
     </w:pPr>
   </w:style>
-  <w:style w:type="character" w:customStyle="1" w:styleId="HeaderChar">
-    <w:name w:val="Header Char"/>
-    <w:basedOn w:val="DefaultParagraphFont"/>
-    <w:link w:val="Header"/>
+  <w:style w:type="character" w:customStyle="1" w:styleId="EncabezadoCar">
+    <w:name w:val="Encabezado Car"/>
+    <w:basedOn w:val="Fuentedeprrafopredeter"/>
+    <w:link w:val="Encabezado"/>
     <w:uiPriority w:val="99"/>
     <w:rsid w:val="00424255"/>
   </w:style>
-  <w:style w:type="paragraph" w:styleId="Footer">
+  <w:style w:type="paragraph" w:styleId="Piedepgina">
     <w:name w:val="footer"/>
     <w:basedOn w:val="Normal"/>
-    <w:link w:val="FooterChar"/>
+    <w:link w:val="PiedepginaCar"/>
     <w:uiPriority w:val="99"/>
     <w:unhideWhenUsed/>
     <w:rsid w:val="00424255"/>
@@ -1270,12 +3334,53 @@
       <w:spacing w:after="0" w:line="240" w:lineRule="auto"/>
     </w:pPr>
   </w:style>
-  <w:style w:type="character" w:customStyle="1" w:styleId="FooterChar">
-    <w:name w:val="Footer Char"/>
-    <w:basedOn w:val="DefaultParagraphFont"/>
-    <w:link w:val="Footer"/>
+  <w:style w:type="character" w:customStyle="1" w:styleId="PiedepginaCar">
+    <w:name w:val="Pie de página Car"/>
+    <w:basedOn w:val="Fuentedeprrafopredeter"/>
+    <w:link w:val="Piedepgina"/>
     <w:uiPriority w:val="99"/>
     <w:rsid w:val="00424255"/>
+  </w:style>
+  <w:style w:type="paragraph" w:styleId="NormalWeb">
+    <w:name w:val="Normal (Web)"/>
+    <w:basedOn w:val="Normal"/>
+    <w:uiPriority w:val="99"/>
+    <w:semiHidden/>
+    <w:unhideWhenUsed/>
+    <w:rsid w:val="00D624E4"/>
+    <w:pPr>
+      <w:spacing w:before="100" w:beforeAutospacing="1" w:after="100" w:afterAutospacing="1" w:line="240" w:lineRule="auto"/>
+    </w:pPr>
+    <w:rPr>
+      <w:rFonts w:ascii="Times New Roman" w:eastAsia="Times New Roman" w:hAnsi="Times New Roman" w:cs="Times New Roman"/>
+      <w:kern w:val="0"/>
+      <w:lang w:eastAsia="es-MX"/>
+      <w14:ligatures w14:val="none"/>
+    </w:rPr>
+  </w:style>
+  <w:style w:type="paragraph" w:customStyle="1" w:styleId="paragraph">
+    <w:name w:val="paragraph"/>
+    <w:basedOn w:val="Normal"/>
+    <w:rsid w:val="004C1576"/>
+    <w:pPr>
+      <w:spacing w:before="100" w:beforeAutospacing="1" w:after="100" w:afterAutospacing="1" w:line="240" w:lineRule="auto"/>
+    </w:pPr>
+    <w:rPr>
+      <w:rFonts w:ascii="Times New Roman" w:eastAsia="Times New Roman" w:hAnsi="Times New Roman" w:cs="Times New Roman"/>
+      <w:kern w:val="0"/>
+      <w:lang w:eastAsia="es-MX"/>
+      <w14:ligatures w14:val="none"/>
+    </w:rPr>
+  </w:style>
+  <w:style w:type="character" w:customStyle="1" w:styleId="normaltextrun">
+    <w:name w:val="normaltextrun"/>
+    <w:basedOn w:val="Fuentedeprrafopredeter"/>
+    <w:rsid w:val="004C1576"/>
+  </w:style>
+  <w:style w:type="character" w:customStyle="1" w:styleId="eop">
+    <w:name w:val="eop"/>
+    <w:basedOn w:val="Fuentedeprrafopredeter"/>
+    <w:rsid w:val="004C1576"/>
   </w:style>
 </w:styles>
 </file>

</xml_diff>

<commit_message>
Punto 8c y 8f
Se resolvio en el word el punto 8c y 8f
</commit_message>
<xml_diff>
--- a/Caso Web Analytics .docx
+++ b/Caso Web Analytics .docx
@@ -12,6 +12,7 @@
           <w:rFonts w:ascii="Segoe UI" w:hAnsi="Segoe UI" w:cs="Segoe UI"/>
           <w:sz w:val="18"/>
           <w:szCs w:val="18"/>
+          <w:lang w:val="en-US"/>
         </w:rPr>
       </w:pPr>
       <w:r>
@@ -19,62 +20,9 @@
           <w:rStyle w:val="normaltextrun"/>
           <w:rFonts w:eastAsiaTheme="majorEastAsia"/>
           <w:color w:val="000000"/>
-        </w:rPr>
-        <w:t>Caso 1: Web </w:t>
-      </w:r>
-      <w:proofErr w:type="spellStart"/>
-      <w:r>
-        <w:rPr>
-          <w:rStyle w:val="normaltextrun"/>
-          <w:rFonts w:eastAsiaTheme="majorEastAsia"/>
-          <w:color w:val="000000"/>
-        </w:rPr>
-        <w:t>Analytics</w:t>
-      </w:r>
-      <w:proofErr w:type="spellEnd"/>
-      <w:r>
-        <w:rPr>
-          <w:rStyle w:val="normaltextrun"/>
-          <w:rFonts w:eastAsiaTheme="majorEastAsia"/>
-          <w:color w:val="000000"/>
-        </w:rPr>
-        <w:t> at </w:t>
-      </w:r>
-      <w:proofErr w:type="spellStart"/>
-      <w:r>
-        <w:rPr>
-          <w:rStyle w:val="normaltextrun"/>
-          <w:rFonts w:eastAsiaTheme="majorEastAsia"/>
-          <w:color w:val="000000"/>
-        </w:rPr>
-        <w:t>Quality</w:t>
-      </w:r>
-      <w:proofErr w:type="spellEnd"/>
-      <w:r>
-        <w:rPr>
-          <w:rStyle w:val="normaltextrun"/>
-          <w:rFonts w:eastAsiaTheme="majorEastAsia"/>
-          <w:color w:val="000000"/>
-        </w:rPr>
-        <w:t> </w:t>
-      </w:r>
-      <w:proofErr w:type="spellStart"/>
-      <w:r>
-        <w:rPr>
-          <w:rStyle w:val="normaltextrun"/>
-          <w:rFonts w:eastAsiaTheme="majorEastAsia"/>
-          <w:color w:val="000000"/>
-        </w:rPr>
-        <w:t>Alloys</w:t>
-      </w:r>
-      <w:proofErr w:type="spellEnd"/>
-      <w:r>
-        <w:rPr>
-          <w:rStyle w:val="normaltextrun"/>
-          <w:rFonts w:eastAsiaTheme="majorEastAsia"/>
-          <w:color w:val="000000"/>
-        </w:rPr>
-        <w:t>, Inc.</w:t>
+          <w:lang w:val="en-US"/>
+        </w:rPr>
+        <w:t>Caso 1: Web Analytics at Quality Alloys, Inc.</w:t>
       </w:r>
       <w:r>
         <w:rPr>
@@ -83,6 +31,7 @@
           <w:color w:val="000000"/>
           <w:bdr w:val="none" w:sz="0" w:space="0" w:color="auto" w:frame="1"/>
           <w:shd w:val="clear" w:color="auto" w:fill="C6C6C6"/>
+          <w:lang w:val="en-US"/>
         </w:rPr>
         <w:t> </w:t>
       </w:r>
@@ -97,6 +46,7 @@
           <w:rFonts w:ascii="Segoe UI" w:hAnsi="Segoe UI" w:cs="Segoe UI"/>
           <w:sz w:val="18"/>
           <w:szCs w:val="18"/>
+          <w:lang w:val="en-US"/>
         </w:rPr>
       </w:pPr>
       <w:r>
@@ -106,6 +56,7 @@
           <w:color w:val="000000"/>
           <w:bdr w:val="none" w:sz="0" w:space="0" w:color="auto" w:frame="1"/>
           <w:shd w:val="clear" w:color="auto" w:fill="C6C6C6"/>
+          <w:lang w:val="en-US"/>
         </w:rPr>
         <w:t> </w:t>
       </w:r>
@@ -1067,7 +1018,7 @@
     </w:p>
     <w:p>
       <w:pPr>
-        <w:pStyle w:val="Prrafodelista"/>
+        <w:pStyle w:val="ListParagraph"/>
         <w:numPr>
           <w:ilvl w:val="0"/>
           <w:numId w:val="2"/>
@@ -1206,7 +1157,7 @@
     </w:p>
     <w:p>
       <w:pPr>
-        <w:pStyle w:val="Prrafodelista"/>
+        <w:pStyle w:val="ListParagraph"/>
         <w:numPr>
           <w:ilvl w:val="0"/>
           <w:numId w:val="2"/>
@@ -7798,7 +7749,7 @@
     </w:p>
     <w:p>
       <w:pPr>
-        <w:pStyle w:val="Prrafodelista"/>
+        <w:pStyle w:val="ListParagraph"/>
         <w:numPr>
           <w:ilvl w:val="0"/>
           <w:numId w:val="2"/>
@@ -7818,7 +7769,7 @@
     </w:p>
     <w:p>
       <w:pPr>
-        <w:pStyle w:val="Prrafodelista"/>
+        <w:pStyle w:val="ListParagraph"/>
         <w:rPr>
           <w:rFonts w:ascii="Times New Roman" w:hAnsi="Times New Roman" w:cs="Times New Roman"/>
           <w:highlight w:val="yellow"/>
@@ -7827,7 +7778,7 @@
     </w:p>
     <w:p>
       <w:pPr>
-        <w:pStyle w:val="Prrafodelista"/>
+        <w:pStyle w:val="ListParagraph"/>
         <w:numPr>
           <w:ilvl w:val="0"/>
           <w:numId w:val="2"/>
@@ -7928,7 +7879,7 @@
     </w:p>
     <w:p>
       <w:pPr>
-        <w:pStyle w:val="Prrafodelista"/>
+        <w:pStyle w:val="ListParagraph"/>
         <w:numPr>
           <w:ilvl w:val="0"/>
           <w:numId w:val="2"/>
@@ -8117,7 +8068,7 @@
     </w:p>
     <w:p>
       <w:pPr>
-        <w:pStyle w:val="Prrafodelista"/>
+        <w:pStyle w:val="ListParagraph"/>
         <w:numPr>
           <w:ilvl w:val="0"/>
           <w:numId w:val="2"/>
@@ -8235,7 +8186,7 @@
     </w:p>
     <w:p>
       <w:pPr>
-        <w:pStyle w:val="Prrafodelista"/>
+        <w:pStyle w:val="ListParagraph"/>
         <w:numPr>
           <w:ilvl w:val="0"/>
           <w:numId w:val="2"/>
@@ -8393,15 +8344,7 @@
           <w:rFonts w:eastAsiaTheme="majorEastAsia"/>
           <w:lang w:val="es-ES"/>
         </w:rPr>
-        <w:t>P</w:t>
-      </w:r>
-      <w:r>
-        <w:rPr>
-          <w:rStyle w:val="normaltextrun"/>
-          <w:rFonts w:eastAsiaTheme="majorEastAsia"/>
-          <w:lang w:val="es-ES"/>
-        </w:rPr>
-        <w:t>or otro lado, la relación entre </w:t>
+        <w:t>Por otro lado, la relación entre </w:t>
       </w:r>
       <w:proofErr w:type="spellStart"/>
       <w:r>
@@ -8530,15 +8473,593 @@
     </w:p>
     <w:p>
       <w:pPr>
-        <w:rPr>
-          <w:rFonts w:ascii="Times New Roman" w:hAnsi="Times New Roman" w:cs="Times New Roman"/>
-        </w:rPr>
-      </w:pPr>
-    </w:p>
-    <w:p>
-      <w:pPr>
-        <w:rPr>
-          <w:rFonts w:ascii="Times New Roman" w:hAnsi="Times New Roman" w:cs="Times New Roman"/>
+        <w:pStyle w:val="paragraph"/>
+        <w:numPr>
+          <w:ilvl w:val="0"/>
+          <w:numId w:val="2"/>
+        </w:numPr>
+        <w:spacing w:before="0" w:beforeAutospacing="0" w:after="0" w:afterAutospacing="0" w:line="276" w:lineRule="auto"/>
+        <w:jc w:val="both"/>
+        <w:textAlignment w:val="baseline"/>
+        <w:rPr>
+          <w:rStyle w:val="normaltextrun"/>
+          <w:rFonts w:eastAsiaTheme="majorEastAsia"/>
+          <w:b/>
+          <w:bCs/>
+          <w:lang w:val="es-ES"/>
+        </w:rPr>
+      </w:pPr>
+      <w:proofErr w:type="spellStart"/>
+      <w:r>
+        <w:rPr>
+          <w:rStyle w:val="normaltextrun"/>
+          <w:rFonts w:eastAsiaTheme="majorEastAsia"/>
+          <w:b/>
+          <w:bCs/>
+          <w:lang w:val="es-ES"/>
+        </w:rPr>
+        <w:t>Modeling</w:t>
+      </w:r>
+      <w:proofErr w:type="spellEnd"/>
+      <w:r>
+        <w:rPr>
+          <w:rStyle w:val="normaltextrun"/>
+          <w:rFonts w:eastAsiaTheme="majorEastAsia"/>
+          <w:b/>
+          <w:bCs/>
+          <w:lang w:val="es-ES"/>
+        </w:rPr>
+        <w:t xml:space="preserve"> </w:t>
+      </w:r>
+      <w:proofErr w:type="spellStart"/>
+      <w:r>
+        <w:rPr>
+          <w:rStyle w:val="normaltextrun"/>
+          <w:rFonts w:eastAsiaTheme="majorEastAsia"/>
+          <w:b/>
+          <w:bCs/>
+          <w:lang w:val="es-ES"/>
+        </w:rPr>
+        <w:t>critical</w:t>
+      </w:r>
+      <w:proofErr w:type="spellEnd"/>
+      <w:r>
+        <w:rPr>
+          <w:rStyle w:val="normaltextrun"/>
+          <w:rFonts w:eastAsiaTheme="majorEastAsia"/>
+          <w:b/>
+          <w:bCs/>
+          <w:lang w:val="es-ES"/>
+        </w:rPr>
+        <w:t xml:space="preserve"> data </w:t>
+      </w:r>
+    </w:p>
+    <w:p>
+      <w:pPr>
+        <w:pStyle w:val="paragraph"/>
+        <w:spacing w:before="0" w:beforeAutospacing="0" w:after="0" w:afterAutospacing="0" w:line="276" w:lineRule="auto"/>
+        <w:jc w:val="both"/>
+        <w:textAlignment w:val="baseline"/>
+        <w:rPr>
+          <w:rStyle w:val="normaltextrun"/>
+          <w:rFonts w:eastAsiaTheme="majorEastAsia"/>
+          <w:lang w:val="es-ES"/>
+        </w:rPr>
+      </w:pPr>
+    </w:p>
+    <w:p>
+      <w:pPr>
+        <w:pStyle w:val="paragraph"/>
+        <w:spacing w:before="0" w:beforeAutospacing="0" w:after="0" w:afterAutospacing="0" w:line="276" w:lineRule="auto"/>
+        <w:jc w:val="both"/>
+        <w:textAlignment w:val="baseline"/>
+        <w:rPr>
+          <w:rStyle w:val="normaltextrun"/>
+          <w:rFonts w:eastAsiaTheme="majorEastAsia"/>
+          <w:lang w:val="es-ES"/>
+        </w:rPr>
+      </w:pPr>
+    </w:p>
+    <w:p>
+      <w:pPr>
+        <w:pStyle w:val="paragraph"/>
+        <w:spacing w:before="0" w:beforeAutospacing="0" w:after="0" w:afterAutospacing="0" w:line="276" w:lineRule="auto"/>
+        <w:jc w:val="both"/>
+        <w:textAlignment w:val="baseline"/>
+        <w:rPr>
+          <w:rStyle w:val="normaltextrun"/>
+          <w:rFonts w:eastAsiaTheme="majorEastAsia"/>
+          <w:lang w:val="es-ES"/>
+        </w:rPr>
+      </w:pPr>
+      <w:r>
+        <w:rPr>
+          <w:rStyle w:val="normaltextrun"/>
+          <w:rFonts w:eastAsiaTheme="majorEastAsia"/>
+          <w:lang w:val="es-ES"/>
+        </w:rPr>
+        <w:t xml:space="preserve">c) El histograma de las libras de material vendido tiene una forma </w:t>
+      </w:r>
+      <w:r>
+        <w:rPr>
+          <w:rStyle w:val="normaltextrun"/>
+          <w:rFonts w:eastAsiaTheme="majorEastAsia"/>
+          <w:lang w:val="es-ES"/>
+        </w:rPr>
+        <w:t>casi</w:t>
+      </w:r>
+      <w:r>
+        <w:rPr>
+          <w:rStyle w:val="normaltextrun"/>
+          <w:rFonts w:eastAsiaTheme="majorEastAsia"/>
+          <w:lang w:val="es-ES"/>
+        </w:rPr>
+        <w:t xml:space="preserve"> acampanada y simétrica, con la mayoría de l</w:t>
+      </w:r>
+      <w:r>
+        <w:rPr>
+          <w:rStyle w:val="normaltextrun"/>
+          <w:rFonts w:eastAsiaTheme="majorEastAsia"/>
+          <w:lang w:val="es-ES"/>
+        </w:rPr>
+        <w:t>os datos concentrados</w:t>
+      </w:r>
+      <w:r>
+        <w:rPr>
+          <w:rStyle w:val="normaltextrun"/>
+          <w:rFonts w:eastAsiaTheme="majorEastAsia"/>
+          <w:lang w:val="es-ES"/>
+        </w:rPr>
+        <w:t xml:space="preserve"> </w:t>
+      </w:r>
+      <w:r>
+        <w:rPr>
+          <w:rStyle w:val="normaltextrun"/>
+          <w:rFonts w:eastAsiaTheme="majorEastAsia"/>
+          <w:lang w:val="es-ES"/>
+        </w:rPr>
+        <w:t xml:space="preserve">cerca </w:t>
+      </w:r>
+      <w:r>
+        <w:rPr>
+          <w:rStyle w:val="normaltextrun"/>
+          <w:rFonts w:eastAsiaTheme="majorEastAsia"/>
+          <w:lang w:val="es-ES"/>
+        </w:rPr>
+        <w:t>del centro</w:t>
+      </w:r>
+      <w:r>
+        <w:rPr>
+          <w:rStyle w:val="normaltextrun"/>
+          <w:rFonts w:eastAsiaTheme="majorEastAsia"/>
+          <w:lang w:val="es-ES"/>
+        </w:rPr>
+        <w:t xml:space="preserve">, y muy cerca de </w:t>
+      </w:r>
+      <w:proofErr w:type="spellStart"/>
+      <w:r>
+        <w:rPr>
+          <w:rStyle w:val="normaltextrun"/>
+          <w:rFonts w:eastAsiaTheme="majorEastAsia"/>
+          <w:lang w:val="es-ES"/>
+        </w:rPr>
+        <w:t>la</w:t>
+      </w:r>
+      <w:proofErr w:type="spellEnd"/>
+      <w:r>
+        <w:rPr>
+          <w:rStyle w:val="normaltextrun"/>
+          <w:rFonts w:eastAsiaTheme="majorEastAsia"/>
+          <w:lang w:val="es-ES"/>
+        </w:rPr>
+        <w:t xml:space="preserve"> media de 17,342 libras. La distribución </w:t>
+      </w:r>
+      <w:r>
+        <w:rPr>
+          <w:rStyle w:val="normaltextrun"/>
+          <w:rFonts w:eastAsiaTheme="majorEastAsia"/>
+          <w:lang w:val="es-ES"/>
+        </w:rPr>
+        <w:t xml:space="preserve">tiene </w:t>
+      </w:r>
+      <w:r>
+        <w:rPr>
+          <w:rStyle w:val="normaltextrun"/>
+          <w:rFonts w:eastAsiaTheme="majorEastAsia"/>
+          <w:lang w:val="es-ES"/>
+        </w:rPr>
+        <w:t xml:space="preserve">un único pico y disminuye en ambos lados, lo cual es consistente con una distribución normal. No </w:t>
+      </w:r>
+      <w:r>
+        <w:rPr>
+          <w:rStyle w:val="normaltextrun"/>
+          <w:rFonts w:eastAsiaTheme="majorEastAsia"/>
+          <w:lang w:val="es-ES"/>
+        </w:rPr>
+        <w:t xml:space="preserve">parecen haber </w:t>
+      </w:r>
+      <w:r>
+        <w:rPr>
+          <w:rStyle w:val="normaltextrun"/>
+          <w:rFonts w:eastAsiaTheme="majorEastAsia"/>
+          <w:lang w:val="es-ES"/>
+        </w:rPr>
+        <w:t>valores</w:t>
+      </w:r>
+      <w:r>
+        <w:rPr>
+          <w:rStyle w:val="normaltextrun"/>
+          <w:rFonts w:eastAsiaTheme="majorEastAsia"/>
+          <w:lang w:val="es-ES"/>
+        </w:rPr>
+        <w:t xml:space="preserve"> </w:t>
+      </w:r>
+      <w:r>
+        <w:rPr>
+          <w:rStyle w:val="normaltextrun"/>
+          <w:rFonts w:eastAsiaTheme="majorEastAsia"/>
+          <w:lang w:val="es-ES"/>
+        </w:rPr>
+        <w:t xml:space="preserve">extremos, y la dispersión entre el mínimo </w:t>
+      </w:r>
+      <w:r>
+        <w:rPr>
+          <w:rStyle w:val="normaltextrun"/>
+          <w:rFonts w:eastAsiaTheme="majorEastAsia"/>
+          <w:lang w:val="es-ES"/>
+        </w:rPr>
+        <w:t xml:space="preserve">de </w:t>
+      </w:r>
+      <w:r>
+        <w:rPr>
+          <w:rStyle w:val="normaltextrun"/>
+          <w:rFonts w:eastAsiaTheme="majorEastAsia"/>
+          <w:lang w:val="es-ES"/>
+        </w:rPr>
+        <w:t xml:space="preserve">3,825 libras y el máximo </w:t>
+      </w:r>
+      <w:r>
+        <w:rPr>
+          <w:rStyle w:val="normaltextrun"/>
+          <w:rFonts w:eastAsiaTheme="majorEastAsia"/>
+          <w:lang w:val="es-ES"/>
+        </w:rPr>
+        <w:t xml:space="preserve">de </w:t>
+      </w:r>
+      <w:r>
+        <w:rPr>
+          <w:rStyle w:val="normaltextrun"/>
+          <w:rFonts w:eastAsiaTheme="majorEastAsia"/>
+          <w:lang w:val="es-ES"/>
+        </w:rPr>
+        <w:t>31,968 libras</w:t>
+      </w:r>
+      <w:r>
+        <w:rPr>
+          <w:rStyle w:val="normaltextrun"/>
+          <w:rFonts w:eastAsiaTheme="majorEastAsia"/>
+          <w:lang w:val="es-ES"/>
+        </w:rPr>
+        <w:t xml:space="preserve"> </w:t>
+      </w:r>
+      <w:r>
+        <w:rPr>
+          <w:rStyle w:val="normaltextrun"/>
+          <w:rFonts w:eastAsiaTheme="majorEastAsia"/>
+          <w:lang w:val="es-ES"/>
+        </w:rPr>
+        <w:t xml:space="preserve">está </w:t>
+      </w:r>
+      <w:r>
+        <w:rPr>
+          <w:rStyle w:val="normaltextrun"/>
+          <w:rFonts w:eastAsiaTheme="majorEastAsia"/>
+          <w:lang w:val="es-ES"/>
+        </w:rPr>
+        <w:t>balanceado</w:t>
+      </w:r>
+      <w:r>
+        <w:rPr>
+          <w:rStyle w:val="normaltextrun"/>
+          <w:rFonts w:eastAsiaTheme="majorEastAsia"/>
+          <w:lang w:val="es-ES"/>
+        </w:rPr>
+        <w:t xml:space="preserve"> alrededor de la media.</w:t>
+      </w:r>
+    </w:p>
+    <w:p>
+      <w:pPr>
+        <w:pStyle w:val="paragraph"/>
+        <w:spacing w:before="0" w:beforeAutospacing="0" w:after="0" w:afterAutospacing="0" w:line="276" w:lineRule="auto"/>
+        <w:jc w:val="both"/>
+        <w:textAlignment w:val="baseline"/>
+        <w:rPr>
+          <w:rStyle w:val="normaltextrun"/>
+          <w:rFonts w:eastAsiaTheme="majorEastAsia"/>
+          <w:lang w:val="es-ES"/>
+        </w:rPr>
+      </w:pPr>
+    </w:p>
+    <w:p>
+      <w:pPr>
+        <w:pStyle w:val="paragraph"/>
+        <w:spacing w:before="0" w:beforeAutospacing="0" w:after="0" w:afterAutospacing="0" w:line="276" w:lineRule="auto"/>
+        <w:jc w:val="both"/>
+        <w:textAlignment w:val="baseline"/>
+        <w:rPr>
+          <w:rStyle w:val="normaltextrun"/>
+          <w:rFonts w:eastAsiaTheme="majorEastAsia"/>
+          <w:lang w:val="es-ES"/>
+        </w:rPr>
+      </w:pPr>
+      <w:r>
+        <w:rPr>
+          <w:rStyle w:val="normaltextrun"/>
+          <w:rFonts w:eastAsiaTheme="majorEastAsia"/>
+          <w:lang w:val="es-ES"/>
+        </w:rPr>
+        <w:t xml:space="preserve">f) Los datos </w:t>
+      </w:r>
+      <w:r>
+        <w:rPr>
+          <w:rStyle w:val="normaltextrun"/>
+          <w:rFonts w:eastAsiaTheme="majorEastAsia"/>
+          <w:lang w:val="es-ES"/>
+        </w:rPr>
+        <w:t xml:space="preserve">obtenidos en los anteriores puntos </w:t>
+      </w:r>
+      <w:r>
+        <w:rPr>
+          <w:rStyle w:val="normaltextrun"/>
+          <w:rFonts w:eastAsiaTheme="majorEastAsia"/>
+          <w:lang w:val="es-ES"/>
+        </w:rPr>
+        <w:t>de</w:t>
+      </w:r>
+      <w:r>
+        <w:rPr>
+          <w:rStyle w:val="normaltextrun"/>
+          <w:rFonts w:eastAsiaTheme="majorEastAsia"/>
+          <w:lang w:val="es-ES"/>
+        </w:rPr>
+        <w:t xml:space="preserve"> las</w:t>
+      </w:r>
+      <w:r>
+        <w:rPr>
+          <w:rStyle w:val="normaltextrun"/>
+          <w:rFonts w:eastAsiaTheme="majorEastAsia"/>
+          <w:lang w:val="es-ES"/>
+        </w:rPr>
+        <w:t xml:space="preserve"> libras de material vendido </w:t>
+      </w:r>
+      <w:r>
+        <w:rPr>
+          <w:rStyle w:val="normaltextrun"/>
+          <w:rFonts w:eastAsiaTheme="majorEastAsia"/>
+          <w:lang w:val="es-ES"/>
+        </w:rPr>
+        <w:t>sugieren que</w:t>
+      </w:r>
+      <w:r>
+        <w:rPr>
+          <w:rStyle w:val="normaltextrun"/>
+          <w:rFonts w:eastAsiaTheme="majorEastAsia"/>
+          <w:lang w:val="es-ES"/>
+        </w:rPr>
+        <w:t xml:space="preserve"> la</w:t>
+      </w:r>
+      <w:r>
+        <w:rPr>
+          <w:rStyle w:val="normaltextrun"/>
+          <w:rFonts w:eastAsiaTheme="majorEastAsia"/>
+          <w:lang w:val="es-ES"/>
+        </w:rPr>
+        <w:t xml:space="preserve"> información sigue una </w:t>
+      </w:r>
+      <w:r>
+        <w:rPr>
+          <w:rStyle w:val="normaltextrun"/>
+          <w:rFonts w:eastAsiaTheme="majorEastAsia"/>
+          <w:lang w:val="es-ES"/>
+        </w:rPr>
+        <w:t xml:space="preserve">distribución normal. La media </w:t>
+      </w:r>
+      <w:r>
+        <w:rPr>
+          <w:rStyle w:val="normaltextrun"/>
+          <w:rFonts w:eastAsiaTheme="majorEastAsia"/>
+          <w:lang w:val="es-ES"/>
+        </w:rPr>
+        <w:t xml:space="preserve">es de </w:t>
+      </w:r>
+      <w:r>
+        <w:rPr>
+          <w:rStyle w:val="normaltextrun"/>
+          <w:rFonts w:eastAsiaTheme="majorEastAsia"/>
+          <w:lang w:val="es-ES"/>
+        </w:rPr>
+        <w:t>17,342</w:t>
+      </w:r>
+      <w:r>
+        <w:rPr>
+          <w:rStyle w:val="normaltextrun"/>
+          <w:rFonts w:eastAsiaTheme="majorEastAsia"/>
+          <w:lang w:val="es-ES"/>
+        </w:rPr>
+        <w:t xml:space="preserve"> </w:t>
+      </w:r>
+      <w:r>
+        <w:rPr>
+          <w:rStyle w:val="normaltextrun"/>
+          <w:rFonts w:eastAsiaTheme="majorEastAsia"/>
+          <w:lang w:val="es-ES"/>
+        </w:rPr>
+        <w:t xml:space="preserve">y la mediana </w:t>
+      </w:r>
+      <w:r>
+        <w:rPr>
+          <w:rStyle w:val="normaltextrun"/>
+          <w:rFonts w:eastAsiaTheme="majorEastAsia"/>
+          <w:lang w:val="es-ES"/>
+        </w:rPr>
+        <w:t xml:space="preserve">de </w:t>
+      </w:r>
+      <w:r>
+        <w:rPr>
+          <w:rStyle w:val="normaltextrun"/>
+          <w:rFonts w:eastAsiaTheme="majorEastAsia"/>
+          <w:lang w:val="es-ES"/>
+        </w:rPr>
+        <w:t>17,215</w:t>
+      </w:r>
+      <w:r>
+        <w:rPr>
+          <w:rStyle w:val="normaltextrun"/>
+          <w:rFonts w:eastAsiaTheme="majorEastAsia"/>
+          <w:lang w:val="es-ES"/>
+        </w:rPr>
+        <w:t xml:space="preserve"> </w:t>
+      </w:r>
+      <w:r>
+        <w:rPr>
+          <w:rStyle w:val="normaltextrun"/>
+          <w:rFonts w:eastAsiaTheme="majorEastAsia"/>
+          <w:lang w:val="es-ES"/>
+        </w:rPr>
+        <w:t xml:space="preserve">son muy cercanas, lo que </w:t>
+      </w:r>
+      <w:r>
+        <w:rPr>
+          <w:rStyle w:val="normaltextrun"/>
+          <w:rFonts w:eastAsiaTheme="majorEastAsia"/>
+          <w:lang w:val="es-ES"/>
+        </w:rPr>
+        <w:t>muestra que los datos son casi simétricos</w:t>
+      </w:r>
+      <w:r>
+        <w:rPr>
+          <w:rStyle w:val="normaltextrun"/>
+          <w:rFonts w:eastAsiaTheme="majorEastAsia"/>
+          <w:lang w:val="es-ES"/>
+        </w:rPr>
+        <w:t xml:space="preserve">. El análisis </w:t>
+      </w:r>
+      <w:r>
+        <w:rPr>
+          <w:rStyle w:val="normaltextrun"/>
+          <w:rFonts w:eastAsiaTheme="majorEastAsia"/>
+          <w:lang w:val="es-ES"/>
+        </w:rPr>
+        <w:t xml:space="preserve">que se hizo </w:t>
+      </w:r>
+      <w:r>
+        <w:rPr>
+          <w:rStyle w:val="normaltextrun"/>
+          <w:rFonts w:eastAsiaTheme="majorEastAsia"/>
+          <w:lang w:val="es-ES"/>
+        </w:rPr>
+        <w:t xml:space="preserve">de Regla Empírica </w:t>
+      </w:r>
+      <w:r>
+        <w:rPr>
+          <w:rStyle w:val="normaltextrun"/>
+          <w:rFonts w:eastAsiaTheme="majorEastAsia"/>
+          <w:lang w:val="es-ES"/>
+        </w:rPr>
+        <w:t>también</w:t>
+      </w:r>
+      <w:r>
+        <w:rPr>
+          <w:rStyle w:val="normaltextrun"/>
+          <w:rFonts w:eastAsiaTheme="majorEastAsia"/>
+          <w:lang w:val="es-ES"/>
+        </w:rPr>
+        <w:t xml:space="preserve"> </w:t>
+      </w:r>
+      <w:r>
+        <w:rPr>
+          <w:rStyle w:val="normaltextrun"/>
+          <w:rFonts w:eastAsiaTheme="majorEastAsia"/>
+          <w:lang w:val="es-ES"/>
+        </w:rPr>
+        <w:t>sugiere una distribución normal debido a que</w:t>
+      </w:r>
+      <w:r>
+        <w:rPr>
+          <w:rStyle w:val="normaltextrun"/>
+          <w:rFonts w:eastAsiaTheme="majorEastAsia"/>
+          <w:lang w:val="es-ES"/>
+        </w:rPr>
+        <w:t xml:space="preserve"> las observaciones reales dentro de 1, 2 y 3 desviaciones estándar (45, 63 y 66) son casi idénticas a los valores teóricos (44.88, 62.70 y 65.34). Adicionalmente, el valor de asimetría</w:t>
+      </w:r>
+      <w:r>
+        <w:rPr>
+          <w:rStyle w:val="normaltextrun"/>
+          <w:rFonts w:eastAsiaTheme="majorEastAsia"/>
+          <w:lang w:val="es-ES"/>
+        </w:rPr>
+        <w:t xml:space="preserve"> obtenido fue</w:t>
+      </w:r>
+      <w:r>
+        <w:rPr>
+          <w:rStyle w:val="normaltextrun"/>
+          <w:rFonts w:eastAsiaTheme="majorEastAsia"/>
+          <w:lang w:val="es-ES"/>
+        </w:rPr>
+        <w:t xml:space="preserve"> de 0.317</w:t>
+      </w:r>
+      <w:r>
+        <w:rPr>
+          <w:rStyle w:val="normaltextrun"/>
+          <w:rFonts w:eastAsiaTheme="majorEastAsia"/>
+          <w:lang w:val="es-ES"/>
+        </w:rPr>
+        <w:t xml:space="preserve">, lo cual es </w:t>
+      </w:r>
+      <w:r>
+        <w:rPr>
+          <w:rStyle w:val="normaltextrun"/>
+          <w:rFonts w:eastAsiaTheme="majorEastAsia"/>
+          <w:lang w:val="es-ES"/>
+        </w:rPr>
+        <w:t xml:space="preserve">cercano a cero, </w:t>
+      </w:r>
+      <w:r>
+        <w:rPr>
+          <w:rStyle w:val="normaltextrun"/>
+          <w:rFonts w:eastAsiaTheme="majorEastAsia"/>
+          <w:lang w:val="es-ES"/>
+        </w:rPr>
+        <w:lastRenderedPageBreak/>
+        <w:t>indicando una leve asimetría positiva, y la curtosis de 2.695 es cercana al valor de referencia de una distribución normal</w:t>
+      </w:r>
+      <w:r>
+        <w:rPr>
+          <w:rStyle w:val="normaltextrun"/>
+          <w:rFonts w:eastAsiaTheme="majorEastAsia"/>
+          <w:lang w:val="es-ES"/>
+        </w:rPr>
+        <w:t xml:space="preserve"> (</w:t>
+      </w:r>
+      <w:r>
+        <w:rPr>
+          <w:rStyle w:val="normaltextrun"/>
+          <w:rFonts w:eastAsiaTheme="majorEastAsia"/>
+          <w:lang w:val="es-ES"/>
+        </w:rPr>
+        <w:t xml:space="preserve">3). </w:t>
+      </w:r>
+    </w:p>
+    <w:p>
+      <w:pPr>
+        <w:pStyle w:val="paragraph"/>
+        <w:spacing w:before="0" w:beforeAutospacing="0" w:after="0" w:afterAutospacing="0" w:line="276" w:lineRule="auto"/>
+        <w:jc w:val="both"/>
+        <w:textAlignment w:val="baseline"/>
+        <w:rPr>
+          <w:rStyle w:val="normaltextrun"/>
+          <w:rFonts w:eastAsiaTheme="majorEastAsia"/>
+          <w:lang w:val="es-ES"/>
         </w:rPr>
       </w:pPr>
     </w:p>
@@ -9192,11 +9713,11 @@
     <w:name w:val="Normal"/>
     <w:qFormat/>
   </w:style>
-  <w:style w:type="paragraph" w:styleId="Ttulo1">
+  <w:style w:type="paragraph" w:styleId="Heading1">
     <w:name w:val="heading 1"/>
     <w:basedOn w:val="Normal"/>
     <w:next w:val="Normal"/>
-    <w:link w:val="Ttulo1Car"/>
+    <w:link w:val="Heading1Char"/>
     <w:uiPriority w:val="9"/>
     <w:qFormat/>
     <w:rsid w:val="002F1EE9"/>
@@ -9213,11 +9734,11 @@
       <w:szCs w:val="40"/>
     </w:rPr>
   </w:style>
-  <w:style w:type="paragraph" w:styleId="Ttulo2">
+  <w:style w:type="paragraph" w:styleId="Heading2">
     <w:name w:val="heading 2"/>
     <w:basedOn w:val="Normal"/>
     <w:next w:val="Normal"/>
-    <w:link w:val="Ttulo2Car"/>
+    <w:link w:val="Heading2Char"/>
     <w:uiPriority w:val="9"/>
     <w:semiHidden/>
     <w:unhideWhenUsed/>
@@ -9236,11 +9757,11 @@
       <w:szCs w:val="32"/>
     </w:rPr>
   </w:style>
-  <w:style w:type="paragraph" w:styleId="Ttulo3">
+  <w:style w:type="paragraph" w:styleId="Heading3">
     <w:name w:val="heading 3"/>
     <w:basedOn w:val="Normal"/>
     <w:next w:val="Normal"/>
-    <w:link w:val="Ttulo3Car"/>
+    <w:link w:val="Heading3Char"/>
     <w:uiPriority w:val="9"/>
     <w:semiHidden/>
     <w:unhideWhenUsed/>
@@ -9259,11 +9780,11 @@
       <w:szCs w:val="28"/>
     </w:rPr>
   </w:style>
-  <w:style w:type="paragraph" w:styleId="Ttulo4">
+  <w:style w:type="paragraph" w:styleId="Heading4">
     <w:name w:val="heading 4"/>
     <w:basedOn w:val="Normal"/>
     <w:next w:val="Normal"/>
-    <w:link w:val="Ttulo4Car"/>
+    <w:link w:val="Heading4Char"/>
     <w:uiPriority w:val="9"/>
     <w:semiHidden/>
     <w:unhideWhenUsed/>
@@ -9282,11 +9803,11 @@
       <w:color w:val="0F4761" w:themeColor="accent1" w:themeShade="BF"/>
     </w:rPr>
   </w:style>
-  <w:style w:type="paragraph" w:styleId="Ttulo5">
+  <w:style w:type="paragraph" w:styleId="Heading5">
     <w:name w:val="heading 5"/>
     <w:basedOn w:val="Normal"/>
     <w:next w:val="Normal"/>
-    <w:link w:val="Ttulo5Car"/>
+    <w:link w:val="Heading5Char"/>
     <w:uiPriority w:val="9"/>
     <w:semiHidden/>
     <w:unhideWhenUsed/>
@@ -9303,11 +9824,11 @@
       <w:color w:val="0F4761" w:themeColor="accent1" w:themeShade="BF"/>
     </w:rPr>
   </w:style>
-  <w:style w:type="paragraph" w:styleId="Ttulo6">
+  <w:style w:type="paragraph" w:styleId="Heading6">
     <w:name w:val="heading 6"/>
     <w:basedOn w:val="Normal"/>
     <w:next w:val="Normal"/>
-    <w:link w:val="Ttulo6Car"/>
+    <w:link w:val="Heading6Char"/>
     <w:uiPriority w:val="9"/>
     <w:semiHidden/>
     <w:unhideWhenUsed/>
@@ -9326,11 +9847,11 @@
       <w:color w:val="595959" w:themeColor="text1" w:themeTint="A6"/>
     </w:rPr>
   </w:style>
-  <w:style w:type="paragraph" w:styleId="Ttulo7">
+  <w:style w:type="paragraph" w:styleId="Heading7">
     <w:name w:val="heading 7"/>
     <w:basedOn w:val="Normal"/>
     <w:next w:val="Normal"/>
-    <w:link w:val="Ttulo7Car"/>
+    <w:link w:val="Heading7Char"/>
     <w:uiPriority w:val="9"/>
     <w:semiHidden/>
     <w:unhideWhenUsed/>
@@ -9347,11 +9868,11 @@
       <w:color w:val="595959" w:themeColor="text1" w:themeTint="A6"/>
     </w:rPr>
   </w:style>
-  <w:style w:type="paragraph" w:styleId="Ttulo8">
+  <w:style w:type="paragraph" w:styleId="Heading8">
     <w:name w:val="heading 8"/>
     <w:basedOn w:val="Normal"/>
     <w:next w:val="Normal"/>
-    <w:link w:val="Ttulo8Car"/>
+    <w:link w:val="Heading8Char"/>
     <w:uiPriority w:val="9"/>
     <w:semiHidden/>
     <w:unhideWhenUsed/>
@@ -9370,11 +9891,11 @@
       <w:color w:val="272727" w:themeColor="text1" w:themeTint="D8"/>
     </w:rPr>
   </w:style>
-  <w:style w:type="paragraph" w:styleId="Ttulo9">
+  <w:style w:type="paragraph" w:styleId="Heading9">
     <w:name w:val="heading 9"/>
     <w:basedOn w:val="Normal"/>
     <w:next w:val="Normal"/>
-    <w:link w:val="Ttulo9Car"/>
+    <w:link w:val="Heading9Char"/>
     <w:uiPriority w:val="9"/>
     <w:semiHidden/>
     <w:unhideWhenUsed/>
@@ -9391,13 +9912,13 @@
       <w:color w:val="272727" w:themeColor="text1" w:themeTint="D8"/>
     </w:rPr>
   </w:style>
-  <w:style w:type="character" w:default="1" w:styleId="Fuentedeprrafopredeter">
+  <w:style w:type="character" w:default="1" w:styleId="DefaultParagraphFont">
     <w:name w:val="Default Paragraph Font"/>
     <w:uiPriority w:val="1"/>
     <w:semiHidden/>
     <w:unhideWhenUsed/>
   </w:style>
-  <w:style w:type="table" w:default="1" w:styleId="Tablanormal">
+  <w:style w:type="table" w:default="1" w:styleId="TableNormal">
     <w:name w:val="Normal Table"/>
     <w:uiPriority w:val="99"/>
     <w:semiHidden/>
@@ -9412,16 +9933,16 @@
       </w:tblCellMar>
     </w:tblPr>
   </w:style>
-  <w:style w:type="numbering" w:default="1" w:styleId="Sinlista">
+  <w:style w:type="numbering" w:default="1" w:styleId="NoList">
     <w:name w:val="No List"/>
     <w:uiPriority w:val="99"/>
     <w:semiHidden/>
     <w:unhideWhenUsed/>
   </w:style>
-  <w:style w:type="character" w:customStyle="1" w:styleId="Ttulo1Car">
-    <w:name w:val="Título 1 Car"/>
-    <w:basedOn w:val="Fuentedeprrafopredeter"/>
-    <w:link w:val="Ttulo1"/>
+  <w:style w:type="character" w:customStyle="1" w:styleId="Heading1Char">
+    <w:name w:val="Heading 1 Char"/>
+    <w:basedOn w:val="DefaultParagraphFont"/>
+    <w:link w:val="Heading1"/>
     <w:uiPriority w:val="9"/>
     <w:rsid w:val="002F1EE9"/>
     <w:rPr>
@@ -9431,10 +9952,10 @@
       <w:szCs w:val="40"/>
     </w:rPr>
   </w:style>
-  <w:style w:type="character" w:customStyle="1" w:styleId="Ttulo2Car">
-    <w:name w:val="Título 2 Car"/>
-    <w:basedOn w:val="Fuentedeprrafopredeter"/>
-    <w:link w:val="Ttulo2"/>
+  <w:style w:type="character" w:customStyle="1" w:styleId="Heading2Char">
+    <w:name w:val="Heading 2 Char"/>
+    <w:basedOn w:val="DefaultParagraphFont"/>
+    <w:link w:val="Heading2"/>
     <w:uiPriority w:val="9"/>
     <w:semiHidden/>
     <w:rsid w:val="002F1EE9"/>
@@ -9445,10 +9966,10 @@
       <w:szCs w:val="32"/>
     </w:rPr>
   </w:style>
-  <w:style w:type="character" w:customStyle="1" w:styleId="Ttulo3Car">
-    <w:name w:val="Título 3 Car"/>
-    <w:basedOn w:val="Fuentedeprrafopredeter"/>
-    <w:link w:val="Ttulo3"/>
+  <w:style w:type="character" w:customStyle="1" w:styleId="Heading3Char">
+    <w:name w:val="Heading 3 Char"/>
+    <w:basedOn w:val="DefaultParagraphFont"/>
+    <w:link w:val="Heading3"/>
     <w:uiPriority w:val="9"/>
     <w:semiHidden/>
     <w:rsid w:val="002F1EE9"/>
@@ -9459,10 +9980,10 @@
       <w:szCs w:val="28"/>
     </w:rPr>
   </w:style>
-  <w:style w:type="character" w:customStyle="1" w:styleId="Ttulo4Car">
-    <w:name w:val="Título 4 Car"/>
-    <w:basedOn w:val="Fuentedeprrafopredeter"/>
-    <w:link w:val="Ttulo4"/>
+  <w:style w:type="character" w:customStyle="1" w:styleId="Heading4Char">
+    <w:name w:val="Heading 4 Char"/>
+    <w:basedOn w:val="DefaultParagraphFont"/>
+    <w:link w:val="Heading4"/>
     <w:uiPriority w:val="9"/>
     <w:semiHidden/>
     <w:rsid w:val="002F1EE9"/>
@@ -9473,10 +9994,10 @@
       <w:color w:val="0F4761" w:themeColor="accent1" w:themeShade="BF"/>
     </w:rPr>
   </w:style>
-  <w:style w:type="character" w:customStyle="1" w:styleId="Ttulo5Car">
-    <w:name w:val="Título 5 Car"/>
-    <w:basedOn w:val="Fuentedeprrafopredeter"/>
-    <w:link w:val="Ttulo5"/>
+  <w:style w:type="character" w:customStyle="1" w:styleId="Heading5Char">
+    <w:name w:val="Heading 5 Char"/>
+    <w:basedOn w:val="DefaultParagraphFont"/>
+    <w:link w:val="Heading5"/>
     <w:uiPriority w:val="9"/>
     <w:semiHidden/>
     <w:rsid w:val="002F1EE9"/>
@@ -9485,10 +10006,10 @@
       <w:color w:val="0F4761" w:themeColor="accent1" w:themeShade="BF"/>
     </w:rPr>
   </w:style>
-  <w:style w:type="character" w:customStyle="1" w:styleId="Ttulo6Car">
-    <w:name w:val="Título 6 Car"/>
-    <w:basedOn w:val="Fuentedeprrafopredeter"/>
-    <w:link w:val="Ttulo6"/>
+  <w:style w:type="character" w:customStyle="1" w:styleId="Heading6Char">
+    <w:name w:val="Heading 6 Char"/>
+    <w:basedOn w:val="DefaultParagraphFont"/>
+    <w:link w:val="Heading6"/>
     <w:uiPriority w:val="9"/>
     <w:semiHidden/>
     <w:rsid w:val="002F1EE9"/>
@@ -9499,10 +10020,10 @@
       <w:color w:val="595959" w:themeColor="text1" w:themeTint="A6"/>
     </w:rPr>
   </w:style>
-  <w:style w:type="character" w:customStyle="1" w:styleId="Ttulo7Car">
-    <w:name w:val="Título 7 Car"/>
-    <w:basedOn w:val="Fuentedeprrafopredeter"/>
-    <w:link w:val="Ttulo7"/>
+  <w:style w:type="character" w:customStyle="1" w:styleId="Heading7Char">
+    <w:name w:val="Heading 7 Char"/>
+    <w:basedOn w:val="DefaultParagraphFont"/>
+    <w:link w:val="Heading7"/>
     <w:uiPriority w:val="9"/>
     <w:semiHidden/>
     <w:rsid w:val="002F1EE9"/>
@@ -9511,10 +10032,10 @@
       <w:color w:val="595959" w:themeColor="text1" w:themeTint="A6"/>
     </w:rPr>
   </w:style>
-  <w:style w:type="character" w:customStyle="1" w:styleId="Ttulo8Car">
-    <w:name w:val="Título 8 Car"/>
-    <w:basedOn w:val="Fuentedeprrafopredeter"/>
-    <w:link w:val="Ttulo8"/>
+  <w:style w:type="character" w:customStyle="1" w:styleId="Heading8Char">
+    <w:name w:val="Heading 8 Char"/>
+    <w:basedOn w:val="DefaultParagraphFont"/>
+    <w:link w:val="Heading8"/>
     <w:uiPriority w:val="9"/>
     <w:semiHidden/>
     <w:rsid w:val="002F1EE9"/>
@@ -9525,10 +10046,10 @@
       <w:color w:val="272727" w:themeColor="text1" w:themeTint="D8"/>
     </w:rPr>
   </w:style>
-  <w:style w:type="character" w:customStyle="1" w:styleId="Ttulo9Car">
-    <w:name w:val="Título 9 Car"/>
-    <w:basedOn w:val="Fuentedeprrafopredeter"/>
-    <w:link w:val="Ttulo9"/>
+  <w:style w:type="character" w:customStyle="1" w:styleId="Heading9Char">
+    <w:name w:val="Heading 9 Char"/>
+    <w:basedOn w:val="DefaultParagraphFont"/>
+    <w:link w:val="Heading9"/>
     <w:uiPriority w:val="9"/>
     <w:semiHidden/>
     <w:rsid w:val="002F1EE9"/>
@@ -9537,11 +10058,11 @@
       <w:color w:val="272727" w:themeColor="text1" w:themeTint="D8"/>
     </w:rPr>
   </w:style>
-  <w:style w:type="paragraph" w:styleId="Ttulo">
+  <w:style w:type="paragraph" w:styleId="Title">
     <w:name w:val="Title"/>
     <w:basedOn w:val="Normal"/>
     <w:next w:val="Normal"/>
-    <w:link w:val="TtuloCar"/>
+    <w:link w:val="TitleChar"/>
     <w:uiPriority w:val="10"/>
     <w:qFormat/>
     <w:rsid w:val="002F1EE9"/>
@@ -9557,10 +10078,10 @@
       <w:szCs w:val="56"/>
     </w:rPr>
   </w:style>
-  <w:style w:type="character" w:customStyle="1" w:styleId="TtuloCar">
-    <w:name w:val="Título Car"/>
-    <w:basedOn w:val="Fuentedeprrafopredeter"/>
-    <w:link w:val="Ttulo"/>
+  <w:style w:type="character" w:customStyle="1" w:styleId="TitleChar">
+    <w:name w:val="Title Char"/>
+    <w:basedOn w:val="DefaultParagraphFont"/>
+    <w:link w:val="Title"/>
     <w:uiPriority w:val="10"/>
     <w:rsid w:val="002F1EE9"/>
     <w:rPr>
@@ -9571,11 +10092,11 @@
       <w:szCs w:val="56"/>
     </w:rPr>
   </w:style>
-  <w:style w:type="paragraph" w:styleId="Subttulo">
+  <w:style w:type="paragraph" w:styleId="Subtitle">
     <w:name w:val="Subtitle"/>
     <w:basedOn w:val="Normal"/>
     <w:next w:val="Normal"/>
-    <w:link w:val="SubttuloCar"/>
+    <w:link w:val="SubtitleChar"/>
     <w:uiPriority w:val="11"/>
     <w:qFormat/>
     <w:rsid w:val="002F1EE9"/>
@@ -9592,10 +10113,10 @@
       <w:szCs w:val="28"/>
     </w:rPr>
   </w:style>
-  <w:style w:type="character" w:customStyle="1" w:styleId="SubttuloCar">
-    <w:name w:val="Subtítulo Car"/>
-    <w:basedOn w:val="Fuentedeprrafopredeter"/>
-    <w:link w:val="Subttulo"/>
+  <w:style w:type="character" w:customStyle="1" w:styleId="SubtitleChar">
+    <w:name w:val="Subtitle Char"/>
+    <w:basedOn w:val="DefaultParagraphFont"/>
+    <w:link w:val="Subtitle"/>
     <w:uiPriority w:val="11"/>
     <w:rsid w:val="002F1EE9"/>
     <w:rPr>
@@ -9606,11 +10127,11 @@
       <w:szCs w:val="28"/>
     </w:rPr>
   </w:style>
-  <w:style w:type="paragraph" w:styleId="Cita">
+  <w:style w:type="paragraph" w:styleId="Quote">
     <w:name w:val="Quote"/>
     <w:basedOn w:val="Normal"/>
     <w:next w:val="Normal"/>
-    <w:link w:val="CitaCar"/>
+    <w:link w:val="QuoteChar"/>
     <w:uiPriority w:val="29"/>
     <w:qFormat/>
     <w:rsid w:val="002F1EE9"/>
@@ -9624,10 +10145,10 @@
       <w:color w:val="404040" w:themeColor="text1" w:themeTint="BF"/>
     </w:rPr>
   </w:style>
-  <w:style w:type="character" w:customStyle="1" w:styleId="CitaCar">
-    <w:name w:val="Cita Car"/>
-    <w:basedOn w:val="Fuentedeprrafopredeter"/>
-    <w:link w:val="Cita"/>
+  <w:style w:type="character" w:customStyle="1" w:styleId="QuoteChar">
+    <w:name w:val="Quote Char"/>
+    <w:basedOn w:val="DefaultParagraphFont"/>
+    <w:link w:val="Quote"/>
     <w:uiPriority w:val="29"/>
     <w:rsid w:val="002F1EE9"/>
     <w:rPr>
@@ -9636,7 +10157,7 @@
       <w:color w:val="404040" w:themeColor="text1" w:themeTint="BF"/>
     </w:rPr>
   </w:style>
-  <w:style w:type="paragraph" w:styleId="Prrafodelista">
+  <w:style w:type="paragraph" w:styleId="ListParagraph">
     <w:name w:val="List Paragraph"/>
     <w:basedOn w:val="Normal"/>
     <w:uiPriority w:val="34"/>
@@ -9647,9 +10168,9 @@
       <w:contextualSpacing/>
     </w:pPr>
   </w:style>
-  <w:style w:type="character" w:styleId="nfasisintenso">
+  <w:style w:type="character" w:styleId="IntenseEmphasis">
     <w:name w:val="Intense Emphasis"/>
-    <w:basedOn w:val="Fuentedeprrafopredeter"/>
+    <w:basedOn w:val="DefaultParagraphFont"/>
     <w:uiPriority w:val="21"/>
     <w:qFormat/>
     <w:rsid w:val="002F1EE9"/>
@@ -9659,11 +10180,11 @@
       <w:color w:val="0F4761" w:themeColor="accent1" w:themeShade="BF"/>
     </w:rPr>
   </w:style>
-  <w:style w:type="paragraph" w:styleId="Citadestacada">
+  <w:style w:type="paragraph" w:styleId="IntenseQuote">
     <w:name w:val="Intense Quote"/>
     <w:basedOn w:val="Normal"/>
     <w:next w:val="Normal"/>
-    <w:link w:val="CitadestacadaCar"/>
+    <w:link w:val="IntenseQuoteChar"/>
     <w:uiPriority w:val="30"/>
     <w:qFormat/>
     <w:rsid w:val="002F1EE9"/>
@@ -9682,10 +10203,10 @@
       <w:color w:val="0F4761" w:themeColor="accent1" w:themeShade="BF"/>
     </w:rPr>
   </w:style>
-  <w:style w:type="character" w:customStyle="1" w:styleId="CitadestacadaCar">
-    <w:name w:val="Cita destacada Car"/>
-    <w:basedOn w:val="Fuentedeprrafopredeter"/>
-    <w:link w:val="Citadestacada"/>
+  <w:style w:type="character" w:customStyle="1" w:styleId="IntenseQuoteChar">
+    <w:name w:val="Intense Quote Char"/>
+    <w:basedOn w:val="DefaultParagraphFont"/>
+    <w:link w:val="IntenseQuote"/>
     <w:uiPriority w:val="30"/>
     <w:rsid w:val="002F1EE9"/>
     <w:rPr>
@@ -9694,9 +10215,9 @@
       <w:color w:val="0F4761" w:themeColor="accent1" w:themeShade="BF"/>
     </w:rPr>
   </w:style>
-  <w:style w:type="character" w:styleId="Referenciaintensa">
+  <w:style w:type="character" w:styleId="IntenseReference">
     <w:name w:val="Intense Reference"/>
-    <w:basedOn w:val="Fuentedeprrafopredeter"/>
+    <w:basedOn w:val="DefaultParagraphFont"/>
     <w:uiPriority w:val="32"/>
     <w:qFormat/>
     <w:rsid w:val="002F1EE9"/>
@@ -9708,10 +10229,10 @@
       <w:spacing w:val="5"/>
     </w:rPr>
   </w:style>
-  <w:style w:type="paragraph" w:styleId="Encabezado">
+  <w:style w:type="paragraph" w:styleId="Header">
     <w:name w:val="header"/>
     <w:basedOn w:val="Normal"/>
-    <w:link w:val="EncabezadoCar"/>
+    <w:link w:val="HeaderChar"/>
     <w:uiPriority w:val="99"/>
     <w:unhideWhenUsed/>
     <w:rsid w:val="00424255"/>
@@ -9723,17 +10244,17 @@
       <w:spacing w:after="0" w:line="240" w:lineRule="auto"/>
     </w:pPr>
   </w:style>
-  <w:style w:type="character" w:customStyle="1" w:styleId="EncabezadoCar">
-    <w:name w:val="Encabezado Car"/>
-    <w:basedOn w:val="Fuentedeprrafopredeter"/>
-    <w:link w:val="Encabezado"/>
+  <w:style w:type="character" w:customStyle="1" w:styleId="HeaderChar">
+    <w:name w:val="Header Char"/>
+    <w:basedOn w:val="DefaultParagraphFont"/>
+    <w:link w:val="Header"/>
     <w:uiPriority w:val="99"/>
     <w:rsid w:val="00424255"/>
   </w:style>
-  <w:style w:type="paragraph" w:styleId="Piedepgina">
+  <w:style w:type="paragraph" w:styleId="Footer">
     <w:name w:val="footer"/>
     <w:basedOn w:val="Normal"/>
-    <w:link w:val="PiedepginaCar"/>
+    <w:link w:val="FooterChar"/>
     <w:uiPriority w:val="99"/>
     <w:unhideWhenUsed/>
     <w:rsid w:val="00424255"/>
@@ -9745,10 +10266,10 @@
       <w:spacing w:after="0" w:line="240" w:lineRule="auto"/>
     </w:pPr>
   </w:style>
-  <w:style w:type="character" w:customStyle="1" w:styleId="PiedepginaCar">
-    <w:name w:val="Pie de página Car"/>
-    <w:basedOn w:val="Fuentedeprrafopredeter"/>
-    <w:link w:val="Piedepgina"/>
+  <w:style w:type="character" w:customStyle="1" w:styleId="FooterChar">
+    <w:name w:val="Footer Char"/>
+    <w:basedOn w:val="DefaultParagraphFont"/>
+    <w:link w:val="Footer"/>
     <w:uiPriority w:val="99"/>
     <w:rsid w:val="00424255"/>
   </w:style>
@@ -9785,18 +10306,43 @@
   </w:style>
   <w:style w:type="character" w:customStyle="1" w:styleId="normaltextrun">
     <w:name w:val="normaltextrun"/>
-    <w:basedOn w:val="Fuentedeprrafopredeter"/>
+    <w:basedOn w:val="DefaultParagraphFont"/>
     <w:rsid w:val="004C1576"/>
   </w:style>
   <w:style w:type="character" w:customStyle="1" w:styleId="eop">
     <w:name w:val="eop"/>
-    <w:basedOn w:val="Fuentedeprrafopredeter"/>
+    <w:basedOn w:val="DefaultParagraphFont"/>
     <w:rsid w:val="004C1576"/>
   </w:style>
   <w:style w:type="character" w:customStyle="1" w:styleId="wacimagecontainer">
     <w:name w:val="wacimagecontainer"/>
-    <w:basedOn w:val="Fuentedeprrafopredeter"/>
+    <w:basedOn w:val="DefaultParagraphFont"/>
     <w:rsid w:val="000F57F4"/>
+  </w:style>
+  <w:style w:type="paragraph" w:customStyle="1" w:styleId="font-claude-response-body">
+    <w:name w:val="font-claude-response-body"/>
+    <w:basedOn w:val="Normal"/>
+    <w:rsid w:val="00ED3FFB"/>
+    <w:pPr>
+      <w:spacing w:before="100" w:beforeAutospacing="1" w:after="100" w:afterAutospacing="1" w:line="240" w:lineRule="auto"/>
+    </w:pPr>
+    <w:rPr>
+      <w:rFonts w:ascii="Times New Roman" w:eastAsia="Times New Roman" w:hAnsi="Times New Roman" w:cs="Times New Roman"/>
+      <w:kern w:val="0"/>
+      <w:lang w:val="en-CO"/>
+      <w14:ligatures w14:val="none"/>
+    </w:rPr>
+  </w:style>
+  <w:style w:type="character" w:styleId="Strong">
+    <w:name w:val="Strong"/>
+    <w:basedOn w:val="DefaultParagraphFont"/>
+    <w:uiPriority w:val="22"/>
+    <w:qFormat/>
+    <w:rsid w:val="00ED3FFB"/>
+    <w:rPr>
+      <w:b/>
+      <w:bCs/>
+    </w:rPr>
   </w:style>
 </w:styles>
 </file>

</xml_diff>

<commit_message>
Tablas y graficos punto 3
Agregue las tablas y graficos del punto 3 al word
</commit_message>
<xml_diff>
--- a/Caso Web Analytics .docx
+++ b/Caso Web Analytics .docx
@@ -1018,7 +1018,7 @@
     </w:p>
     <w:p>
       <w:pPr>
-        <w:pStyle w:val="Prrafodelista"/>
+        <w:pStyle w:val="ListParagraph"/>
         <w:numPr>
           <w:ilvl w:val="0"/>
           <w:numId w:val="2"/>
@@ -1518,7 +1518,7 @@
     </w:p>
     <w:p>
       <w:pPr>
-        <w:pStyle w:val="Prrafodelista"/>
+        <w:pStyle w:val="ListParagraph"/>
         <w:numPr>
           <w:ilvl w:val="0"/>
           <w:numId w:val="2"/>
@@ -8139,7 +8139,7 @@
     </w:p>
     <w:p>
       <w:pPr>
-        <w:pStyle w:val="Prrafodelista"/>
+        <w:pStyle w:val="ListParagraph"/>
         <w:numPr>
           <w:ilvl w:val="0"/>
           <w:numId w:val="2"/>
@@ -8148,27 +8148,1415 @@
           <w:rFonts w:ascii="Times New Roman" w:hAnsi="Times New Roman" w:cs="Times New Roman"/>
           <w:b/>
           <w:bCs/>
-          <w:highlight w:val="yellow"/>
-        </w:rPr>
-      </w:pPr>
-      <w:r>
+        </w:rPr>
+      </w:pPr>
+      <w:r>
+        <w:rPr>
+          <w:rFonts w:ascii="Times New Roman" w:hAnsi="Times New Roman" w:cs="Times New Roman"/>
+          <w:b/>
+          <w:bCs/>
+        </w:rPr>
+        <w:lastRenderedPageBreak/>
+        <w:t>Gráficos</w:t>
+      </w:r>
+      <w:r>
+        <w:rPr>
+          <w:rFonts w:ascii="Times New Roman" w:hAnsi="Times New Roman" w:cs="Times New Roman"/>
+          <w:b/>
+          <w:bCs/>
+        </w:rPr>
+        <w:t xml:space="preserve"> promedio periodos </w:t>
+      </w:r>
+    </w:p>
+    <w:tbl>
+      <w:tblPr>
+        <w:tblW w:w="0" w:type="auto"/>
+        <w:tblCellMar>
+          <w:left w:w="0" w:type="dxa"/>
+          <w:right w:w="0" w:type="dxa"/>
+        </w:tblCellMar>
+        <w:tblLook w:val="04A0" w:firstRow="1" w:lastRow="0" w:firstColumn="1" w:lastColumn="0" w:noHBand="0" w:noVBand="1"/>
+      </w:tblPr>
+      <w:tblGrid>
+        <w:gridCol w:w="1028"/>
+        <w:gridCol w:w="1664"/>
+        <w:gridCol w:w="1663"/>
+        <w:gridCol w:w="1663"/>
+        <w:gridCol w:w="1663"/>
+        <w:gridCol w:w="1663"/>
+      </w:tblGrid>
+      <w:tr>
+        <w:trPr>
+          <w:trHeight w:val="165"/>
+        </w:trPr>
+        <w:tc>
+          <w:tcPr>
+            <w:tcW w:w="855" w:type="dxa"/>
+            <w:tcBorders>
+              <w:top w:val="single" w:sz="6" w:space="0" w:color="000000"/>
+              <w:left w:val="single" w:sz="6" w:space="0" w:color="000000"/>
+              <w:bottom w:val="single" w:sz="6" w:space="0" w:color="000000"/>
+              <w:right w:val="single" w:sz="6" w:space="0" w:color="000000"/>
+            </w:tcBorders>
+            <w:shd w:val="clear" w:color="auto" w:fill="B0B3B2"/>
+            <w:tcMar>
+              <w:top w:w="60" w:type="dxa"/>
+              <w:left w:w="60" w:type="dxa"/>
+              <w:bottom w:w="60" w:type="dxa"/>
+              <w:right w:w="60" w:type="dxa"/>
+            </w:tcMar>
+            <w:hideMark/>
+          </w:tcPr>
+          <w:p>
+            <w:pPr>
+              <w:spacing w:after="0" w:line="240" w:lineRule="auto"/>
+              <w:rPr>
+                <w:rFonts w:ascii="Times New Roman" w:eastAsia="Times New Roman" w:hAnsi="Times New Roman" w:cs="Times New Roman"/>
+                <w:kern w:val="0"/>
+                <w:sz w:val="20"/>
+                <w:szCs w:val="20"/>
+                <w:lang w:val="en-CO"/>
+                <w14:ligatures w14:val="none"/>
+              </w:rPr>
+            </w:pPr>
+            <w:r>
+              <w:rPr>
+                <w:rFonts w:ascii="Times New Roman" w:eastAsia="Times New Roman" w:hAnsi="Times New Roman" w:cs="Times New Roman"/>
+                <w:b/>
+                <w:bCs/>
+                <w:color w:val="000000"/>
+                <w:kern w:val="0"/>
+                <w:sz w:val="20"/>
+                <w:szCs w:val="20"/>
+                <w:lang w:val="en-CO"/>
+                <w14:ligatures w14:val="none"/>
+              </w:rPr>
+              <w:t>Period</w:t>
+            </w:r>
+          </w:p>
+        </w:tc>
+        <w:tc>
+          <w:tcPr>
+            <w:tcW w:w="1290" w:type="dxa"/>
+            <w:tcBorders>
+              <w:top w:val="single" w:sz="6" w:space="0" w:color="000000"/>
+              <w:left w:val="single" w:sz="6" w:space="0" w:color="000000"/>
+              <w:bottom w:val="single" w:sz="6" w:space="0" w:color="000000"/>
+              <w:right w:val="single" w:sz="6" w:space="0" w:color="000000"/>
+            </w:tcBorders>
+            <w:shd w:val="clear" w:color="auto" w:fill="B0B3B2"/>
+            <w:tcMar>
+              <w:top w:w="60" w:type="dxa"/>
+              <w:left w:w="60" w:type="dxa"/>
+              <w:bottom w:w="60" w:type="dxa"/>
+              <w:right w:w="60" w:type="dxa"/>
+            </w:tcMar>
+            <w:hideMark/>
+          </w:tcPr>
+          <w:p>
+            <w:pPr>
+              <w:spacing w:after="0" w:line="240" w:lineRule="auto"/>
+              <w:rPr>
+                <w:rFonts w:ascii="Times New Roman" w:eastAsia="Times New Roman" w:hAnsi="Times New Roman" w:cs="Times New Roman"/>
+                <w:kern w:val="0"/>
+                <w:sz w:val="20"/>
+                <w:szCs w:val="20"/>
+                <w:lang w:val="en-CO"/>
+                <w14:ligatures w14:val="none"/>
+              </w:rPr>
+            </w:pPr>
+            <w:r>
+              <w:rPr>
+                <w:rFonts w:ascii="Times New Roman" w:eastAsia="Times New Roman" w:hAnsi="Times New Roman" w:cs="Times New Roman"/>
+                <w:b/>
+                <w:bCs/>
+                <w:color w:val="000000"/>
+                <w:kern w:val="0"/>
+                <w:sz w:val="20"/>
+                <w:szCs w:val="20"/>
+                <w:lang w:val="en-CO"/>
+                <w14:ligatures w14:val="none"/>
+              </w:rPr>
+              <w:t>Visits</w:t>
+            </w:r>
+          </w:p>
+        </w:tc>
+        <w:tc>
+          <w:tcPr>
+            <w:tcW w:w="1290" w:type="dxa"/>
+            <w:tcBorders>
+              <w:top w:val="single" w:sz="6" w:space="0" w:color="000000"/>
+              <w:left w:val="single" w:sz="6" w:space="0" w:color="000000"/>
+              <w:bottom w:val="single" w:sz="6" w:space="0" w:color="000000"/>
+              <w:right w:val="single" w:sz="6" w:space="0" w:color="000000"/>
+            </w:tcBorders>
+            <w:shd w:val="clear" w:color="auto" w:fill="B0B3B2"/>
+            <w:tcMar>
+              <w:top w:w="60" w:type="dxa"/>
+              <w:left w:w="60" w:type="dxa"/>
+              <w:bottom w:w="60" w:type="dxa"/>
+              <w:right w:w="60" w:type="dxa"/>
+            </w:tcMar>
+            <w:hideMark/>
+          </w:tcPr>
+          <w:p>
+            <w:pPr>
+              <w:spacing w:after="0" w:line="240" w:lineRule="auto"/>
+              <w:rPr>
+                <w:rFonts w:ascii="Times New Roman" w:eastAsia="Times New Roman" w:hAnsi="Times New Roman" w:cs="Times New Roman"/>
+                <w:kern w:val="0"/>
+                <w:sz w:val="20"/>
+                <w:szCs w:val="20"/>
+                <w:lang w:val="en-CO"/>
+                <w14:ligatures w14:val="none"/>
+              </w:rPr>
+            </w:pPr>
+            <w:r>
+              <w:rPr>
+                <w:rFonts w:ascii="Times New Roman" w:eastAsia="Times New Roman" w:hAnsi="Times New Roman" w:cs="Times New Roman"/>
+                <w:b/>
+                <w:bCs/>
+                <w:color w:val="000000"/>
+                <w:kern w:val="0"/>
+                <w:sz w:val="20"/>
+                <w:szCs w:val="20"/>
+                <w:lang w:val="en-CO"/>
+                <w14:ligatures w14:val="none"/>
+              </w:rPr>
+              <w:t>Unique_Visits</w:t>
+            </w:r>
+          </w:p>
+        </w:tc>
+        <w:tc>
+          <w:tcPr>
+            <w:tcW w:w="1290" w:type="dxa"/>
+            <w:tcBorders>
+              <w:top w:val="single" w:sz="6" w:space="0" w:color="000000"/>
+              <w:left w:val="single" w:sz="6" w:space="0" w:color="000000"/>
+              <w:bottom w:val="single" w:sz="6" w:space="0" w:color="000000"/>
+              <w:right w:val="single" w:sz="6" w:space="0" w:color="000000"/>
+            </w:tcBorders>
+            <w:shd w:val="clear" w:color="auto" w:fill="B0B3B2"/>
+            <w:tcMar>
+              <w:top w:w="60" w:type="dxa"/>
+              <w:left w:w="60" w:type="dxa"/>
+              <w:bottom w:w="60" w:type="dxa"/>
+              <w:right w:w="60" w:type="dxa"/>
+            </w:tcMar>
+            <w:hideMark/>
+          </w:tcPr>
+          <w:p>
+            <w:pPr>
+              <w:spacing w:after="0" w:line="240" w:lineRule="auto"/>
+              <w:rPr>
+                <w:rFonts w:ascii="Times New Roman" w:eastAsia="Times New Roman" w:hAnsi="Times New Roman" w:cs="Times New Roman"/>
+                <w:kern w:val="0"/>
+                <w:sz w:val="20"/>
+                <w:szCs w:val="20"/>
+                <w:lang w:val="en-CO"/>
+                <w14:ligatures w14:val="none"/>
+              </w:rPr>
+            </w:pPr>
+            <w:r>
+              <w:rPr>
+                <w:rFonts w:ascii="Times New Roman" w:eastAsia="Times New Roman" w:hAnsi="Times New Roman" w:cs="Times New Roman"/>
+                <w:b/>
+                <w:bCs/>
+                <w:color w:val="000000"/>
+                <w:kern w:val="0"/>
+                <w:sz w:val="20"/>
+                <w:szCs w:val="20"/>
+                <w:lang w:val="en-CO"/>
+                <w14:ligatures w14:val="none"/>
+              </w:rPr>
+              <w:t>Revenue</w:t>
+            </w:r>
+          </w:p>
+        </w:tc>
+        <w:tc>
+          <w:tcPr>
+            <w:tcW w:w="1290" w:type="dxa"/>
+            <w:tcBorders>
+              <w:top w:val="single" w:sz="6" w:space="0" w:color="000000"/>
+              <w:left w:val="single" w:sz="6" w:space="0" w:color="000000"/>
+              <w:bottom w:val="single" w:sz="6" w:space="0" w:color="000000"/>
+              <w:right w:val="single" w:sz="6" w:space="0" w:color="000000"/>
+            </w:tcBorders>
+            <w:shd w:val="clear" w:color="auto" w:fill="B0B3B2"/>
+            <w:tcMar>
+              <w:top w:w="60" w:type="dxa"/>
+              <w:left w:w="60" w:type="dxa"/>
+              <w:bottom w:w="60" w:type="dxa"/>
+              <w:right w:w="60" w:type="dxa"/>
+            </w:tcMar>
+            <w:hideMark/>
+          </w:tcPr>
+          <w:p>
+            <w:pPr>
+              <w:spacing w:after="0" w:line="240" w:lineRule="auto"/>
+              <w:rPr>
+                <w:rFonts w:ascii="Times New Roman" w:eastAsia="Times New Roman" w:hAnsi="Times New Roman" w:cs="Times New Roman"/>
+                <w:kern w:val="0"/>
+                <w:sz w:val="20"/>
+                <w:szCs w:val="20"/>
+                <w:lang w:val="en-CO"/>
+                <w14:ligatures w14:val="none"/>
+              </w:rPr>
+            </w:pPr>
+            <w:r>
+              <w:rPr>
+                <w:rFonts w:ascii="Times New Roman" w:eastAsia="Times New Roman" w:hAnsi="Times New Roman" w:cs="Times New Roman"/>
+                <w:b/>
+                <w:bCs/>
+                <w:color w:val="000000"/>
+                <w:kern w:val="0"/>
+                <w:sz w:val="20"/>
+                <w:szCs w:val="20"/>
+                <w:lang w:val="en-CO"/>
+                <w14:ligatures w14:val="none"/>
+              </w:rPr>
+              <w:t>Profit</w:t>
+            </w:r>
+          </w:p>
+        </w:tc>
+        <w:tc>
+          <w:tcPr>
+            <w:tcW w:w="1290" w:type="dxa"/>
+            <w:tcBorders>
+              <w:top w:val="single" w:sz="6" w:space="0" w:color="000000"/>
+              <w:left w:val="single" w:sz="6" w:space="0" w:color="000000"/>
+              <w:bottom w:val="single" w:sz="6" w:space="0" w:color="000000"/>
+              <w:right w:val="single" w:sz="6" w:space="0" w:color="000000"/>
+            </w:tcBorders>
+            <w:shd w:val="clear" w:color="auto" w:fill="B0B3B2"/>
+            <w:tcMar>
+              <w:top w:w="60" w:type="dxa"/>
+              <w:left w:w="60" w:type="dxa"/>
+              <w:bottom w:w="60" w:type="dxa"/>
+              <w:right w:w="60" w:type="dxa"/>
+            </w:tcMar>
+            <w:hideMark/>
+          </w:tcPr>
+          <w:p>
+            <w:pPr>
+              <w:spacing w:after="0" w:line="240" w:lineRule="auto"/>
+              <w:rPr>
+                <w:rFonts w:ascii="Times New Roman" w:eastAsia="Times New Roman" w:hAnsi="Times New Roman" w:cs="Times New Roman"/>
+                <w:kern w:val="0"/>
+                <w:sz w:val="20"/>
+                <w:szCs w:val="20"/>
+                <w:lang w:val="en-CO"/>
+                <w14:ligatures w14:val="none"/>
+              </w:rPr>
+            </w:pPr>
+            <w:r>
+              <w:rPr>
+                <w:rFonts w:ascii="Times New Roman" w:eastAsia="Times New Roman" w:hAnsi="Times New Roman" w:cs="Times New Roman"/>
+                <w:b/>
+                <w:bCs/>
+                <w:color w:val="000000"/>
+                <w:kern w:val="0"/>
+                <w:sz w:val="20"/>
+                <w:szCs w:val="20"/>
+                <w:lang w:val="en-CO"/>
+                <w14:ligatures w14:val="none"/>
+              </w:rPr>
+              <w:t>Lbs_Sold</w:t>
+            </w:r>
+          </w:p>
+        </w:tc>
+      </w:tr>
+      <w:tr>
+        <w:trPr>
+          <w:trHeight w:val="180"/>
+        </w:trPr>
+        <w:tc>
+          <w:tcPr>
+            <w:tcW w:w="855" w:type="dxa"/>
+            <w:tcBorders>
+              <w:top w:val="single" w:sz="6" w:space="0" w:color="000000"/>
+              <w:left w:val="single" w:sz="6" w:space="0" w:color="000000"/>
+              <w:bottom w:val="single" w:sz="6" w:space="0" w:color="000000"/>
+              <w:right w:val="single" w:sz="6" w:space="0" w:color="000000"/>
+            </w:tcBorders>
+            <w:shd w:val="clear" w:color="auto" w:fill="D4D4D4"/>
+            <w:tcMar>
+              <w:top w:w="60" w:type="dxa"/>
+              <w:left w:w="60" w:type="dxa"/>
+              <w:bottom w:w="60" w:type="dxa"/>
+              <w:right w:w="60" w:type="dxa"/>
+            </w:tcMar>
+            <w:hideMark/>
+          </w:tcPr>
+          <w:p>
+            <w:pPr>
+              <w:spacing w:after="0" w:line="240" w:lineRule="auto"/>
+              <w:rPr>
+                <w:rFonts w:ascii="Times New Roman" w:eastAsia="Times New Roman" w:hAnsi="Times New Roman" w:cs="Times New Roman"/>
+                <w:kern w:val="0"/>
+                <w:sz w:val="20"/>
+                <w:szCs w:val="20"/>
+                <w:lang w:val="en-CO"/>
+                <w14:ligatures w14:val="none"/>
+              </w:rPr>
+            </w:pPr>
+            <w:r>
+              <w:rPr>
+                <w:rFonts w:ascii="Times New Roman" w:eastAsia="Times New Roman" w:hAnsi="Times New Roman" w:cs="Times New Roman"/>
+                <w:b/>
+                <w:bCs/>
+                <w:color w:val="000000"/>
+                <w:kern w:val="0"/>
+                <w:sz w:val="20"/>
+                <w:szCs w:val="20"/>
+                <w:lang w:val="en-CO"/>
+                <w14:ligatures w14:val="none"/>
+              </w:rPr>
+              <w:t>Initial</w:t>
+            </w:r>
+          </w:p>
+        </w:tc>
+        <w:tc>
+          <w:tcPr>
+            <w:tcW w:w="1290" w:type="dxa"/>
+            <w:tcBorders>
+              <w:top w:val="single" w:sz="6" w:space="0" w:color="000000"/>
+              <w:left w:val="single" w:sz="6" w:space="0" w:color="000000"/>
+              <w:bottom w:val="single" w:sz="6" w:space="0" w:color="000000"/>
+              <w:right w:val="single" w:sz="6" w:space="0" w:color="000000"/>
+            </w:tcBorders>
+            <w:tcMar>
+              <w:top w:w="60" w:type="dxa"/>
+              <w:left w:w="60" w:type="dxa"/>
+              <w:bottom w:w="60" w:type="dxa"/>
+              <w:right w:w="60" w:type="dxa"/>
+            </w:tcMar>
+            <w:hideMark/>
+          </w:tcPr>
+          <w:p>
+            <w:pPr>
+              <w:spacing w:after="0" w:line="240" w:lineRule="auto"/>
+              <w:rPr>
+                <w:rFonts w:ascii="Times New Roman" w:eastAsia="Times New Roman" w:hAnsi="Times New Roman" w:cs="Times New Roman"/>
+                <w:kern w:val="0"/>
+                <w:sz w:val="20"/>
+                <w:szCs w:val="20"/>
+                <w:lang w:val="en-CO"/>
+                <w14:ligatures w14:val="none"/>
+              </w:rPr>
+            </w:pPr>
+            <w:r>
+              <w:rPr>
+                <w:rFonts w:ascii="Times New Roman" w:eastAsia="Times New Roman" w:hAnsi="Times New Roman" w:cs="Times New Roman"/>
+                <w:color w:val="000000"/>
+                <w:kern w:val="0"/>
+                <w:sz w:val="20"/>
+                <w:szCs w:val="20"/>
+                <w:lang w:val="en-CO"/>
+                <w14:ligatures w14:val="none"/>
+              </w:rPr>
+              <w:t>1055.21428571429</w:t>
+            </w:r>
+          </w:p>
+        </w:tc>
+        <w:tc>
+          <w:tcPr>
+            <w:tcW w:w="1290" w:type="dxa"/>
+            <w:tcBorders>
+              <w:top w:val="single" w:sz="6" w:space="0" w:color="000000"/>
+              <w:left w:val="single" w:sz="6" w:space="0" w:color="000000"/>
+              <w:bottom w:val="single" w:sz="6" w:space="0" w:color="000000"/>
+              <w:right w:val="single" w:sz="6" w:space="0" w:color="000000"/>
+            </w:tcBorders>
+            <w:tcMar>
+              <w:top w:w="60" w:type="dxa"/>
+              <w:left w:w="60" w:type="dxa"/>
+              <w:bottom w:w="60" w:type="dxa"/>
+              <w:right w:w="60" w:type="dxa"/>
+            </w:tcMar>
+            <w:hideMark/>
+          </w:tcPr>
+          <w:p>
+            <w:pPr>
+              <w:spacing w:after="0" w:line="240" w:lineRule="auto"/>
+              <w:rPr>
+                <w:rFonts w:ascii="Times New Roman" w:eastAsia="Times New Roman" w:hAnsi="Times New Roman" w:cs="Times New Roman"/>
+                <w:kern w:val="0"/>
+                <w:sz w:val="20"/>
+                <w:szCs w:val="20"/>
+                <w:lang w:val="en-CO"/>
+                <w14:ligatures w14:val="none"/>
+              </w:rPr>
+            </w:pPr>
+            <w:r>
+              <w:rPr>
+                <w:rFonts w:ascii="Times New Roman" w:eastAsia="Times New Roman" w:hAnsi="Times New Roman" w:cs="Times New Roman"/>
+                <w:color w:val="000000"/>
+                <w:kern w:val="0"/>
+                <w:sz w:val="20"/>
+                <w:szCs w:val="20"/>
+                <w:lang w:val="en-CO"/>
+                <w14:ligatures w14:val="none"/>
+              </w:rPr>
+              <w:t>975.928571428571</w:t>
+            </w:r>
+          </w:p>
+        </w:tc>
+        <w:tc>
+          <w:tcPr>
+            <w:tcW w:w="1290" w:type="dxa"/>
+            <w:tcBorders>
+              <w:top w:val="single" w:sz="6" w:space="0" w:color="000000"/>
+              <w:left w:val="single" w:sz="6" w:space="0" w:color="000000"/>
+              <w:bottom w:val="single" w:sz="6" w:space="0" w:color="000000"/>
+              <w:right w:val="single" w:sz="6" w:space="0" w:color="000000"/>
+            </w:tcBorders>
+            <w:tcMar>
+              <w:top w:w="60" w:type="dxa"/>
+              <w:left w:w="60" w:type="dxa"/>
+              <w:bottom w:w="60" w:type="dxa"/>
+              <w:right w:w="60" w:type="dxa"/>
+            </w:tcMar>
+            <w:hideMark/>
+          </w:tcPr>
+          <w:p>
+            <w:pPr>
+              <w:spacing w:after="0" w:line="240" w:lineRule="auto"/>
+              <w:rPr>
+                <w:rFonts w:ascii="Times New Roman" w:eastAsia="Times New Roman" w:hAnsi="Times New Roman" w:cs="Times New Roman"/>
+                <w:kern w:val="0"/>
+                <w:sz w:val="20"/>
+                <w:szCs w:val="20"/>
+                <w:lang w:val="en-CO"/>
+                <w14:ligatures w14:val="none"/>
+              </w:rPr>
+            </w:pPr>
+            <w:r>
+              <w:rPr>
+                <w:rFonts w:ascii="Times New Roman" w:eastAsia="Times New Roman" w:hAnsi="Times New Roman" w:cs="Times New Roman"/>
+                <w:color w:val="000000"/>
+                <w:kern w:val="0"/>
+                <w:sz w:val="20"/>
+                <w:szCs w:val="20"/>
+                <w:lang w:val="en-CO"/>
+                <w14:ligatures w14:val="none"/>
+              </w:rPr>
+              <w:t>608250.123</w:t>
+            </w:r>
+          </w:p>
+        </w:tc>
+        <w:tc>
+          <w:tcPr>
+            <w:tcW w:w="1290" w:type="dxa"/>
+            <w:tcBorders>
+              <w:top w:val="single" w:sz="6" w:space="0" w:color="000000"/>
+              <w:left w:val="single" w:sz="6" w:space="0" w:color="000000"/>
+              <w:bottom w:val="single" w:sz="6" w:space="0" w:color="000000"/>
+              <w:right w:val="single" w:sz="6" w:space="0" w:color="000000"/>
+            </w:tcBorders>
+            <w:tcMar>
+              <w:top w:w="60" w:type="dxa"/>
+              <w:left w:w="60" w:type="dxa"/>
+              <w:bottom w:w="60" w:type="dxa"/>
+              <w:right w:w="60" w:type="dxa"/>
+            </w:tcMar>
+            <w:hideMark/>
+          </w:tcPr>
+          <w:p>
+            <w:pPr>
+              <w:spacing w:after="0" w:line="240" w:lineRule="auto"/>
+              <w:rPr>
+                <w:rFonts w:ascii="Times New Roman" w:eastAsia="Times New Roman" w:hAnsi="Times New Roman" w:cs="Times New Roman"/>
+                <w:kern w:val="0"/>
+                <w:sz w:val="20"/>
+                <w:szCs w:val="20"/>
+                <w:lang w:val="en-CO"/>
+                <w14:ligatures w14:val="none"/>
+              </w:rPr>
+            </w:pPr>
+            <w:r>
+              <w:rPr>
+                <w:rFonts w:ascii="Times New Roman" w:eastAsia="Times New Roman" w:hAnsi="Times New Roman" w:cs="Times New Roman"/>
+                <w:color w:val="000000"/>
+                <w:kern w:val="0"/>
+                <w:sz w:val="20"/>
+                <w:szCs w:val="20"/>
+                <w:lang w:val="en-CO"/>
+                <w14:ligatures w14:val="none"/>
+              </w:rPr>
+              <w:t>200233.407142857</w:t>
+            </w:r>
+          </w:p>
+        </w:tc>
+        <w:tc>
+          <w:tcPr>
+            <w:tcW w:w="1290" w:type="dxa"/>
+            <w:tcBorders>
+              <w:top w:val="single" w:sz="6" w:space="0" w:color="000000"/>
+              <w:left w:val="single" w:sz="6" w:space="0" w:color="000000"/>
+              <w:bottom w:val="single" w:sz="6" w:space="0" w:color="000000"/>
+              <w:right w:val="single" w:sz="6" w:space="0" w:color="000000"/>
+            </w:tcBorders>
+            <w:tcMar>
+              <w:top w:w="60" w:type="dxa"/>
+              <w:left w:w="60" w:type="dxa"/>
+              <w:bottom w:w="60" w:type="dxa"/>
+              <w:right w:w="60" w:type="dxa"/>
+            </w:tcMar>
+            <w:hideMark/>
+          </w:tcPr>
+          <w:p>
+            <w:pPr>
+              <w:spacing w:after="0" w:line="240" w:lineRule="auto"/>
+              <w:rPr>
+                <w:rFonts w:ascii="Times New Roman" w:eastAsia="Times New Roman" w:hAnsi="Times New Roman" w:cs="Times New Roman"/>
+                <w:kern w:val="0"/>
+                <w:sz w:val="20"/>
+                <w:szCs w:val="20"/>
+                <w:lang w:val="en-CO"/>
+                <w14:ligatures w14:val="none"/>
+              </w:rPr>
+            </w:pPr>
+            <w:r>
+              <w:rPr>
+                <w:rFonts w:ascii="Times New Roman" w:eastAsia="Times New Roman" w:hAnsi="Times New Roman" w:cs="Times New Roman"/>
+                <w:color w:val="000000"/>
+                <w:kern w:val="0"/>
+                <w:sz w:val="20"/>
+                <w:szCs w:val="20"/>
+                <w:lang w:val="en-CO"/>
+                <w14:ligatures w14:val="none"/>
+              </w:rPr>
+              <w:t>18736.7285</w:t>
+            </w:r>
+          </w:p>
+        </w:tc>
+      </w:tr>
+      <w:tr>
+        <w:trPr>
+          <w:trHeight w:val="165"/>
+        </w:trPr>
+        <w:tc>
+          <w:tcPr>
+            <w:tcW w:w="855" w:type="dxa"/>
+            <w:tcBorders>
+              <w:top w:val="single" w:sz="6" w:space="0" w:color="000000"/>
+              <w:left w:val="single" w:sz="6" w:space="0" w:color="000000"/>
+              <w:bottom w:val="single" w:sz="6" w:space="0" w:color="000000"/>
+              <w:right w:val="single" w:sz="6" w:space="0" w:color="000000"/>
+            </w:tcBorders>
+            <w:shd w:val="clear" w:color="auto" w:fill="D4D4D4"/>
+            <w:tcMar>
+              <w:top w:w="60" w:type="dxa"/>
+              <w:left w:w="60" w:type="dxa"/>
+              <w:bottom w:w="60" w:type="dxa"/>
+              <w:right w:w="60" w:type="dxa"/>
+            </w:tcMar>
+            <w:hideMark/>
+          </w:tcPr>
+          <w:p>
+            <w:pPr>
+              <w:spacing w:after="0" w:line="240" w:lineRule="auto"/>
+              <w:rPr>
+                <w:rFonts w:ascii="Times New Roman" w:eastAsia="Times New Roman" w:hAnsi="Times New Roman" w:cs="Times New Roman"/>
+                <w:kern w:val="0"/>
+                <w:sz w:val="20"/>
+                <w:szCs w:val="20"/>
+                <w:lang w:val="en-CO"/>
+                <w14:ligatures w14:val="none"/>
+              </w:rPr>
+            </w:pPr>
+            <w:r>
+              <w:rPr>
+                <w:rFonts w:ascii="Times New Roman" w:eastAsia="Times New Roman" w:hAnsi="Times New Roman" w:cs="Times New Roman"/>
+                <w:b/>
+                <w:bCs/>
+                <w:color w:val="000000"/>
+                <w:kern w:val="0"/>
+                <w:sz w:val="20"/>
+                <w:szCs w:val="20"/>
+                <w:lang w:val="en-CO"/>
+                <w14:ligatures w14:val="none"/>
+              </w:rPr>
+              <w:t>Pre-Promo</w:t>
+            </w:r>
+          </w:p>
+        </w:tc>
+        <w:tc>
+          <w:tcPr>
+            <w:tcW w:w="1290" w:type="dxa"/>
+            <w:tcBorders>
+              <w:top w:val="single" w:sz="6" w:space="0" w:color="000000"/>
+              <w:left w:val="single" w:sz="6" w:space="0" w:color="000000"/>
+              <w:bottom w:val="single" w:sz="6" w:space="0" w:color="000000"/>
+              <w:right w:val="single" w:sz="6" w:space="0" w:color="000000"/>
+            </w:tcBorders>
+            <w:tcMar>
+              <w:top w:w="60" w:type="dxa"/>
+              <w:left w:w="60" w:type="dxa"/>
+              <w:bottom w:w="60" w:type="dxa"/>
+              <w:right w:w="60" w:type="dxa"/>
+            </w:tcMar>
+            <w:hideMark/>
+          </w:tcPr>
+          <w:p>
+            <w:pPr>
+              <w:spacing w:after="0" w:line="240" w:lineRule="auto"/>
+              <w:rPr>
+                <w:rFonts w:ascii="Times New Roman" w:eastAsia="Times New Roman" w:hAnsi="Times New Roman" w:cs="Times New Roman"/>
+                <w:kern w:val="0"/>
+                <w:sz w:val="20"/>
+                <w:szCs w:val="20"/>
+                <w:lang w:val="en-CO"/>
+                <w14:ligatures w14:val="none"/>
+              </w:rPr>
+            </w:pPr>
+            <w:r>
+              <w:rPr>
+                <w:rFonts w:ascii="Times New Roman" w:eastAsia="Times New Roman" w:hAnsi="Times New Roman" w:cs="Times New Roman"/>
+                <w:color w:val="000000"/>
+                <w:kern w:val="0"/>
+                <w:sz w:val="20"/>
+                <w:szCs w:val="20"/>
+                <w:lang w:val="en-CO"/>
+                <w14:ligatures w14:val="none"/>
+              </w:rPr>
+              <w:t>562.952380952381</w:t>
+            </w:r>
+          </w:p>
+        </w:tc>
+        <w:tc>
+          <w:tcPr>
+            <w:tcW w:w="1290" w:type="dxa"/>
+            <w:tcBorders>
+              <w:top w:val="single" w:sz="6" w:space="0" w:color="000000"/>
+              <w:left w:val="single" w:sz="6" w:space="0" w:color="000000"/>
+              <w:bottom w:val="single" w:sz="6" w:space="0" w:color="000000"/>
+              <w:right w:val="single" w:sz="6" w:space="0" w:color="000000"/>
+            </w:tcBorders>
+            <w:tcMar>
+              <w:top w:w="60" w:type="dxa"/>
+              <w:left w:w="60" w:type="dxa"/>
+              <w:bottom w:w="60" w:type="dxa"/>
+              <w:right w:w="60" w:type="dxa"/>
+            </w:tcMar>
+            <w:hideMark/>
+          </w:tcPr>
+          <w:p>
+            <w:pPr>
+              <w:spacing w:after="0" w:line="240" w:lineRule="auto"/>
+              <w:rPr>
+                <w:rFonts w:ascii="Times New Roman" w:eastAsia="Times New Roman" w:hAnsi="Times New Roman" w:cs="Times New Roman"/>
+                <w:kern w:val="0"/>
+                <w:sz w:val="20"/>
+                <w:szCs w:val="20"/>
+                <w:lang w:val="en-CO"/>
+                <w14:ligatures w14:val="none"/>
+              </w:rPr>
+            </w:pPr>
+            <w:r>
+              <w:rPr>
+                <w:rFonts w:ascii="Times New Roman" w:eastAsia="Times New Roman" w:hAnsi="Times New Roman" w:cs="Times New Roman"/>
+                <w:color w:val="000000"/>
+                <w:kern w:val="0"/>
+                <w:sz w:val="20"/>
+                <w:szCs w:val="20"/>
+                <w:lang w:val="en-CO"/>
+                <w14:ligatures w14:val="none"/>
+              </w:rPr>
+              <w:t>516.809523809524</w:t>
+            </w:r>
+          </w:p>
+        </w:tc>
+        <w:tc>
+          <w:tcPr>
+            <w:tcW w:w="1290" w:type="dxa"/>
+            <w:tcBorders>
+              <w:top w:val="single" w:sz="6" w:space="0" w:color="000000"/>
+              <w:left w:val="single" w:sz="6" w:space="0" w:color="000000"/>
+              <w:bottom w:val="single" w:sz="6" w:space="0" w:color="000000"/>
+              <w:right w:val="single" w:sz="6" w:space="0" w:color="000000"/>
+            </w:tcBorders>
+            <w:tcMar>
+              <w:top w:w="60" w:type="dxa"/>
+              <w:left w:w="60" w:type="dxa"/>
+              <w:bottom w:w="60" w:type="dxa"/>
+              <w:right w:w="60" w:type="dxa"/>
+            </w:tcMar>
+            <w:hideMark/>
+          </w:tcPr>
+          <w:p>
+            <w:pPr>
+              <w:spacing w:after="0" w:line="240" w:lineRule="auto"/>
+              <w:rPr>
+                <w:rFonts w:ascii="Times New Roman" w:eastAsia="Times New Roman" w:hAnsi="Times New Roman" w:cs="Times New Roman"/>
+                <w:kern w:val="0"/>
+                <w:sz w:val="20"/>
+                <w:szCs w:val="20"/>
+                <w:lang w:val="en-CO"/>
+                <w14:ligatures w14:val="none"/>
+              </w:rPr>
+            </w:pPr>
+            <w:r>
+              <w:rPr>
+                <w:rFonts w:ascii="Times New Roman" w:eastAsia="Times New Roman" w:hAnsi="Times New Roman" w:cs="Times New Roman"/>
+                <w:color w:val="000000"/>
+                <w:kern w:val="0"/>
+                <w:sz w:val="20"/>
+                <w:szCs w:val="20"/>
+                <w:lang w:val="en-CO"/>
+                <w14:ligatures w14:val="none"/>
+              </w:rPr>
+              <w:t>534313.517380952</w:t>
+            </w:r>
+          </w:p>
+        </w:tc>
+        <w:tc>
+          <w:tcPr>
+            <w:tcW w:w="1290" w:type="dxa"/>
+            <w:tcBorders>
+              <w:top w:val="single" w:sz="6" w:space="0" w:color="000000"/>
+              <w:left w:val="single" w:sz="6" w:space="0" w:color="000000"/>
+              <w:bottom w:val="single" w:sz="6" w:space="0" w:color="000000"/>
+              <w:right w:val="single" w:sz="6" w:space="0" w:color="000000"/>
+            </w:tcBorders>
+            <w:tcMar>
+              <w:top w:w="60" w:type="dxa"/>
+              <w:left w:w="60" w:type="dxa"/>
+              <w:bottom w:w="60" w:type="dxa"/>
+              <w:right w:w="60" w:type="dxa"/>
+            </w:tcMar>
+            <w:hideMark/>
+          </w:tcPr>
+          <w:p>
+            <w:pPr>
+              <w:spacing w:after="0" w:line="240" w:lineRule="auto"/>
+              <w:rPr>
+                <w:rFonts w:ascii="Times New Roman" w:eastAsia="Times New Roman" w:hAnsi="Times New Roman" w:cs="Times New Roman"/>
+                <w:kern w:val="0"/>
+                <w:sz w:val="20"/>
+                <w:szCs w:val="20"/>
+                <w:lang w:val="en-CO"/>
+                <w14:ligatures w14:val="none"/>
+              </w:rPr>
+            </w:pPr>
+            <w:r>
+              <w:rPr>
+                <w:rFonts w:ascii="Times New Roman" w:eastAsia="Times New Roman" w:hAnsi="Times New Roman" w:cs="Times New Roman"/>
+                <w:color w:val="000000"/>
+                <w:kern w:val="0"/>
+                <w:sz w:val="20"/>
+                <w:szCs w:val="20"/>
+                <w:lang w:val="en-CO"/>
+                <w14:ligatures w14:val="none"/>
+              </w:rPr>
+              <w:t>159932.033333333</w:t>
+            </w:r>
+          </w:p>
+        </w:tc>
+        <w:tc>
+          <w:tcPr>
+            <w:tcW w:w="1290" w:type="dxa"/>
+            <w:tcBorders>
+              <w:top w:val="single" w:sz="6" w:space="0" w:color="000000"/>
+              <w:left w:val="single" w:sz="6" w:space="0" w:color="000000"/>
+              <w:bottom w:val="single" w:sz="6" w:space="0" w:color="000000"/>
+              <w:right w:val="single" w:sz="6" w:space="0" w:color="000000"/>
+            </w:tcBorders>
+            <w:tcMar>
+              <w:top w:w="60" w:type="dxa"/>
+              <w:left w:w="60" w:type="dxa"/>
+              <w:bottom w:w="60" w:type="dxa"/>
+              <w:right w:w="60" w:type="dxa"/>
+            </w:tcMar>
+            <w:hideMark/>
+          </w:tcPr>
+          <w:p>
+            <w:pPr>
+              <w:spacing w:after="0" w:line="240" w:lineRule="auto"/>
+              <w:rPr>
+                <w:rFonts w:ascii="Times New Roman" w:eastAsia="Times New Roman" w:hAnsi="Times New Roman" w:cs="Times New Roman"/>
+                <w:kern w:val="0"/>
+                <w:sz w:val="20"/>
+                <w:szCs w:val="20"/>
+                <w:lang w:val="en-CO"/>
+                <w14:ligatures w14:val="none"/>
+              </w:rPr>
+            </w:pPr>
+            <w:r>
+              <w:rPr>
+                <w:rFonts w:ascii="Times New Roman" w:eastAsia="Times New Roman" w:hAnsi="Times New Roman" w:cs="Times New Roman"/>
+                <w:color w:val="000000"/>
+                <w:kern w:val="0"/>
+                <w:sz w:val="20"/>
+                <w:szCs w:val="20"/>
+                <w:lang w:val="en-CO"/>
+                <w14:ligatures w14:val="none"/>
+              </w:rPr>
+              <w:t>18440.7742857143</w:t>
+            </w:r>
+          </w:p>
+        </w:tc>
+      </w:tr>
+      <w:tr>
+        <w:trPr>
+          <w:trHeight w:val="165"/>
+        </w:trPr>
+        <w:tc>
+          <w:tcPr>
+            <w:tcW w:w="855" w:type="dxa"/>
+            <w:tcBorders>
+              <w:top w:val="single" w:sz="6" w:space="0" w:color="000000"/>
+              <w:left w:val="single" w:sz="6" w:space="0" w:color="000000"/>
+              <w:bottom w:val="single" w:sz="6" w:space="0" w:color="000000"/>
+              <w:right w:val="single" w:sz="6" w:space="0" w:color="000000"/>
+            </w:tcBorders>
+            <w:shd w:val="clear" w:color="auto" w:fill="D4D4D4"/>
+            <w:tcMar>
+              <w:top w:w="60" w:type="dxa"/>
+              <w:left w:w="60" w:type="dxa"/>
+              <w:bottom w:w="60" w:type="dxa"/>
+              <w:right w:w="60" w:type="dxa"/>
+            </w:tcMar>
+            <w:hideMark/>
+          </w:tcPr>
+          <w:p>
+            <w:pPr>
+              <w:spacing w:after="0" w:line="240" w:lineRule="auto"/>
+              <w:rPr>
+                <w:rFonts w:ascii="Times New Roman" w:eastAsia="Times New Roman" w:hAnsi="Times New Roman" w:cs="Times New Roman"/>
+                <w:kern w:val="0"/>
+                <w:sz w:val="20"/>
+                <w:szCs w:val="20"/>
+                <w:lang w:val="en-CO"/>
+                <w14:ligatures w14:val="none"/>
+              </w:rPr>
+            </w:pPr>
+            <w:r>
+              <w:rPr>
+                <w:rFonts w:ascii="Times New Roman" w:eastAsia="Times New Roman" w:hAnsi="Times New Roman" w:cs="Times New Roman"/>
+                <w:b/>
+                <w:bCs/>
+                <w:color w:val="000000"/>
+                <w:kern w:val="0"/>
+                <w:sz w:val="20"/>
+                <w:szCs w:val="20"/>
+                <w:lang w:val="en-CO"/>
+                <w14:ligatures w14:val="none"/>
+              </w:rPr>
+              <w:t>Promotion</w:t>
+            </w:r>
+          </w:p>
+        </w:tc>
+        <w:tc>
+          <w:tcPr>
+            <w:tcW w:w="1290" w:type="dxa"/>
+            <w:tcBorders>
+              <w:top w:val="single" w:sz="6" w:space="0" w:color="000000"/>
+              <w:left w:val="single" w:sz="6" w:space="0" w:color="000000"/>
+              <w:bottom w:val="single" w:sz="6" w:space="0" w:color="000000"/>
+              <w:right w:val="single" w:sz="6" w:space="0" w:color="000000"/>
+            </w:tcBorders>
+            <w:tcMar>
+              <w:top w:w="60" w:type="dxa"/>
+              <w:left w:w="60" w:type="dxa"/>
+              <w:bottom w:w="60" w:type="dxa"/>
+              <w:right w:w="60" w:type="dxa"/>
+            </w:tcMar>
+            <w:hideMark/>
+          </w:tcPr>
+          <w:p>
+            <w:pPr>
+              <w:spacing w:after="0" w:line="240" w:lineRule="auto"/>
+              <w:rPr>
+                <w:rFonts w:ascii="Times New Roman" w:eastAsia="Times New Roman" w:hAnsi="Times New Roman" w:cs="Times New Roman"/>
+                <w:kern w:val="0"/>
+                <w:sz w:val="20"/>
+                <w:szCs w:val="20"/>
+                <w:lang w:val="en-CO"/>
+                <w14:ligatures w14:val="none"/>
+              </w:rPr>
+            </w:pPr>
+            <w:r>
+              <w:rPr>
+                <w:rFonts w:ascii="Times New Roman" w:eastAsia="Times New Roman" w:hAnsi="Times New Roman" w:cs="Times New Roman"/>
+                <w:color w:val="000000"/>
+                <w:kern w:val="0"/>
+                <w:sz w:val="20"/>
+                <w:szCs w:val="20"/>
+                <w:lang w:val="en-CO"/>
+                <w14:ligatures w14:val="none"/>
+              </w:rPr>
+              <w:t>1814.35294117647</w:t>
+            </w:r>
+          </w:p>
+        </w:tc>
+        <w:tc>
+          <w:tcPr>
+            <w:tcW w:w="1290" w:type="dxa"/>
+            <w:tcBorders>
+              <w:top w:val="single" w:sz="6" w:space="0" w:color="000000"/>
+              <w:left w:val="single" w:sz="6" w:space="0" w:color="000000"/>
+              <w:bottom w:val="single" w:sz="6" w:space="0" w:color="000000"/>
+              <w:right w:val="single" w:sz="6" w:space="0" w:color="000000"/>
+            </w:tcBorders>
+            <w:tcMar>
+              <w:top w:w="60" w:type="dxa"/>
+              <w:left w:w="60" w:type="dxa"/>
+              <w:bottom w:w="60" w:type="dxa"/>
+              <w:right w:w="60" w:type="dxa"/>
+            </w:tcMar>
+            <w:hideMark/>
+          </w:tcPr>
+          <w:p>
+            <w:pPr>
+              <w:spacing w:after="0" w:line="240" w:lineRule="auto"/>
+              <w:rPr>
+                <w:rFonts w:ascii="Times New Roman" w:eastAsia="Times New Roman" w:hAnsi="Times New Roman" w:cs="Times New Roman"/>
+                <w:kern w:val="0"/>
+                <w:sz w:val="20"/>
+                <w:szCs w:val="20"/>
+                <w:lang w:val="en-CO"/>
+                <w14:ligatures w14:val="none"/>
+              </w:rPr>
+            </w:pPr>
+            <w:r>
+              <w:rPr>
+                <w:rFonts w:ascii="Times New Roman" w:eastAsia="Times New Roman" w:hAnsi="Times New Roman" w:cs="Times New Roman"/>
+                <w:color w:val="000000"/>
+                <w:kern w:val="0"/>
+                <w:sz w:val="20"/>
+                <w:szCs w:val="20"/>
+                <w:lang w:val="en-CO"/>
+                <w14:ligatures w14:val="none"/>
+              </w:rPr>
+              <w:t>1738.82352941176</w:t>
+            </w:r>
+          </w:p>
+        </w:tc>
+        <w:tc>
+          <w:tcPr>
+            <w:tcW w:w="1290" w:type="dxa"/>
+            <w:tcBorders>
+              <w:top w:val="single" w:sz="6" w:space="0" w:color="000000"/>
+              <w:left w:val="single" w:sz="6" w:space="0" w:color="000000"/>
+              <w:bottom w:val="single" w:sz="6" w:space="0" w:color="000000"/>
+              <w:right w:val="single" w:sz="6" w:space="0" w:color="000000"/>
+            </w:tcBorders>
+            <w:tcMar>
+              <w:top w:w="60" w:type="dxa"/>
+              <w:left w:w="60" w:type="dxa"/>
+              <w:bottom w:w="60" w:type="dxa"/>
+              <w:right w:w="60" w:type="dxa"/>
+            </w:tcMar>
+            <w:hideMark/>
+          </w:tcPr>
+          <w:p>
+            <w:pPr>
+              <w:spacing w:after="0" w:line="240" w:lineRule="auto"/>
+              <w:rPr>
+                <w:rFonts w:ascii="Times New Roman" w:eastAsia="Times New Roman" w:hAnsi="Times New Roman" w:cs="Times New Roman"/>
+                <w:kern w:val="0"/>
+                <w:sz w:val="20"/>
+                <w:szCs w:val="20"/>
+                <w:lang w:val="en-CO"/>
+                <w14:ligatures w14:val="none"/>
+              </w:rPr>
+            </w:pPr>
+            <w:r>
+              <w:rPr>
+                <w:rFonts w:ascii="Times New Roman" w:eastAsia="Times New Roman" w:hAnsi="Times New Roman" w:cs="Times New Roman"/>
+                <w:color w:val="000000"/>
+                <w:kern w:val="0"/>
+                <w:sz w:val="20"/>
+                <w:szCs w:val="20"/>
+                <w:lang w:val="en-CO"/>
+                <w14:ligatures w14:val="none"/>
+              </w:rPr>
+              <w:t>456398.848</w:t>
+            </w:r>
+          </w:p>
+        </w:tc>
+        <w:tc>
+          <w:tcPr>
+            <w:tcW w:w="1290" w:type="dxa"/>
+            <w:tcBorders>
+              <w:top w:val="single" w:sz="6" w:space="0" w:color="000000"/>
+              <w:left w:val="single" w:sz="6" w:space="0" w:color="000000"/>
+              <w:bottom w:val="single" w:sz="6" w:space="0" w:color="000000"/>
+              <w:right w:val="single" w:sz="6" w:space="0" w:color="000000"/>
+            </w:tcBorders>
+            <w:tcMar>
+              <w:top w:w="60" w:type="dxa"/>
+              <w:left w:w="60" w:type="dxa"/>
+              <w:bottom w:w="60" w:type="dxa"/>
+              <w:right w:w="60" w:type="dxa"/>
+            </w:tcMar>
+            <w:hideMark/>
+          </w:tcPr>
+          <w:p>
+            <w:pPr>
+              <w:spacing w:after="0" w:line="240" w:lineRule="auto"/>
+              <w:rPr>
+                <w:rFonts w:ascii="Times New Roman" w:eastAsia="Times New Roman" w:hAnsi="Times New Roman" w:cs="Times New Roman"/>
+                <w:kern w:val="0"/>
+                <w:sz w:val="20"/>
+                <w:szCs w:val="20"/>
+                <w:lang w:val="en-CO"/>
+                <w14:ligatures w14:val="none"/>
+              </w:rPr>
+            </w:pPr>
+            <w:r>
+              <w:rPr>
+                <w:rFonts w:ascii="Times New Roman" w:eastAsia="Times New Roman" w:hAnsi="Times New Roman" w:cs="Times New Roman"/>
+                <w:color w:val="000000"/>
+                <w:kern w:val="0"/>
+                <w:sz w:val="20"/>
+                <w:szCs w:val="20"/>
+                <w:lang w:val="en-CO"/>
+                <w14:ligatures w14:val="none"/>
+              </w:rPr>
+              <w:t>131929.9</w:t>
+            </w:r>
+          </w:p>
+        </w:tc>
+        <w:tc>
+          <w:tcPr>
+            <w:tcW w:w="1290" w:type="dxa"/>
+            <w:tcBorders>
+              <w:top w:val="single" w:sz="6" w:space="0" w:color="000000"/>
+              <w:left w:val="single" w:sz="6" w:space="0" w:color="000000"/>
+              <w:bottom w:val="single" w:sz="6" w:space="0" w:color="000000"/>
+              <w:right w:val="single" w:sz="6" w:space="0" w:color="000000"/>
+            </w:tcBorders>
+            <w:tcMar>
+              <w:top w:w="60" w:type="dxa"/>
+              <w:left w:w="60" w:type="dxa"/>
+              <w:bottom w:w="60" w:type="dxa"/>
+              <w:right w:w="60" w:type="dxa"/>
+            </w:tcMar>
+            <w:hideMark/>
+          </w:tcPr>
+          <w:p>
+            <w:pPr>
+              <w:spacing w:after="0" w:line="240" w:lineRule="auto"/>
+              <w:rPr>
+                <w:rFonts w:ascii="Times New Roman" w:eastAsia="Times New Roman" w:hAnsi="Times New Roman" w:cs="Times New Roman"/>
+                <w:kern w:val="0"/>
+                <w:sz w:val="20"/>
+                <w:szCs w:val="20"/>
+                <w:lang w:val="en-CO"/>
+                <w14:ligatures w14:val="none"/>
+              </w:rPr>
+            </w:pPr>
+            <w:r>
+              <w:rPr>
+                <w:rFonts w:ascii="Times New Roman" w:eastAsia="Times New Roman" w:hAnsi="Times New Roman" w:cs="Times New Roman"/>
+                <w:color w:val="000000"/>
+                <w:kern w:val="0"/>
+                <w:sz w:val="20"/>
+                <w:szCs w:val="20"/>
+                <w:lang w:val="en-CO"/>
+                <w14:ligatures w14:val="none"/>
+              </w:rPr>
+              <w:t>17112.923</w:t>
+            </w:r>
+          </w:p>
+        </w:tc>
+      </w:tr>
+      <w:tr>
+        <w:trPr>
+          <w:trHeight w:val="165"/>
+        </w:trPr>
+        <w:tc>
+          <w:tcPr>
+            <w:tcW w:w="855" w:type="dxa"/>
+            <w:tcBorders>
+              <w:top w:val="single" w:sz="6" w:space="0" w:color="000000"/>
+              <w:left w:val="single" w:sz="6" w:space="0" w:color="000000"/>
+              <w:bottom w:val="single" w:sz="6" w:space="0" w:color="000000"/>
+              <w:right w:val="single" w:sz="6" w:space="0" w:color="000000"/>
+            </w:tcBorders>
+            <w:shd w:val="clear" w:color="auto" w:fill="D4D4D4"/>
+            <w:tcMar>
+              <w:top w:w="60" w:type="dxa"/>
+              <w:left w:w="60" w:type="dxa"/>
+              <w:bottom w:w="60" w:type="dxa"/>
+              <w:right w:w="60" w:type="dxa"/>
+            </w:tcMar>
+            <w:hideMark/>
+          </w:tcPr>
+          <w:p>
+            <w:pPr>
+              <w:spacing w:after="0" w:line="240" w:lineRule="auto"/>
+              <w:rPr>
+                <w:rFonts w:ascii="Times New Roman" w:eastAsia="Times New Roman" w:hAnsi="Times New Roman" w:cs="Times New Roman"/>
+                <w:kern w:val="0"/>
+                <w:sz w:val="20"/>
+                <w:szCs w:val="20"/>
+                <w:lang w:val="en-CO"/>
+                <w14:ligatures w14:val="none"/>
+              </w:rPr>
+            </w:pPr>
+            <w:r>
+              <w:rPr>
+                <w:rFonts w:ascii="Times New Roman" w:eastAsia="Times New Roman" w:hAnsi="Times New Roman" w:cs="Times New Roman"/>
+                <w:b/>
+                <w:bCs/>
+                <w:color w:val="000000"/>
+                <w:kern w:val="0"/>
+                <w:sz w:val="20"/>
+                <w:szCs w:val="20"/>
+                <w:lang w:val="en-CO"/>
+                <w14:ligatures w14:val="none"/>
+              </w:rPr>
+              <w:t>Post-Promo</w:t>
+            </w:r>
+          </w:p>
+        </w:tc>
+        <w:tc>
+          <w:tcPr>
+            <w:tcW w:w="1290" w:type="dxa"/>
+            <w:tcBorders>
+              <w:top w:val="single" w:sz="6" w:space="0" w:color="000000"/>
+              <w:left w:val="single" w:sz="6" w:space="0" w:color="000000"/>
+              <w:bottom w:val="single" w:sz="6" w:space="0" w:color="000000"/>
+              <w:right w:val="single" w:sz="6" w:space="0" w:color="000000"/>
+            </w:tcBorders>
+            <w:tcMar>
+              <w:top w:w="60" w:type="dxa"/>
+              <w:left w:w="60" w:type="dxa"/>
+              <w:bottom w:w="60" w:type="dxa"/>
+              <w:right w:w="60" w:type="dxa"/>
+            </w:tcMar>
+            <w:hideMark/>
+          </w:tcPr>
+          <w:p>
+            <w:pPr>
+              <w:spacing w:after="0" w:line="240" w:lineRule="auto"/>
+              <w:rPr>
+                <w:rFonts w:ascii="Times New Roman" w:eastAsia="Times New Roman" w:hAnsi="Times New Roman" w:cs="Times New Roman"/>
+                <w:kern w:val="0"/>
+                <w:sz w:val="20"/>
+                <w:szCs w:val="20"/>
+                <w:lang w:val="en-CO"/>
+                <w14:ligatures w14:val="none"/>
+              </w:rPr>
+            </w:pPr>
+            <w:r>
+              <w:rPr>
+                <w:rFonts w:ascii="Times New Roman" w:eastAsia="Times New Roman" w:hAnsi="Times New Roman" w:cs="Times New Roman"/>
+                <w:color w:val="000000"/>
+                <w:kern w:val="0"/>
+                <w:sz w:val="20"/>
+                <w:szCs w:val="20"/>
+                <w:lang w:val="en-CO"/>
+                <w14:ligatures w14:val="none"/>
+              </w:rPr>
+              <w:t>856.571428571429</w:t>
+            </w:r>
+          </w:p>
+        </w:tc>
+        <w:tc>
+          <w:tcPr>
+            <w:tcW w:w="1290" w:type="dxa"/>
+            <w:tcBorders>
+              <w:top w:val="single" w:sz="6" w:space="0" w:color="000000"/>
+              <w:left w:val="single" w:sz="6" w:space="0" w:color="000000"/>
+              <w:bottom w:val="single" w:sz="6" w:space="0" w:color="000000"/>
+              <w:right w:val="single" w:sz="6" w:space="0" w:color="000000"/>
+            </w:tcBorders>
+            <w:tcMar>
+              <w:top w:w="60" w:type="dxa"/>
+              <w:left w:w="60" w:type="dxa"/>
+              <w:bottom w:w="60" w:type="dxa"/>
+              <w:right w:w="60" w:type="dxa"/>
+            </w:tcMar>
+            <w:hideMark/>
+          </w:tcPr>
+          <w:p>
+            <w:pPr>
+              <w:spacing w:after="0" w:line="240" w:lineRule="auto"/>
+              <w:rPr>
+                <w:rFonts w:ascii="Times New Roman" w:eastAsia="Times New Roman" w:hAnsi="Times New Roman" w:cs="Times New Roman"/>
+                <w:kern w:val="0"/>
+                <w:sz w:val="20"/>
+                <w:szCs w:val="20"/>
+                <w:lang w:val="en-CO"/>
+                <w14:ligatures w14:val="none"/>
+              </w:rPr>
+            </w:pPr>
+            <w:r>
+              <w:rPr>
+                <w:rFonts w:ascii="Times New Roman" w:eastAsia="Times New Roman" w:hAnsi="Times New Roman" w:cs="Times New Roman"/>
+                <w:color w:val="000000"/>
+                <w:kern w:val="0"/>
+                <w:sz w:val="20"/>
+                <w:szCs w:val="20"/>
+                <w:lang w:val="en-CO"/>
+                <w14:ligatures w14:val="none"/>
+              </w:rPr>
+              <w:t>800.785714285714</w:t>
+            </w:r>
+          </w:p>
+        </w:tc>
+        <w:tc>
+          <w:tcPr>
+            <w:tcW w:w="1290" w:type="dxa"/>
+            <w:tcBorders>
+              <w:top w:val="single" w:sz="6" w:space="0" w:color="000000"/>
+              <w:left w:val="single" w:sz="6" w:space="0" w:color="000000"/>
+              <w:bottom w:val="single" w:sz="6" w:space="0" w:color="000000"/>
+              <w:right w:val="single" w:sz="6" w:space="0" w:color="000000"/>
+            </w:tcBorders>
+            <w:tcMar>
+              <w:top w:w="60" w:type="dxa"/>
+              <w:left w:w="60" w:type="dxa"/>
+              <w:bottom w:w="60" w:type="dxa"/>
+              <w:right w:w="60" w:type="dxa"/>
+            </w:tcMar>
+            <w:hideMark/>
+          </w:tcPr>
+          <w:p>
+            <w:pPr>
+              <w:spacing w:after="0" w:line="240" w:lineRule="auto"/>
+              <w:rPr>
+                <w:rFonts w:ascii="Times New Roman" w:eastAsia="Times New Roman" w:hAnsi="Times New Roman" w:cs="Times New Roman"/>
+                <w:kern w:val="0"/>
+                <w:sz w:val="20"/>
+                <w:szCs w:val="20"/>
+                <w:lang w:val="en-CO"/>
+                <w14:ligatures w14:val="none"/>
+              </w:rPr>
+            </w:pPr>
+            <w:r>
+              <w:rPr>
+                <w:rFonts w:ascii="Times New Roman" w:eastAsia="Times New Roman" w:hAnsi="Times New Roman" w:cs="Times New Roman"/>
+                <w:color w:val="000000"/>
+                <w:kern w:val="0"/>
+                <w:sz w:val="20"/>
+                <w:szCs w:val="20"/>
+                <w:lang w:val="en-CO"/>
+                <w14:ligatures w14:val="none"/>
+              </w:rPr>
+              <w:t>371728.016785714</w:t>
+            </w:r>
+          </w:p>
+        </w:tc>
+        <w:tc>
+          <w:tcPr>
+            <w:tcW w:w="1290" w:type="dxa"/>
+            <w:tcBorders>
+              <w:top w:val="single" w:sz="6" w:space="0" w:color="000000"/>
+              <w:left w:val="single" w:sz="6" w:space="0" w:color="000000"/>
+              <w:bottom w:val="single" w:sz="6" w:space="0" w:color="000000"/>
+              <w:right w:val="single" w:sz="6" w:space="0" w:color="000000"/>
+            </w:tcBorders>
+            <w:tcMar>
+              <w:top w:w="60" w:type="dxa"/>
+              <w:left w:w="60" w:type="dxa"/>
+              <w:bottom w:w="60" w:type="dxa"/>
+              <w:right w:w="60" w:type="dxa"/>
+            </w:tcMar>
+            <w:hideMark/>
+          </w:tcPr>
+          <w:p>
+            <w:pPr>
+              <w:spacing w:after="0" w:line="240" w:lineRule="auto"/>
+              <w:rPr>
+                <w:rFonts w:ascii="Times New Roman" w:eastAsia="Times New Roman" w:hAnsi="Times New Roman" w:cs="Times New Roman"/>
+                <w:kern w:val="0"/>
+                <w:sz w:val="20"/>
+                <w:szCs w:val="20"/>
+                <w:lang w:val="en-CO"/>
+                <w14:ligatures w14:val="none"/>
+              </w:rPr>
+            </w:pPr>
+            <w:r>
+              <w:rPr>
+                <w:rFonts w:ascii="Times New Roman" w:eastAsia="Times New Roman" w:hAnsi="Times New Roman" w:cs="Times New Roman"/>
+                <w:color w:val="000000"/>
+                <w:kern w:val="0"/>
+                <w:sz w:val="20"/>
+                <w:szCs w:val="20"/>
+                <w:lang w:val="en-CO"/>
+                <w14:ligatures w14:val="none"/>
+              </w:rPr>
+              <w:t>111045.821428571</w:t>
+            </w:r>
+          </w:p>
+        </w:tc>
+        <w:tc>
+          <w:tcPr>
+            <w:tcW w:w="1290" w:type="dxa"/>
+            <w:tcBorders>
+              <w:top w:val="single" w:sz="6" w:space="0" w:color="000000"/>
+              <w:left w:val="single" w:sz="6" w:space="0" w:color="000000"/>
+              <w:bottom w:val="single" w:sz="6" w:space="0" w:color="000000"/>
+              <w:right w:val="single" w:sz="6" w:space="0" w:color="000000"/>
+            </w:tcBorders>
+            <w:tcMar>
+              <w:top w:w="60" w:type="dxa"/>
+              <w:left w:w="60" w:type="dxa"/>
+              <w:bottom w:w="60" w:type="dxa"/>
+              <w:right w:w="60" w:type="dxa"/>
+            </w:tcMar>
+            <w:hideMark/>
+          </w:tcPr>
+          <w:p>
+            <w:pPr>
+              <w:spacing w:after="0" w:line="240" w:lineRule="auto"/>
+              <w:rPr>
+                <w:rFonts w:ascii="Times New Roman" w:eastAsia="Times New Roman" w:hAnsi="Times New Roman" w:cs="Times New Roman"/>
+                <w:kern w:val="0"/>
+                <w:sz w:val="20"/>
+                <w:szCs w:val="20"/>
+                <w:lang w:val="en-CO"/>
+                <w14:ligatures w14:val="none"/>
+              </w:rPr>
+            </w:pPr>
+            <w:r>
+              <w:rPr>
+                <w:rFonts w:ascii="Times New Roman" w:eastAsia="Times New Roman" w:hAnsi="Times New Roman" w:cs="Times New Roman"/>
+                <w:color w:val="000000"/>
+                <w:kern w:val="0"/>
+                <w:sz w:val="20"/>
+                <w:szCs w:val="20"/>
+                <w:lang w:val="en-CO"/>
+                <w14:ligatures w14:val="none"/>
+              </w:rPr>
+              <w:t>14577.7938571429</w:t>
+            </w:r>
+          </w:p>
+        </w:tc>
+      </w:tr>
+    </w:tbl>
+    <w:p>
+      <w:pPr>
         <w:rPr>
           <w:rFonts w:ascii="Times New Roman" w:hAnsi="Times New Roman" w:cs="Times New Roman"/>
           <w:b/>
           <w:bCs/>
           <w:highlight w:val="yellow"/>
         </w:rPr>
-        <w:lastRenderedPageBreak/>
-        <w:t>Gráficos</w:t>
-      </w:r>
-      <w:r>
+      </w:pPr>
+    </w:p>
+    <w:p>
+      <w:pPr>
         <w:rPr>
           <w:rFonts w:ascii="Times New Roman" w:hAnsi="Times New Roman" w:cs="Times New Roman"/>
           <w:b/>
           <w:bCs/>
           <w:highlight w:val="yellow"/>
         </w:rPr>
-        <w:t xml:space="preserve"> promedio periodos </w:t>
+      </w:pPr>
+      <w:r>
+        <w:rPr>
+          <w:rFonts w:ascii="Times New Roman" w:hAnsi="Times New Roman" w:cs="Times New Roman"/>
+          <w:b/>
+          <w:bCs/>
+        </w:rPr>
+        <w:t xml:space="preserve">Gráfico promedio visitas por periodo </w:t>
       </w:r>
     </w:p>
     <w:p>
@@ -8180,28 +9568,399 @@
           <w:highlight w:val="yellow"/>
         </w:rPr>
       </w:pPr>
+      <w:r>
+        <w:rPr>
+          <w:rFonts w:ascii="Times New Roman" w:hAnsi="Times New Roman" w:cs="Times New Roman"/>
+          <w:b/>
+          <w:bCs/>
+        </w:rPr>
+        <w:drawing>
+          <wp:inline distT="0" distB="0" distL="0" distR="0" wp14:anchorId="1D176A89" wp14:editId="35F38FCA">
+            <wp:extent cx="1617785" cy="2426677"/>
+            <wp:effectExtent l="0" t="0" r="0" b="0"/>
+            <wp:docPr id="107438457" name="Picture 1" descr="A graph of blue bars&#10;&#10;AI-generated content may be incorrect."/>
+            <wp:cNvGraphicFramePr>
+              <a:graphicFrameLocks xmlns:a="http://schemas.openxmlformats.org/drawingml/2006/main" noChangeAspect="1"/>
+            </wp:cNvGraphicFramePr>
+            <a:graphic xmlns:a="http://schemas.openxmlformats.org/drawingml/2006/main">
+              <a:graphicData uri="http://schemas.openxmlformats.org/drawingml/2006/picture">
+                <pic:pic xmlns:pic="http://schemas.openxmlformats.org/drawingml/2006/picture">
+                  <pic:nvPicPr>
+                    <pic:cNvPr id="107438457" name="Picture 1" descr="A graph of blue bars&#10;&#10;AI-generated content may be incorrect."/>
+                    <pic:cNvPicPr/>
+                  </pic:nvPicPr>
+                  <pic:blipFill>
+                    <a:blip r:embed="rId12"/>
+                    <a:stretch>
+                      <a:fillRect/>
+                    </a:stretch>
+                  </pic:blipFill>
+                  <pic:spPr>
+                    <a:xfrm>
+                      <a:off x="0" y="0"/>
+                      <a:ext cx="1634392" cy="2451587"/>
+                    </a:xfrm>
+                    <a:prstGeom prst="rect">
+                      <a:avLst/>
+                    </a:prstGeom>
+                  </pic:spPr>
+                </pic:pic>
+              </a:graphicData>
+            </a:graphic>
+          </wp:inline>
+        </w:drawing>
+      </w:r>
     </w:p>
     <w:p>
       <w:pPr>
+        <w:rPr>
+          <w:rFonts w:ascii="Times New Roman" w:hAnsi="Times New Roman" w:cs="Times New Roman"/>
+          <w:b/>
+          <w:bCs/>
+          <w:highlight w:val="yellow"/>
+        </w:rPr>
+      </w:pPr>
+      <w:r>
+        <w:rPr>
+          <w:rFonts w:ascii="Times New Roman" w:hAnsi="Times New Roman" w:cs="Times New Roman"/>
+          <w:b/>
+          <w:bCs/>
+        </w:rPr>
+        <w:t>Gráfico promedio visitas</w:t>
+      </w:r>
+      <w:r>
+        <w:rPr>
+          <w:rFonts w:ascii="Times New Roman" w:hAnsi="Times New Roman" w:cs="Times New Roman"/>
+          <w:b/>
+          <w:bCs/>
+        </w:rPr>
+        <w:t xml:space="preserve"> únicas</w:t>
+      </w:r>
+      <w:r>
+        <w:rPr>
+          <w:rFonts w:ascii="Times New Roman" w:hAnsi="Times New Roman" w:cs="Times New Roman"/>
+          <w:b/>
+          <w:bCs/>
+        </w:rPr>
+        <w:t xml:space="preserve"> por periodo </w:t>
+      </w:r>
+    </w:p>
+    <w:p>
+      <w:pPr>
         <w:ind w:left="360"/>
         <w:rPr>
           <w:rFonts w:ascii="Times New Roman" w:hAnsi="Times New Roman" w:cs="Times New Roman"/>
           <w:highlight w:val="yellow"/>
         </w:rPr>
       </w:pPr>
+      <w:r>
+        <w:rPr>
+          <w:rFonts w:ascii="Times New Roman" w:hAnsi="Times New Roman" w:cs="Times New Roman"/>
+        </w:rPr>
+        <w:drawing>
+          <wp:inline distT="0" distB="0" distL="0" distR="0" wp14:anchorId="3C2DFFC7" wp14:editId="5606F4B1">
+            <wp:extent cx="1750647" cy="2625969"/>
+            <wp:effectExtent l="0" t="0" r="2540" b="3175"/>
+            <wp:docPr id="1940206267" name="Picture 1" descr="A graph with red bars&#10;&#10;AI-generated content may be incorrect."/>
+            <wp:cNvGraphicFramePr>
+              <a:graphicFrameLocks xmlns:a="http://schemas.openxmlformats.org/drawingml/2006/main" noChangeAspect="1"/>
+            </wp:cNvGraphicFramePr>
+            <a:graphic xmlns:a="http://schemas.openxmlformats.org/drawingml/2006/main">
+              <a:graphicData uri="http://schemas.openxmlformats.org/drawingml/2006/picture">
+                <pic:pic xmlns:pic="http://schemas.openxmlformats.org/drawingml/2006/picture">
+                  <pic:nvPicPr>
+                    <pic:cNvPr id="1940206267" name="Picture 1" descr="A graph with red bars&#10;&#10;AI-generated content may be incorrect."/>
+                    <pic:cNvPicPr/>
+                  </pic:nvPicPr>
+                  <pic:blipFill>
+                    <a:blip r:embed="rId13"/>
+                    <a:stretch>
+                      <a:fillRect/>
+                    </a:stretch>
+                  </pic:blipFill>
+                  <pic:spPr>
+                    <a:xfrm>
+                      <a:off x="0" y="0"/>
+                      <a:ext cx="1769081" cy="2653620"/>
+                    </a:xfrm>
+                    <a:prstGeom prst="rect">
+                      <a:avLst/>
+                    </a:prstGeom>
+                  </pic:spPr>
+                </pic:pic>
+              </a:graphicData>
+            </a:graphic>
+          </wp:inline>
+        </w:drawing>
+      </w:r>
     </w:p>
     <w:p>
       <w:pPr>
-        <w:pStyle w:val="Prrafodelista"/>
+        <w:rPr>
+          <w:rFonts w:ascii="Times New Roman" w:hAnsi="Times New Roman" w:cs="Times New Roman"/>
+          <w:b/>
+          <w:bCs/>
+          <w:highlight w:val="yellow"/>
+        </w:rPr>
+      </w:pPr>
+      <w:r>
+        <w:rPr>
+          <w:rFonts w:ascii="Times New Roman" w:hAnsi="Times New Roman" w:cs="Times New Roman"/>
+          <w:b/>
+          <w:bCs/>
+        </w:rPr>
+        <w:lastRenderedPageBreak/>
+        <w:t xml:space="preserve">Gráfico promedio </w:t>
+      </w:r>
+      <w:r>
+        <w:rPr>
+          <w:rFonts w:ascii="Times New Roman" w:hAnsi="Times New Roman" w:cs="Times New Roman"/>
+          <w:b/>
+          <w:bCs/>
+        </w:rPr>
+        <w:t xml:space="preserve">ingresos </w:t>
+      </w:r>
+      <w:r>
+        <w:rPr>
+          <w:rFonts w:ascii="Times New Roman" w:hAnsi="Times New Roman" w:cs="Times New Roman"/>
+          <w:b/>
+          <w:bCs/>
+        </w:rPr>
+        <w:t xml:space="preserve">por periodo </w:t>
+      </w:r>
+    </w:p>
+    <w:p>
+      <w:pPr>
+        <w:ind w:left="360"/>
         <w:rPr>
           <w:rFonts w:ascii="Times New Roman" w:hAnsi="Times New Roman" w:cs="Times New Roman"/>
           <w:highlight w:val="yellow"/>
         </w:rPr>
       </w:pPr>
+      <w:r>
+        <w:rPr>
+          <w:rFonts w:ascii="Times New Roman" w:hAnsi="Times New Roman" w:cs="Times New Roman"/>
+        </w:rPr>
+        <w:drawing>
+          <wp:inline distT="0" distB="0" distL="0" distR="0" wp14:anchorId="11B13B1C" wp14:editId="2F5A1608">
+            <wp:extent cx="1715911" cy="2573867"/>
+            <wp:effectExtent l="0" t="0" r="0" b="4445"/>
+            <wp:docPr id="289511698" name="Picture 1" descr="A green bar graph with white text&#10;&#10;AI-generated content may be incorrect."/>
+            <wp:cNvGraphicFramePr>
+              <a:graphicFrameLocks xmlns:a="http://schemas.openxmlformats.org/drawingml/2006/main" noChangeAspect="1"/>
+            </wp:cNvGraphicFramePr>
+            <a:graphic xmlns:a="http://schemas.openxmlformats.org/drawingml/2006/main">
+              <a:graphicData uri="http://schemas.openxmlformats.org/drawingml/2006/picture">
+                <pic:pic xmlns:pic="http://schemas.openxmlformats.org/drawingml/2006/picture">
+                  <pic:nvPicPr>
+                    <pic:cNvPr id="289511698" name="Picture 1" descr="A green bar graph with white text&#10;&#10;AI-generated content may be incorrect."/>
+                    <pic:cNvPicPr/>
+                  </pic:nvPicPr>
+                  <pic:blipFill>
+                    <a:blip r:embed="rId14"/>
+                    <a:stretch>
+                      <a:fillRect/>
+                    </a:stretch>
+                  </pic:blipFill>
+                  <pic:spPr>
+                    <a:xfrm>
+                      <a:off x="0" y="0"/>
+                      <a:ext cx="1723333" cy="2585000"/>
+                    </a:xfrm>
+                    <a:prstGeom prst="rect">
+                      <a:avLst/>
+                    </a:prstGeom>
+                  </pic:spPr>
+                </pic:pic>
+              </a:graphicData>
+            </a:graphic>
+          </wp:inline>
+        </w:drawing>
+      </w:r>
     </w:p>
     <w:p>
       <w:pPr>
-        <w:pStyle w:val="Prrafodelista"/>
+        <w:rPr>
+          <w:rFonts w:ascii="Times New Roman" w:hAnsi="Times New Roman" w:cs="Times New Roman"/>
+          <w:b/>
+          <w:bCs/>
+          <w:highlight w:val="yellow"/>
+        </w:rPr>
+      </w:pPr>
+      <w:r>
+        <w:rPr>
+          <w:rFonts w:ascii="Times New Roman" w:hAnsi="Times New Roman" w:cs="Times New Roman"/>
+          <w:b/>
+          <w:bCs/>
+        </w:rPr>
+        <w:t xml:space="preserve">Gráfico promedio </w:t>
+      </w:r>
+      <w:r>
+        <w:rPr>
+          <w:rFonts w:ascii="Times New Roman" w:hAnsi="Times New Roman" w:cs="Times New Roman"/>
+          <w:b/>
+          <w:bCs/>
+        </w:rPr>
+        <w:t>beneficios</w:t>
+      </w:r>
+      <w:r>
+        <w:rPr>
+          <w:rFonts w:ascii="Times New Roman" w:hAnsi="Times New Roman" w:cs="Times New Roman"/>
+          <w:b/>
+          <w:bCs/>
+        </w:rPr>
+        <w:t xml:space="preserve"> por periodo </w:t>
+      </w:r>
+    </w:p>
+    <w:p>
+      <w:pPr>
+        <w:rPr>
+          <w:rFonts w:ascii="Times New Roman" w:hAnsi="Times New Roman" w:cs="Times New Roman"/>
+          <w:highlight w:val="yellow"/>
+        </w:rPr>
+      </w:pPr>
+      <w:r>
+        <w:drawing>
+          <wp:inline distT="0" distB="0" distL="0" distR="0" wp14:anchorId="0ED6ED5E" wp14:editId="1A749DE5">
+            <wp:extent cx="1729409" cy="2594114"/>
+            <wp:effectExtent l="0" t="0" r="0" b="0"/>
+            <wp:docPr id="152120488" name="Picture 1" descr="A graph with purple bars&#10;&#10;AI-generated content may be incorrect."/>
+            <wp:cNvGraphicFramePr>
+              <a:graphicFrameLocks xmlns:a="http://schemas.openxmlformats.org/drawingml/2006/main" noChangeAspect="1"/>
+            </wp:cNvGraphicFramePr>
+            <a:graphic xmlns:a="http://schemas.openxmlformats.org/drawingml/2006/main">
+              <a:graphicData uri="http://schemas.openxmlformats.org/drawingml/2006/picture">
+                <pic:pic xmlns:pic="http://schemas.openxmlformats.org/drawingml/2006/picture">
+                  <pic:nvPicPr>
+                    <pic:cNvPr id="152120488" name="Picture 1" descr="A graph with purple bars&#10;&#10;AI-generated content may be incorrect."/>
+                    <pic:cNvPicPr/>
+                  </pic:nvPicPr>
+                  <pic:blipFill>
+                    <a:blip r:embed="rId15"/>
+                    <a:stretch>
+                      <a:fillRect/>
+                    </a:stretch>
+                  </pic:blipFill>
+                  <pic:spPr>
+                    <a:xfrm>
+                      <a:off x="0" y="0"/>
+                      <a:ext cx="1735306" cy="2602960"/>
+                    </a:xfrm>
+                    <a:prstGeom prst="rect">
+                      <a:avLst/>
+                    </a:prstGeom>
+                  </pic:spPr>
+                </pic:pic>
+              </a:graphicData>
+            </a:graphic>
+          </wp:inline>
+        </w:drawing>
+      </w:r>
+    </w:p>
+    <w:p>
+      <w:pPr>
+        <w:rPr>
+          <w:rFonts w:ascii="Times New Roman" w:hAnsi="Times New Roman" w:cs="Times New Roman"/>
+          <w:b/>
+          <w:bCs/>
+          <w:highlight w:val="yellow"/>
+        </w:rPr>
+      </w:pPr>
+      <w:r>
+        <w:rPr>
+          <w:rFonts w:ascii="Times New Roman" w:hAnsi="Times New Roman" w:cs="Times New Roman"/>
+          <w:b/>
+          <w:bCs/>
+        </w:rPr>
+        <w:t xml:space="preserve">Gráfico promedio </w:t>
+      </w:r>
+      <w:proofErr w:type="spellStart"/>
+      <w:r>
+        <w:rPr>
+          <w:rFonts w:ascii="Times New Roman" w:hAnsi="Times New Roman" w:cs="Times New Roman"/>
+          <w:b/>
+          <w:bCs/>
+        </w:rPr>
+        <w:t>lbs</w:t>
+      </w:r>
+      <w:proofErr w:type="spellEnd"/>
+      <w:r>
+        <w:rPr>
+          <w:rFonts w:ascii="Times New Roman" w:hAnsi="Times New Roman" w:cs="Times New Roman"/>
+          <w:b/>
+          <w:bCs/>
+        </w:rPr>
+        <w:t xml:space="preserve"> vendidas </w:t>
+      </w:r>
+      <w:r>
+        <w:rPr>
+          <w:rFonts w:ascii="Times New Roman" w:hAnsi="Times New Roman" w:cs="Times New Roman"/>
+          <w:b/>
+          <w:bCs/>
+        </w:rPr>
+        <w:t xml:space="preserve"> por periodo </w:t>
+      </w:r>
+    </w:p>
+    <w:p>
+      <w:pPr>
+        <w:rPr>
+          <w:rFonts w:ascii="Times New Roman" w:hAnsi="Times New Roman" w:cs="Times New Roman"/>
+          <w:highlight w:val="yellow"/>
+        </w:rPr>
+      </w:pPr>
+      <w:r>
+        <w:rPr>
+          <w:rFonts w:ascii="Times New Roman" w:hAnsi="Times New Roman" w:cs="Times New Roman"/>
+        </w:rPr>
+        <w:lastRenderedPageBreak/>
+        <w:drawing>
+          <wp:inline distT="0" distB="0" distL="0" distR="0" wp14:anchorId="7DD9E444" wp14:editId="1CD7B509">
+            <wp:extent cx="1588168" cy="2382253"/>
+            <wp:effectExtent l="0" t="0" r="0" b="5715"/>
+            <wp:docPr id="146729911" name="Picture 1" descr="A graph with orange bars&#10;&#10;AI-generated content may be incorrect."/>
+            <wp:cNvGraphicFramePr>
+              <a:graphicFrameLocks xmlns:a="http://schemas.openxmlformats.org/drawingml/2006/main" noChangeAspect="1"/>
+            </wp:cNvGraphicFramePr>
+            <a:graphic xmlns:a="http://schemas.openxmlformats.org/drawingml/2006/main">
+              <a:graphicData uri="http://schemas.openxmlformats.org/drawingml/2006/picture">
+                <pic:pic xmlns:pic="http://schemas.openxmlformats.org/drawingml/2006/picture">
+                  <pic:nvPicPr>
+                    <pic:cNvPr id="146729911" name="Picture 1" descr="A graph with orange bars&#10;&#10;AI-generated content may be incorrect."/>
+                    <pic:cNvPicPr/>
+                  </pic:nvPicPr>
+                  <pic:blipFill>
+                    <a:blip r:embed="rId16"/>
+                    <a:stretch>
+                      <a:fillRect/>
+                    </a:stretch>
+                  </pic:blipFill>
+                  <pic:spPr>
+                    <a:xfrm>
+                      <a:off x="0" y="0"/>
+                      <a:ext cx="1625343" cy="2438016"/>
+                    </a:xfrm>
+                    <a:prstGeom prst="rect">
+                      <a:avLst/>
+                    </a:prstGeom>
+                  </pic:spPr>
+                </pic:pic>
+              </a:graphicData>
+            </a:graphic>
+          </wp:inline>
+        </w:drawing>
+      </w:r>
+    </w:p>
+    <w:p>
+      <w:pPr>
+        <w:rPr>
+          <w:rFonts w:ascii="Times New Roman" w:hAnsi="Times New Roman" w:cs="Times New Roman"/>
+          <w:highlight w:val="yellow"/>
+        </w:rPr>
+      </w:pPr>
+    </w:p>
+    <w:p>
+      <w:pPr>
+        <w:pStyle w:val="ListParagraph"/>
         <w:numPr>
           <w:ilvl w:val="0"/>
           <w:numId w:val="2"/>
@@ -8301,7 +10060,7 @@
     </w:p>
     <w:p>
       <w:pPr>
-        <w:pStyle w:val="Prrafodelista"/>
+        <w:pStyle w:val="ListParagraph"/>
         <w:numPr>
           <w:ilvl w:val="0"/>
           <w:numId w:val="2"/>
@@ -8319,6 +10078,7 @@
           <w:b/>
           <w:bCs/>
         </w:rPr>
+        <w:lastRenderedPageBreak/>
         <w:t>Scatter</w:t>
       </w:r>
       <w:proofErr w:type="spellEnd"/>
@@ -8351,7 +10111,6 @@
         <w:rPr>
           <w:noProof/>
         </w:rPr>
-        <w:lastRenderedPageBreak/>
         <w:drawing>
           <wp:inline distT="0" distB="0" distL="0" distR="0" wp14:anchorId="1F0E1D16" wp14:editId="5B62FAFC">
             <wp:extent cx="3665855" cy="2849245"/>
@@ -8370,7 +10129,7 @@
                     </pic:cNvPicPr>
                   </pic:nvPicPr>
                   <pic:blipFill>
-                    <a:blip r:embed="rId12">
+                    <a:blip r:embed="rId17">
                       <a:extLst>
                         <a:ext uri="{28A0092B-C50C-407E-A947-70E740481C1C}">
                           <a14:useLocalDpi xmlns:a14="http://schemas.microsoft.com/office/drawing/2010/main" val="0"/>
@@ -8435,62 +10194,7 @@
     </w:p>
     <w:p>
       <w:pPr>
-        <w:rPr>
-          <w:rStyle w:val="eop"/>
-          <w:rFonts w:ascii="Times New Roman" w:hAnsi="Times New Roman" w:cs="Times New Roman"/>
-          <w:color w:val="000000"/>
-          <w:bdr w:val="none" w:sz="0" w:space="0" w:color="auto" w:frame="1"/>
-          <w:shd w:val="clear" w:color="auto" w:fill="C6C6C6"/>
-        </w:rPr>
-      </w:pPr>
-    </w:p>
-    <w:p>
-      <w:pPr>
-        <w:rPr>
-          <w:rStyle w:val="eop"/>
-          <w:rFonts w:ascii="Times New Roman" w:hAnsi="Times New Roman" w:cs="Times New Roman"/>
-          <w:color w:val="000000"/>
-          <w:bdr w:val="none" w:sz="0" w:space="0" w:color="auto" w:frame="1"/>
-          <w:shd w:val="clear" w:color="auto" w:fill="C6C6C6"/>
-        </w:rPr>
-      </w:pPr>
-    </w:p>
-    <w:p>
-      <w:pPr>
-        <w:rPr>
-          <w:rStyle w:val="eop"/>
-          <w:rFonts w:ascii="Times New Roman" w:hAnsi="Times New Roman" w:cs="Times New Roman"/>
-          <w:color w:val="000000"/>
-          <w:bdr w:val="none" w:sz="0" w:space="0" w:color="auto" w:frame="1"/>
-          <w:shd w:val="clear" w:color="auto" w:fill="C6C6C6"/>
-        </w:rPr>
-      </w:pPr>
-    </w:p>
-    <w:p>
-      <w:pPr>
-        <w:rPr>
-          <w:rStyle w:val="eop"/>
-          <w:rFonts w:ascii="Times New Roman" w:hAnsi="Times New Roman" w:cs="Times New Roman"/>
-          <w:color w:val="000000"/>
-          <w:bdr w:val="none" w:sz="0" w:space="0" w:color="auto" w:frame="1"/>
-          <w:shd w:val="clear" w:color="auto" w:fill="C6C6C6"/>
-        </w:rPr>
-      </w:pPr>
-    </w:p>
-    <w:p>
-      <w:pPr>
-        <w:rPr>
-          <w:rStyle w:val="eop"/>
-          <w:rFonts w:ascii="Times New Roman" w:hAnsi="Times New Roman" w:cs="Times New Roman"/>
-          <w:color w:val="000000"/>
-          <w:bdr w:val="none" w:sz="0" w:space="0" w:color="auto" w:frame="1"/>
-          <w:shd w:val="clear" w:color="auto" w:fill="C6C6C6"/>
-        </w:rPr>
-      </w:pPr>
-    </w:p>
-    <w:p>
-      <w:pPr>
-        <w:pStyle w:val="Prrafodelista"/>
+        <w:pStyle w:val="ListParagraph"/>
         <w:numPr>
           <w:ilvl w:val="0"/>
           <w:numId w:val="2"/>
@@ -8559,7 +10263,7 @@
                     </pic:cNvPicPr>
                   </pic:nvPicPr>
                   <pic:blipFill>
-                    <a:blip r:embed="rId13">
+                    <a:blip r:embed="rId18">
                       <a:extLst>
                         <a:ext uri="{28A0092B-C50C-407E-A947-70E740481C1C}">
                           <a14:useLocalDpi xmlns:a14="http://schemas.microsoft.com/office/drawing/2010/main" val="0"/>
@@ -8602,13 +10306,36 @@
         <w:rPr>
           <w:rFonts w:ascii="Times New Roman" w:hAnsi="Times New Roman" w:cs="Times New Roman"/>
         </w:rPr>
-        <w:lastRenderedPageBreak/>
         <w:t>Correlación: -0.05939183</w:t>
       </w:r>
     </w:p>
     <w:p>
       <w:pPr>
-        <w:pStyle w:val="Prrafodelista"/>
+        <w:ind w:left="360"/>
+        <w:rPr>
+          <w:rFonts w:ascii="Times New Roman" w:hAnsi="Times New Roman" w:cs="Times New Roman"/>
+        </w:rPr>
+      </w:pPr>
+    </w:p>
+    <w:p>
+      <w:pPr>
+        <w:ind w:left="360"/>
+        <w:rPr>
+          <w:rFonts w:ascii="Times New Roman" w:hAnsi="Times New Roman" w:cs="Times New Roman"/>
+        </w:rPr>
+      </w:pPr>
+    </w:p>
+    <w:p>
+      <w:pPr>
+        <w:ind w:left="360"/>
+        <w:rPr>
+          <w:rFonts w:ascii="Times New Roman" w:hAnsi="Times New Roman" w:cs="Times New Roman"/>
+        </w:rPr>
+      </w:pPr>
+    </w:p>
+    <w:p>
+      <w:pPr>
+        <w:pStyle w:val="ListParagraph"/>
         <w:numPr>
           <w:ilvl w:val="0"/>
           <w:numId w:val="2"/>
@@ -8625,6 +10352,7 @@
           <w:b/>
           <w:bCs/>
         </w:rPr>
+        <w:lastRenderedPageBreak/>
         <w:t xml:space="preserve">Análisis resultados </w:t>
       </w:r>
     </w:p>
@@ -8878,6 +10606,21 @@
         </w:rPr>
         <w:t> </w:t>
       </w:r>
+    </w:p>
+    <w:p>
+      <w:pPr>
+        <w:pStyle w:val="paragraph"/>
+        <w:spacing w:before="0" w:beforeAutospacing="0" w:after="0" w:afterAutospacing="0" w:line="276" w:lineRule="auto"/>
+        <w:jc w:val="both"/>
+        <w:textAlignment w:val="baseline"/>
+        <w:rPr>
+          <w:rStyle w:val="eop"/>
+          <w:rFonts w:eastAsiaTheme="majorEastAsia"/>
+          <w:bdr w:val="none" w:sz="0" w:space="0" w:color="auto" w:frame="1"/>
+          <w:shd w:val="clear" w:color="auto" w:fill="C6C6C6"/>
+          <w:lang w:val="es-ES"/>
+        </w:rPr>
+      </w:pPr>
     </w:p>
     <w:p>
       <w:pPr>
@@ -9265,7 +11008,6 @@
                 <w:kern w:val="0"/>
                 <w:sz w:val="20"/>
                 <w:szCs w:val="20"/>
-                <w:lang/>
                 <w14:ligatures w14:val="none"/>
               </w:rPr>
             </w:pPr>
@@ -9278,7 +11020,6 @@
                 <w:kern w:val="0"/>
                 <w:sz w:val="20"/>
                 <w:szCs w:val="20"/>
-                <w:lang/>
                 <w14:ligatures w14:val="none"/>
               </w:rPr>
               <w:t>Statistic</w:t>
@@ -9311,7 +11052,6 @@
                 <w:kern w:val="0"/>
                 <w:sz w:val="20"/>
                 <w:szCs w:val="20"/>
-                <w:lang/>
                 <w14:ligatures w14:val="none"/>
               </w:rPr>
             </w:pPr>
@@ -9324,7 +11064,6 @@
                 <w:kern w:val="0"/>
                 <w:sz w:val="20"/>
                 <w:szCs w:val="20"/>
-                <w:lang/>
                 <w14:ligatures w14:val="none"/>
               </w:rPr>
               <w:t>Value</w:t>
@@ -9362,7 +11101,6 @@
                 <w:kern w:val="0"/>
                 <w:sz w:val="20"/>
                 <w:szCs w:val="20"/>
-                <w:lang/>
                 <w14:ligatures w14:val="none"/>
               </w:rPr>
             </w:pPr>
@@ -9375,7 +11113,6 @@
                 <w:kern w:val="0"/>
                 <w:sz w:val="20"/>
                 <w:szCs w:val="20"/>
-                <w:lang/>
                 <w14:ligatures w14:val="none"/>
               </w:rPr>
               <w:t>Mean</w:t>
@@ -9407,7 +11144,6 @@
                 <w:kern w:val="0"/>
                 <w:sz w:val="20"/>
                 <w:szCs w:val="20"/>
-                <w:lang/>
                 <w14:ligatures w14:val="none"/>
               </w:rPr>
             </w:pPr>
@@ -9418,7 +11154,6 @@
                 <w:kern w:val="0"/>
                 <w:sz w:val="20"/>
                 <w:szCs w:val="20"/>
-                <w:lang/>
                 <w14:ligatures w14:val="none"/>
               </w:rPr>
               <w:t>17342.1100606061</w:t>
@@ -9456,7 +11191,6 @@
                 <w:kern w:val="0"/>
                 <w:sz w:val="20"/>
                 <w:szCs w:val="20"/>
-                <w:lang/>
                 <w14:ligatures w14:val="none"/>
               </w:rPr>
             </w:pPr>
@@ -9469,7 +11203,6 @@
                 <w:kern w:val="0"/>
                 <w:sz w:val="20"/>
                 <w:szCs w:val="20"/>
-                <w:lang/>
                 <w14:ligatures w14:val="none"/>
               </w:rPr>
               <w:t>Median</w:t>
@@ -9501,7 +11234,6 @@
                 <w:kern w:val="0"/>
                 <w:sz w:val="20"/>
                 <w:szCs w:val="20"/>
-                <w:lang/>
                 <w14:ligatures w14:val="none"/>
               </w:rPr>
             </w:pPr>
@@ -9512,7 +11244,6 @@
                 <w:kern w:val="0"/>
                 <w:sz w:val="20"/>
                 <w:szCs w:val="20"/>
-                <w:lang/>
                 <w14:ligatures w14:val="none"/>
               </w:rPr>
               <w:t>17215.73</w:t>
@@ -9550,7 +11281,6 @@
                 <w:kern w:val="0"/>
                 <w:sz w:val="20"/>
                 <w:szCs w:val="20"/>
-                <w:lang/>
                 <w14:ligatures w14:val="none"/>
               </w:rPr>
             </w:pPr>
@@ -9563,7 +11293,6 @@
                 <w:kern w:val="0"/>
                 <w:sz w:val="20"/>
                 <w:szCs w:val="20"/>
-                <w:lang/>
                 <w14:ligatures w14:val="none"/>
               </w:rPr>
               <w:t>Std Dev</w:t>
@@ -9595,7 +11324,6 @@
                 <w:kern w:val="0"/>
                 <w:sz w:val="20"/>
                 <w:szCs w:val="20"/>
-                <w:lang/>
                 <w14:ligatures w14:val="none"/>
               </w:rPr>
             </w:pPr>
@@ -9606,7 +11334,6 @@
                 <w:kern w:val="0"/>
                 <w:sz w:val="20"/>
                 <w:szCs w:val="20"/>
-                <w:lang/>
                 <w14:ligatures w14:val="none"/>
               </w:rPr>
               <w:t>6068.91344884695</w:t>
@@ -9644,7 +11371,6 @@
                 <w:kern w:val="0"/>
                 <w:sz w:val="20"/>
                 <w:szCs w:val="20"/>
-                <w:lang/>
                 <w14:ligatures w14:val="none"/>
               </w:rPr>
             </w:pPr>
@@ -9657,7 +11383,6 @@
                 <w:kern w:val="0"/>
                 <w:sz w:val="20"/>
                 <w:szCs w:val="20"/>
-                <w:lang/>
                 <w14:ligatures w14:val="none"/>
               </w:rPr>
               <w:t>Minimum</w:t>
@@ -9689,7 +11414,6 @@
                 <w:kern w:val="0"/>
                 <w:sz w:val="20"/>
                 <w:szCs w:val="20"/>
-                <w:lang/>
                 <w14:ligatures w14:val="none"/>
               </w:rPr>
             </w:pPr>
@@ -9700,7 +11424,6 @@
                 <w:kern w:val="0"/>
                 <w:sz w:val="20"/>
                 <w:szCs w:val="20"/>
-                <w:lang/>
                 <w14:ligatures w14:val="none"/>
               </w:rPr>
               <w:t>3825.748</w:t>
@@ -9738,7 +11461,6 @@
                 <w:kern w:val="0"/>
                 <w:sz w:val="20"/>
                 <w:szCs w:val="20"/>
-                <w:lang/>
                 <w14:ligatures w14:val="none"/>
               </w:rPr>
             </w:pPr>
@@ -9751,7 +11473,6 @@
                 <w:kern w:val="0"/>
                 <w:sz w:val="20"/>
                 <w:szCs w:val="20"/>
-                <w:lang/>
                 <w14:ligatures w14:val="none"/>
               </w:rPr>
               <w:t>Maximum</w:t>
@@ -9783,7 +11504,6 @@
                 <w:kern w:val="0"/>
                 <w:sz w:val="20"/>
                 <w:szCs w:val="20"/>
-                <w:lang/>
                 <w14:ligatures w14:val="none"/>
               </w:rPr>
             </w:pPr>
@@ -9794,7 +11514,6 @@
                 <w:kern w:val="0"/>
                 <w:sz w:val="20"/>
                 <w:szCs w:val="20"/>
-                <w:lang/>
                 <w14:ligatures w14:val="none"/>
               </w:rPr>
               <w:t>31968.976</w:t>
@@ -9861,7 +11580,7 @@
                     <pic:cNvPicPr/>
                   </pic:nvPicPr>
                   <pic:blipFill>
-                    <a:blip r:embed="rId14">
+                    <a:blip r:embed="rId19">
                       <a:extLst>
                         <a:ext uri="{28A0092B-C50C-407E-A947-70E740481C1C}">
                           <a14:useLocalDpi xmlns:a14="http://schemas.microsoft.com/office/drawing/2010/main" val="0"/>
@@ -10264,7 +11983,6 @@
                 <w:kern w:val="0"/>
                 <w:sz w:val="20"/>
                 <w:szCs w:val="20"/>
-                <w:lang/>
                 <w14:ligatures w14:val="none"/>
               </w:rPr>
             </w:pPr>
@@ -10277,7 +11995,6 @@
                 <w:kern w:val="0"/>
                 <w:sz w:val="20"/>
                 <w:szCs w:val="20"/>
-                <w:lang/>
                 <w14:ligatures w14:val="none"/>
               </w:rPr>
               <w:t>Interval</w:t>
@@ -10310,7 +12027,6 @@
                 <w:kern w:val="0"/>
                 <w:sz w:val="20"/>
                 <w:szCs w:val="20"/>
-                <w:lang/>
                 <w14:ligatures w14:val="none"/>
               </w:rPr>
             </w:pPr>
@@ -10323,7 +12039,6 @@
                 <w:kern w:val="0"/>
                 <w:sz w:val="20"/>
                 <w:szCs w:val="20"/>
-                <w:lang/>
                 <w14:ligatures w14:val="none"/>
               </w:rPr>
               <w:t>Theoretical_Percentage</w:t>
@@ -10356,7 +12071,6 @@
                 <w:kern w:val="0"/>
                 <w:sz w:val="20"/>
                 <w:szCs w:val="20"/>
-                <w:lang/>
                 <w14:ligatures w14:val="none"/>
               </w:rPr>
             </w:pPr>
@@ -10369,7 +12083,6 @@
                 <w:kern w:val="0"/>
                 <w:sz w:val="20"/>
                 <w:szCs w:val="20"/>
-                <w:lang/>
                 <w14:ligatures w14:val="none"/>
               </w:rPr>
               <w:t>Theoretical_Observations</w:t>
@@ -10402,7 +12115,6 @@
                 <w:kern w:val="0"/>
                 <w:sz w:val="20"/>
                 <w:szCs w:val="20"/>
-                <w:lang/>
                 <w14:ligatures w14:val="none"/>
               </w:rPr>
             </w:pPr>
@@ -10415,7 +12127,6 @@
                 <w:kern w:val="0"/>
                 <w:sz w:val="20"/>
                 <w:szCs w:val="20"/>
-                <w:lang/>
                 <w14:ligatures w14:val="none"/>
               </w:rPr>
               <w:t>Actual_Observations</w:t>
@@ -10453,7 +12164,6 @@
                 <w:kern w:val="0"/>
                 <w:sz w:val="20"/>
                 <w:szCs w:val="20"/>
-                <w:lang/>
                 <w14:ligatures w14:val="none"/>
               </w:rPr>
             </w:pPr>
@@ -10466,7 +12176,6 @@
                 <w:kern w:val="0"/>
                 <w:sz w:val="20"/>
                 <w:szCs w:val="20"/>
-                <w:lang/>
                 <w14:ligatures w14:val="none"/>
               </w:rPr>
               <w:t>mean ± 1 sd</w:t>
@@ -10498,7 +12207,6 @@
                 <w:kern w:val="0"/>
                 <w:sz w:val="20"/>
                 <w:szCs w:val="20"/>
-                <w:lang/>
                 <w14:ligatures w14:val="none"/>
               </w:rPr>
             </w:pPr>
@@ -10509,7 +12217,6 @@
                 <w:kern w:val="0"/>
                 <w:sz w:val="20"/>
                 <w:szCs w:val="20"/>
-                <w:lang/>
                 <w14:ligatures w14:val="none"/>
               </w:rPr>
               <w:t>68 %</w:t>
@@ -10541,7 +12248,6 @@
                 <w:kern w:val="0"/>
                 <w:sz w:val="20"/>
                 <w:szCs w:val="20"/>
-                <w:lang/>
                 <w14:ligatures w14:val="none"/>
               </w:rPr>
             </w:pPr>
@@ -10552,7 +12258,6 @@
                 <w:kern w:val="0"/>
                 <w:sz w:val="20"/>
                 <w:szCs w:val="20"/>
-                <w:lang/>
                 <w14:ligatures w14:val="none"/>
               </w:rPr>
               <w:t>44.88</w:t>
@@ -10584,7 +12289,6 @@
                 <w:kern w:val="0"/>
                 <w:sz w:val="20"/>
                 <w:szCs w:val="20"/>
-                <w:lang/>
                 <w14:ligatures w14:val="none"/>
               </w:rPr>
             </w:pPr>
@@ -10595,7 +12299,6 @@
                 <w:kern w:val="0"/>
                 <w:sz w:val="20"/>
                 <w:szCs w:val="20"/>
-                <w:lang/>
                 <w14:ligatures w14:val="none"/>
               </w:rPr>
               <w:t>45</w:t>
@@ -10633,7 +12336,6 @@
                 <w:kern w:val="0"/>
                 <w:sz w:val="20"/>
                 <w:szCs w:val="20"/>
-                <w:lang/>
                 <w14:ligatures w14:val="none"/>
               </w:rPr>
             </w:pPr>
@@ -10646,7 +12348,6 @@
                 <w:kern w:val="0"/>
                 <w:sz w:val="20"/>
                 <w:szCs w:val="20"/>
-                <w:lang/>
                 <w14:ligatures w14:val="none"/>
               </w:rPr>
               <w:t>mean ± 2 sd</w:t>
@@ -10678,7 +12379,6 @@
                 <w:kern w:val="0"/>
                 <w:sz w:val="20"/>
                 <w:szCs w:val="20"/>
-                <w:lang/>
                 <w14:ligatures w14:val="none"/>
               </w:rPr>
             </w:pPr>
@@ -10689,7 +12389,6 @@
                 <w:kern w:val="0"/>
                 <w:sz w:val="20"/>
                 <w:szCs w:val="20"/>
-                <w:lang/>
                 <w14:ligatures w14:val="none"/>
               </w:rPr>
               <w:t>95 %</w:t>
@@ -10721,7 +12420,6 @@
                 <w:kern w:val="0"/>
                 <w:sz w:val="20"/>
                 <w:szCs w:val="20"/>
-                <w:lang/>
                 <w14:ligatures w14:val="none"/>
               </w:rPr>
             </w:pPr>
@@ -10732,7 +12430,6 @@
                 <w:kern w:val="0"/>
                 <w:sz w:val="20"/>
                 <w:szCs w:val="20"/>
-                <w:lang/>
                 <w14:ligatures w14:val="none"/>
               </w:rPr>
               <w:t>62.7</w:t>
@@ -10764,7 +12461,6 @@
                 <w:kern w:val="0"/>
                 <w:sz w:val="20"/>
                 <w:szCs w:val="20"/>
-                <w:lang/>
                 <w14:ligatures w14:val="none"/>
               </w:rPr>
             </w:pPr>
@@ -10775,7 +12471,6 @@
                 <w:kern w:val="0"/>
                 <w:sz w:val="20"/>
                 <w:szCs w:val="20"/>
-                <w:lang/>
                 <w14:ligatures w14:val="none"/>
               </w:rPr>
               <w:t>63</w:t>
@@ -10813,7 +12508,6 @@
                 <w:kern w:val="0"/>
                 <w:sz w:val="20"/>
                 <w:szCs w:val="20"/>
-                <w:lang/>
                 <w14:ligatures w14:val="none"/>
               </w:rPr>
             </w:pPr>
@@ -10826,7 +12520,6 @@
                 <w:kern w:val="0"/>
                 <w:sz w:val="20"/>
                 <w:szCs w:val="20"/>
-                <w:lang/>
                 <w14:ligatures w14:val="none"/>
               </w:rPr>
               <w:t>mean ± 3 sd</w:t>
@@ -10858,7 +12551,6 @@
                 <w:kern w:val="0"/>
                 <w:sz w:val="20"/>
                 <w:szCs w:val="20"/>
-                <w:lang/>
                 <w14:ligatures w14:val="none"/>
               </w:rPr>
             </w:pPr>
@@ -10869,7 +12561,6 @@
                 <w:kern w:val="0"/>
                 <w:sz w:val="20"/>
                 <w:szCs w:val="20"/>
-                <w:lang/>
                 <w14:ligatures w14:val="none"/>
               </w:rPr>
               <w:t>99 %</w:t>
@@ -10901,7 +12592,6 @@
                 <w:kern w:val="0"/>
                 <w:sz w:val="20"/>
                 <w:szCs w:val="20"/>
-                <w:lang/>
                 <w14:ligatures w14:val="none"/>
               </w:rPr>
             </w:pPr>
@@ -10912,7 +12602,6 @@
                 <w:kern w:val="0"/>
                 <w:sz w:val="20"/>
                 <w:szCs w:val="20"/>
-                <w:lang/>
                 <w14:ligatures w14:val="none"/>
               </w:rPr>
               <w:t>65.34</w:t>
@@ -10944,7 +12633,6 @@
                 <w:kern w:val="0"/>
                 <w:sz w:val="20"/>
                 <w:szCs w:val="20"/>
-                <w:lang/>
                 <w14:ligatures w14:val="none"/>
               </w:rPr>
             </w:pPr>
@@ -10955,7 +12643,6 @@
                 <w:kern w:val="0"/>
                 <w:sz w:val="20"/>
                 <w:szCs w:val="20"/>
-                <w:lang/>
                 <w14:ligatures w14:val="none"/>
               </w:rPr>
               <w:t>66</w:t>
@@ -11078,7 +12765,6 @@
               <w:rPr>
                 <w:rFonts w:ascii="Times New Roman" w:eastAsia="Times New Roman" w:hAnsi="Times New Roman" w:cs="Times New Roman"/>
                 <w:kern w:val="0"/>
-                <w:lang/>
                 <w14:ligatures w14:val="none"/>
               </w:rPr>
             </w:pPr>
@@ -11091,7 +12777,6 @@
                 <w:kern w:val="0"/>
                 <w:sz w:val="15"/>
                 <w:szCs w:val="15"/>
-                <w:lang/>
                 <w14:ligatures w14:val="none"/>
               </w:rPr>
               <w:t>Interval</w:t>
@@ -11123,7 +12808,6 @@
               <w:rPr>
                 <w:rFonts w:ascii="Times New Roman" w:eastAsia="Times New Roman" w:hAnsi="Times New Roman" w:cs="Times New Roman"/>
                 <w:kern w:val="0"/>
-                <w:lang/>
                 <w14:ligatures w14:val="none"/>
               </w:rPr>
             </w:pPr>
@@ -11136,7 +12820,6 @@
                 <w:kern w:val="0"/>
                 <w:sz w:val="15"/>
                 <w:szCs w:val="15"/>
-                <w:lang/>
                 <w14:ligatures w14:val="none"/>
               </w:rPr>
               <w:t>Theoretical_Percentage</w:t>
@@ -11168,7 +12851,6 @@
               <w:rPr>
                 <w:rFonts w:ascii="Times New Roman" w:eastAsia="Times New Roman" w:hAnsi="Times New Roman" w:cs="Times New Roman"/>
                 <w:kern w:val="0"/>
-                <w:lang/>
                 <w14:ligatures w14:val="none"/>
               </w:rPr>
             </w:pPr>
@@ -11181,7 +12863,6 @@
                 <w:kern w:val="0"/>
                 <w:sz w:val="15"/>
                 <w:szCs w:val="15"/>
-                <w:lang/>
                 <w14:ligatures w14:val="none"/>
               </w:rPr>
               <w:t>Theoretical_No_Obs</w:t>
@@ -11213,7 +12894,6 @@
               <w:rPr>
                 <w:rFonts w:ascii="Times New Roman" w:eastAsia="Times New Roman" w:hAnsi="Times New Roman" w:cs="Times New Roman"/>
                 <w:kern w:val="0"/>
-                <w:lang/>
                 <w14:ligatures w14:val="none"/>
               </w:rPr>
             </w:pPr>
@@ -11226,7 +12906,6 @@
                 <w:kern w:val="0"/>
                 <w:sz w:val="15"/>
                 <w:szCs w:val="15"/>
-                <w:lang/>
                 <w14:ligatures w14:val="none"/>
               </w:rPr>
               <w:t>Actual_No_Obs</w:t>
@@ -11263,7 +12942,6 @@
               <w:rPr>
                 <w:rFonts w:ascii="Times New Roman" w:eastAsia="Times New Roman" w:hAnsi="Times New Roman" w:cs="Times New Roman"/>
                 <w:kern w:val="0"/>
-                <w:lang/>
                 <w14:ligatures w14:val="none"/>
               </w:rPr>
             </w:pPr>
@@ -11276,7 +12954,6 @@
                 <w:kern w:val="0"/>
                 <w:sz w:val="15"/>
                 <w:szCs w:val="15"/>
-                <w:lang/>
                 <w14:ligatures w14:val="none"/>
               </w:rPr>
               <w:t>mean to +1 std. dev.</w:t>
@@ -11307,18 +12984,16 @@
               <w:rPr>
                 <w:rFonts w:ascii="Times New Roman" w:eastAsia="Times New Roman" w:hAnsi="Times New Roman" w:cs="Times New Roman"/>
                 <w:kern w:val="0"/>
-                <w:lang/>
-                <w14:ligatures w14:val="none"/>
-              </w:rPr>
-            </w:pPr>
-            <w:r>
-              <w:rPr>
-                <w:rFonts w:ascii="Helvetica Neue" w:eastAsia="Times New Roman" w:hAnsi="Helvetica Neue" w:cs="Times New Roman"/>
-                <w:color w:val="000000"/>
-                <w:kern w:val="0"/>
-                <w:sz w:val="15"/>
-                <w:szCs w:val="15"/>
-                <w:lang/>
+                <w14:ligatures w14:val="none"/>
+              </w:rPr>
+            </w:pPr>
+            <w:r>
+              <w:rPr>
+                <w:rFonts w:ascii="Helvetica Neue" w:eastAsia="Times New Roman" w:hAnsi="Helvetica Neue" w:cs="Times New Roman"/>
+                <w:color w:val="000000"/>
+                <w:kern w:val="0"/>
+                <w:sz w:val="15"/>
+                <w:szCs w:val="15"/>
                 <w14:ligatures w14:val="none"/>
               </w:rPr>
               <w:t>34</w:t>
@@ -11349,18 +13024,16 @@
               <w:rPr>
                 <w:rFonts w:ascii="Times New Roman" w:eastAsia="Times New Roman" w:hAnsi="Times New Roman" w:cs="Times New Roman"/>
                 <w:kern w:val="0"/>
-                <w:lang/>
-                <w14:ligatures w14:val="none"/>
-              </w:rPr>
-            </w:pPr>
-            <w:r>
-              <w:rPr>
-                <w:rFonts w:ascii="Helvetica Neue" w:eastAsia="Times New Roman" w:hAnsi="Helvetica Neue" w:cs="Times New Roman"/>
-                <w:color w:val="000000"/>
-                <w:kern w:val="0"/>
-                <w:sz w:val="15"/>
-                <w:szCs w:val="15"/>
-                <w:lang/>
+                <w14:ligatures w14:val="none"/>
+              </w:rPr>
+            </w:pPr>
+            <w:r>
+              <w:rPr>
+                <w:rFonts w:ascii="Helvetica Neue" w:eastAsia="Times New Roman" w:hAnsi="Helvetica Neue" w:cs="Times New Roman"/>
+                <w:color w:val="000000"/>
+                <w:kern w:val="0"/>
+                <w:sz w:val="15"/>
+                <w:szCs w:val="15"/>
                 <w14:ligatures w14:val="none"/>
               </w:rPr>
               <w:t>22.44</w:t>
@@ -11391,18 +13064,16 @@
               <w:rPr>
                 <w:rFonts w:ascii="Times New Roman" w:eastAsia="Times New Roman" w:hAnsi="Times New Roman" w:cs="Times New Roman"/>
                 <w:kern w:val="0"/>
-                <w:lang/>
-                <w14:ligatures w14:val="none"/>
-              </w:rPr>
-            </w:pPr>
-            <w:r>
-              <w:rPr>
-                <w:rFonts w:ascii="Helvetica Neue" w:eastAsia="Times New Roman" w:hAnsi="Helvetica Neue" w:cs="Times New Roman"/>
-                <w:color w:val="000000"/>
-                <w:kern w:val="0"/>
-                <w:sz w:val="15"/>
-                <w:szCs w:val="15"/>
-                <w:lang/>
+                <w14:ligatures w14:val="none"/>
+              </w:rPr>
+            </w:pPr>
+            <w:r>
+              <w:rPr>
+                <w:rFonts w:ascii="Helvetica Neue" w:eastAsia="Times New Roman" w:hAnsi="Helvetica Neue" w:cs="Times New Roman"/>
+                <w:color w:val="000000"/>
+                <w:kern w:val="0"/>
+                <w:sz w:val="15"/>
+                <w:szCs w:val="15"/>
                 <w14:ligatures w14:val="none"/>
               </w:rPr>
               <w:t>18</w:t>
@@ -11439,7 +13110,6 @@
               <w:rPr>
                 <w:rFonts w:ascii="Times New Roman" w:eastAsia="Times New Roman" w:hAnsi="Times New Roman" w:cs="Times New Roman"/>
                 <w:kern w:val="0"/>
-                <w:lang/>
                 <w14:ligatures w14:val="none"/>
               </w:rPr>
             </w:pPr>
@@ -11452,7 +13122,6 @@
                 <w:kern w:val="0"/>
                 <w:sz w:val="15"/>
                 <w:szCs w:val="15"/>
-                <w:lang/>
                 <w14:ligatures w14:val="none"/>
               </w:rPr>
               <w:t>mean to -1 std. dev.</w:t>
@@ -11483,18 +13152,16 @@
               <w:rPr>
                 <w:rFonts w:ascii="Times New Roman" w:eastAsia="Times New Roman" w:hAnsi="Times New Roman" w:cs="Times New Roman"/>
                 <w:kern w:val="0"/>
-                <w:lang/>
-                <w14:ligatures w14:val="none"/>
-              </w:rPr>
-            </w:pPr>
-            <w:r>
-              <w:rPr>
-                <w:rFonts w:ascii="Helvetica Neue" w:eastAsia="Times New Roman" w:hAnsi="Helvetica Neue" w:cs="Times New Roman"/>
-                <w:color w:val="000000"/>
-                <w:kern w:val="0"/>
-                <w:sz w:val="15"/>
-                <w:szCs w:val="15"/>
-                <w:lang/>
+                <w14:ligatures w14:val="none"/>
+              </w:rPr>
+            </w:pPr>
+            <w:r>
+              <w:rPr>
+                <w:rFonts w:ascii="Helvetica Neue" w:eastAsia="Times New Roman" w:hAnsi="Helvetica Neue" w:cs="Times New Roman"/>
+                <w:color w:val="000000"/>
+                <w:kern w:val="0"/>
+                <w:sz w:val="15"/>
+                <w:szCs w:val="15"/>
                 <w14:ligatures w14:val="none"/>
               </w:rPr>
               <w:t>34</w:t>
@@ -11525,18 +13192,16 @@
               <w:rPr>
                 <w:rFonts w:ascii="Times New Roman" w:eastAsia="Times New Roman" w:hAnsi="Times New Roman" w:cs="Times New Roman"/>
                 <w:kern w:val="0"/>
-                <w:lang/>
-                <w14:ligatures w14:val="none"/>
-              </w:rPr>
-            </w:pPr>
-            <w:r>
-              <w:rPr>
-                <w:rFonts w:ascii="Helvetica Neue" w:eastAsia="Times New Roman" w:hAnsi="Helvetica Neue" w:cs="Times New Roman"/>
-                <w:color w:val="000000"/>
-                <w:kern w:val="0"/>
-                <w:sz w:val="15"/>
-                <w:szCs w:val="15"/>
-                <w:lang/>
+                <w14:ligatures w14:val="none"/>
+              </w:rPr>
+            </w:pPr>
+            <w:r>
+              <w:rPr>
+                <w:rFonts w:ascii="Helvetica Neue" w:eastAsia="Times New Roman" w:hAnsi="Helvetica Neue" w:cs="Times New Roman"/>
+                <w:color w:val="000000"/>
+                <w:kern w:val="0"/>
+                <w:sz w:val="15"/>
+                <w:szCs w:val="15"/>
                 <w14:ligatures w14:val="none"/>
               </w:rPr>
               <w:t>22.44</w:t>
@@ -11567,18 +13232,16 @@
               <w:rPr>
                 <w:rFonts w:ascii="Times New Roman" w:eastAsia="Times New Roman" w:hAnsi="Times New Roman" w:cs="Times New Roman"/>
                 <w:kern w:val="0"/>
-                <w:lang/>
-                <w14:ligatures w14:val="none"/>
-              </w:rPr>
-            </w:pPr>
-            <w:r>
-              <w:rPr>
-                <w:rFonts w:ascii="Helvetica Neue" w:eastAsia="Times New Roman" w:hAnsi="Helvetica Neue" w:cs="Times New Roman"/>
-                <w:color w:val="000000"/>
-                <w:kern w:val="0"/>
-                <w:sz w:val="15"/>
-                <w:szCs w:val="15"/>
-                <w:lang/>
+                <w14:ligatures w14:val="none"/>
+              </w:rPr>
+            </w:pPr>
+            <w:r>
+              <w:rPr>
+                <w:rFonts w:ascii="Helvetica Neue" w:eastAsia="Times New Roman" w:hAnsi="Helvetica Neue" w:cs="Times New Roman"/>
+                <w:color w:val="000000"/>
+                <w:kern w:val="0"/>
+                <w:sz w:val="15"/>
+                <w:szCs w:val="15"/>
                 <w14:ligatures w14:val="none"/>
               </w:rPr>
               <w:t>27</w:t>
@@ -11615,7 +13278,7 @@
               <w:rPr>
                 <w:rFonts w:ascii="Times New Roman" w:eastAsia="Times New Roman" w:hAnsi="Times New Roman" w:cs="Times New Roman"/>
                 <w:kern w:val="0"/>
-                <w:lang/>
+                <w:lang w:val="en-US"/>
                 <w14:ligatures w14:val="none"/>
               </w:rPr>
             </w:pPr>
@@ -11628,7 +13291,7 @@
                 <w:kern w:val="0"/>
                 <w:sz w:val="15"/>
                 <w:szCs w:val="15"/>
-                <w:lang/>
+                <w:lang w:val="en-US"/>
                 <w14:ligatures w14:val="none"/>
               </w:rPr>
               <w:t>+1 std. dev. to +2 std. dev.</w:t>
@@ -11659,18 +13322,16 @@
               <w:rPr>
                 <w:rFonts w:ascii="Times New Roman" w:eastAsia="Times New Roman" w:hAnsi="Times New Roman" w:cs="Times New Roman"/>
                 <w:kern w:val="0"/>
-                <w:lang/>
-                <w14:ligatures w14:val="none"/>
-              </w:rPr>
-            </w:pPr>
-            <w:r>
-              <w:rPr>
-                <w:rFonts w:ascii="Helvetica Neue" w:eastAsia="Times New Roman" w:hAnsi="Helvetica Neue" w:cs="Times New Roman"/>
-                <w:color w:val="000000"/>
-                <w:kern w:val="0"/>
-                <w:sz w:val="15"/>
-                <w:szCs w:val="15"/>
-                <w:lang/>
+                <w14:ligatures w14:val="none"/>
+              </w:rPr>
+            </w:pPr>
+            <w:r>
+              <w:rPr>
+                <w:rFonts w:ascii="Helvetica Neue" w:eastAsia="Times New Roman" w:hAnsi="Helvetica Neue" w:cs="Times New Roman"/>
+                <w:color w:val="000000"/>
+                <w:kern w:val="0"/>
+                <w:sz w:val="15"/>
+                <w:szCs w:val="15"/>
                 <w14:ligatures w14:val="none"/>
               </w:rPr>
               <w:t>13.5</w:t>
@@ -11701,18 +13362,16 @@
               <w:rPr>
                 <w:rFonts w:ascii="Times New Roman" w:eastAsia="Times New Roman" w:hAnsi="Times New Roman" w:cs="Times New Roman"/>
                 <w:kern w:val="0"/>
-                <w:lang/>
-                <w14:ligatures w14:val="none"/>
-              </w:rPr>
-            </w:pPr>
-            <w:r>
-              <w:rPr>
-                <w:rFonts w:ascii="Helvetica Neue" w:eastAsia="Times New Roman" w:hAnsi="Helvetica Neue" w:cs="Times New Roman"/>
-                <w:color w:val="000000"/>
-                <w:kern w:val="0"/>
-                <w:sz w:val="15"/>
-                <w:szCs w:val="15"/>
-                <w:lang/>
+                <w14:ligatures w14:val="none"/>
+              </w:rPr>
+            </w:pPr>
+            <w:r>
+              <w:rPr>
+                <w:rFonts w:ascii="Helvetica Neue" w:eastAsia="Times New Roman" w:hAnsi="Helvetica Neue" w:cs="Times New Roman"/>
+                <w:color w:val="000000"/>
+                <w:kern w:val="0"/>
+                <w:sz w:val="15"/>
+                <w:szCs w:val="15"/>
                 <w14:ligatures w14:val="none"/>
               </w:rPr>
               <w:t>8.91</w:t>
@@ -11743,18 +13402,16 @@
               <w:rPr>
                 <w:rFonts w:ascii="Times New Roman" w:eastAsia="Times New Roman" w:hAnsi="Times New Roman" w:cs="Times New Roman"/>
                 <w:kern w:val="0"/>
-                <w:lang/>
-                <w14:ligatures w14:val="none"/>
-              </w:rPr>
-            </w:pPr>
-            <w:r>
-              <w:rPr>
-                <w:rFonts w:ascii="Helvetica Neue" w:eastAsia="Times New Roman" w:hAnsi="Helvetica Neue" w:cs="Times New Roman"/>
-                <w:color w:val="000000"/>
-                <w:kern w:val="0"/>
-                <w:sz w:val="15"/>
-                <w:szCs w:val="15"/>
-                <w:lang/>
+                <w14:ligatures w14:val="none"/>
+              </w:rPr>
+            </w:pPr>
+            <w:r>
+              <w:rPr>
+                <w:rFonts w:ascii="Helvetica Neue" w:eastAsia="Times New Roman" w:hAnsi="Helvetica Neue" w:cs="Times New Roman"/>
+                <w:color w:val="000000"/>
+                <w:kern w:val="0"/>
+                <w:sz w:val="15"/>
+                <w:szCs w:val="15"/>
                 <w14:ligatures w14:val="none"/>
               </w:rPr>
               <w:t>9</w:t>
@@ -11791,7 +13448,7 @@
               <w:rPr>
                 <w:rFonts w:ascii="Times New Roman" w:eastAsia="Times New Roman" w:hAnsi="Times New Roman" w:cs="Times New Roman"/>
                 <w:kern w:val="0"/>
-                <w:lang/>
+                <w:lang w:val="en-US"/>
                 <w14:ligatures w14:val="none"/>
               </w:rPr>
             </w:pPr>
@@ -11804,7 +13461,7 @@
                 <w:kern w:val="0"/>
                 <w:sz w:val="15"/>
                 <w:szCs w:val="15"/>
-                <w:lang/>
+                <w:lang w:val="en-US"/>
                 <w14:ligatures w14:val="none"/>
               </w:rPr>
               <w:t>-1 std. dev. to -2 std. dev.</w:t>
@@ -11835,18 +13492,16 @@
               <w:rPr>
                 <w:rFonts w:ascii="Times New Roman" w:eastAsia="Times New Roman" w:hAnsi="Times New Roman" w:cs="Times New Roman"/>
                 <w:kern w:val="0"/>
-                <w:lang/>
-                <w14:ligatures w14:val="none"/>
-              </w:rPr>
-            </w:pPr>
-            <w:r>
-              <w:rPr>
-                <w:rFonts w:ascii="Helvetica Neue" w:eastAsia="Times New Roman" w:hAnsi="Helvetica Neue" w:cs="Times New Roman"/>
-                <w:color w:val="000000"/>
-                <w:kern w:val="0"/>
-                <w:sz w:val="15"/>
-                <w:szCs w:val="15"/>
-                <w:lang/>
+                <w14:ligatures w14:val="none"/>
+              </w:rPr>
+            </w:pPr>
+            <w:r>
+              <w:rPr>
+                <w:rFonts w:ascii="Helvetica Neue" w:eastAsia="Times New Roman" w:hAnsi="Helvetica Neue" w:cs="Times New Roman"/>
+                <w:color w:val="000000"/>
+                <w:kern w:val="0"/>
+                <w:sz w:val="15"/>
+                <w:szCs w:val="15"/>
                 <w14:ligatures w14:val="none"/>
               </w:rPr>
               <w:t>13.5</w:t>
@@ -11877,18 +13532,16 @@
               <w:rPr>
                 <w:rFonts w:ascii="Times New Roman" w:eastAsia="Times New Roman" w:hAnsi="Times New Roman" w:cs="Times New Roman"/>
                 <w:kern w:val="0"/>
-                <w:lang/>
-                <w14:ligatures w14:val="none"/>
-              </w:rPr>
-            </w:pPr>
-            <w:r>
-              <w:rPr>
-                <w:rFonts w:ascii="Helvetica Neue" w:eastAsia="Times New Roman" w:hAnsi="Helvetica Neue" w:cs="Times New Roman"/>
-                <w:color w:val="000000"/>
-                <w:kern w:val="0"/>
-                <w:sz w:val="15"/>
-                <w:szCs w:val="15"/>
-                <w:lang/>
+                <w14:ligatures w14:val="none"/>
+              </w:rPr>
+            </w:pPr>
+            <w:r>
+              <w:rPr>
+                <w:rFonts w:ascii="Helvetica Neue" w:eastAsia="Times New Roman" w:hAnsi="Helvetica Neue" w:cs="Times New Roman"/>
+                <w:color w:val="000000"/>
+                <w:kern w:val="0"/>
+                <w:sz w:val="15"/>
+                <w:szCs w:val="15"/>
                 <w14:ligatures w14:val="none"/>
               </w:rPr>
               <w:t>8.91</w:t>
@@ -11919,18 +13572,16 @@
               <w:rPr>
                 <w:rFonts w:ascii="Times New Roman" w:eastAsia="Times New Roman" w:hAnsi="Times New Roman" w:cs="Times New Roman"/>
                 <w:kern w:val="0"/>
-                <w:lang/>
-                <w14:ligatures w14:val="none"/>
-              </w:rPr>
-            </w:pPr>
-            <w:r>
-              <w:rPr>
-                <w:rFonts w:ascii="Helvetica Neue" w:eastAsia="Times New Roman" w:hAnsi="Helvetica Neue" w:cs="Times New Roman"/>
-                <w:color w:val="000000"/>
-                <w:kern w:val="0"/>
-                <w:sz w:val="15"/>
-                <w:szCs w:val="15"/>
-                <w:lang/>
+                <w14:ligatures w14:val="none"/>
+              </w:rPr>
+            </w:pPr>
+            <w:r>
+              <w:rPr>
+                <w:rFonts w:ascii="Helvetica Neue" w:eastAsia="Times New Roman" w:hAnsi="Helvetica Neue" w:cs="Times New Roman"/>
+                <w:color w:val="000000"/>
+                <w:kern w:val="0"/>
+                <w:sz w:val="15"/>
+                <w:szCs w:val="15"/>
                 <w14:ligatures w14:val="none"/>
               </w:rPr>
               <w:t>9</w:t>
@@ -11967,7 +13618,7 @@
               <w:rPr>
                 <w:rFonts w:ascii="Times New Roman" w:eastAsia="Times New Roman" w:hAnsi="Times New Roman" w:cs="Times New Roman"/>
                 <w:kern w:val="0"/>
-                <w:lang/>
+                <w:lang w:val="en-US"/>
                 <w14:ligatures w14:val="none"/>
               </w:rPr>
             </w:pPr>
@@ -11980,7 +13631,7 @@
                 <w:kern w:val="0"/>
                 <w:sz w:val="15"/>
                 <w:szCs w:val="15"/>
-                <w:lang/>
+                <w:lang w:val="en-US"/>
                 <w14:ligatures w14:val="none"/>
               </w:rPr>
               <w:t>+2 std. dev. to +3 std. dev.</w:t>
@@ -12011,18 +13662,16 @@
               <w:rPr>
                 <w:rFonts w:ascii="Times New Roman" w:eastAsia="Times New Roman" w:hAnsi="Times New Roman" w:cs="Times New Roman"/>
                 <w:kern w:val="0"/>
-                <w:lang/>
-                <w14:ligatures w14:val="none"/>
-              </w:rPr>
-            </w:pPr>
-            <w:r>
-              <w:rPr>
-                <w:rFonts w:ascii="Helvetica Neue" w:eastAsia="Times New Roman" w:hAnsi="Helvetica Neue" w:cs="Times New Roman"/>
-                <w:color w:val="000000"/>
-                <w:kern w:val="0"/>
-                <w:sz w:val="15"/>
-                <w:szCs w:val="15"/>
-                <w:lang/>
+                <w14:ligatures w14:val="none"/>
+              </w:rPr>
+            </w:pPr>
+            <w:r>
+              <w:rPr>
+                <w:rFonts w:ascii="Helvetica Neue" w:eastAsia="Times New Roman" w:hAnsi="Helvetica Neue" w:cs="Times New Roman"/>
+                <w:color w:val="000000"/>
+                <w:kern w:val="0"/>
+                <w:sz w:val="15"/>
+                <w:szCs w:val="15"/>
                 <w14:ligatures w14:val="none"/>
               </w:rPr>
               <w:t>2.35</w:t>
@@ -12053,18 +13702,16 @@
               <w:rPr>
                 <w:rFonts w:ascii="Times New Roman" w:eastAsia="Times New Roman" w:hAnsi="Times New Roman" w:cs="Times New Roman"/>
                 <w:kern w:val="0"/>
-                <w:lang/>
-                <w14:ligatures w14:val="none"/>
-              </w:rPr>
-            </w:pPr>
-            <w:r>
-              <w:rPr>
-                <w:rFonts w:ascii="Helvetica Neue" w:eastAsia="Times New Roman" w:hAnsi="Helvetica Neue" w:cs="Times New Roman"/>
-                <w:color w:val="000000"/>
-                <w:kern w:val="0"/>
-                <w:sz w:val="15"/>
-                <w:szCs w:val="15"/>
-                <w:lang/>
+                <w14:ligatures w14:val="none"/>
+              </w:rPr>
+            </w:pPr>
+            <w:r>
+              <w:rPr>
+                <w:rFonts w:ascii="Helvetica Neue" w:eastAsia="Times New Roman" w:hAnsi="Helvetica Neue" w:cs="Times New Roman"/>
+                <w:color w:val="000000"/>
+                <w:kern w:val="0"/>
+                <w:sz w:val="15"/>
+                <w:szCs w:val="15"/>
                 <w14:ligatures w14:val="none"/>
               </w:rPr>
               <w:t>1.55</w:t>
@@ -12095,18 +13742,16 @@
               <w:rPr>
                 <w:rFonts w:ascii="Times New Roman" w:eastAsia="Times New Roman" w:hAnsi="Times New Roman" w:cs="Times New Roman"/>
                 <w:kern w:val="0"/>
-                <w:lang/>
-                <w14:ligatures w14:val="none"/>
-              </w:rPr>
-            </w:pPr>
-            <w:r>
-              <w:rPr>
-                <w:rFonts w:ascii="Helvetica Neue" w:eastAsia="Times New Roman" w:hAnsi="Helvetica Neue" w:cs="Times New Roman"/>
-                <w:color w:val="000000"/>
-                <w:kern w:val="0"/>
-                <w:sz w:val="15"/>
-                <w:szCs w:val="15"/>
-                <w:lang/>
+                <w14:ligatures w14:val="none"/>
+              </w:rPr>
+            </w:pPr>
+            <w:r>
+              <w:rPr>
+                <w:rFonts w:ascii="Helvetica Neue" w:eastAsia="Times New Roman" w:hAnsi="Helvetica Neue" w:cs="Times New Roman"/>
+                <w:color w:val="000000"/>
+                <w:kern w:val="0"/>
+                <w:sz w:val="15"/>
+                <w:szCs w:val="15"/>
                 <w14:ligatures w14:val="none"/>
               </w:rPr>
               <w:t>2</w:t>
@@ -12143,7 +13788,7 @@
               <w:rPr>
                 <w:rFonts w:ascii="Times New Roman" w:eastAsia="Times New Roman" w:hAnsi="Times New Roman" w:cs="Times New Roman"/>
                 <w:kern w:val="0"/>
-                <w:lang/>
+                <w:lang w:val="en-US"/>
                 <w14:ligatures w14:val="none"/>
               </w:rPr>
             </w:pPr>
@@ -12156,7 +13801,7 @@
                 <w:kern w:val="0"/>
                 <w:sz w:val="15"/>
                 <w:szCs w:val="15"/>
-                <w:lang/>
+                <w:lang w:val="en-US"/>
                 <w14:ligatures w14:val="none"/>
               </w:rPr>
               <w:t>-2 std. dev. to -3 std. dev.</w:t>
@@ -12187,18 +13832,16 @@
               <w:rPr>
                 <w:rFonts w:ascii="Times New Roman" w:eastAsia="Times New Roman" w:hAnsi="Times New Roman" w:cs="Times New Roman"/>
                 <w:kern w:val="0"/>
-                <w:lang/>
-                <w14:ligatures w14:val="none"/>
-              </w:rPr>
-            </w:pPr>
-            <w:r>
-              <w:rPr>
-                <w:rFonts w:ascii="Helvetica Neue" w:eastAsia="Times New Roman" w:hAnsi="Helvetica Neue" w:cs="Times New Roman"/>
-                <w:color w:val="000000"/>
-                <w:kern w:val="0"/>
-                <w:sz w:val="15"/>
-                <w:szCs w:val="15"/>
-                <w:lang/>
+                <w14:ligatures w14:val="none"/>
+              </w:rPr>
+            </w:pPr>
+            <w:r>
+              <w:rPr>
+                <w:rFonts w:ascii="Helvetica Neue" w:eastAsia="Times New Roman" w:hAnsi="Helvetica Neue" w:cs="Times New Roman"/>
+                <w:color w:val="000000"/>
+                <w:kern w:val="0"/>
+                <w:sz w:val="15"/>
+                <w:szCs w:val="15"/>
                 <w14:ligatures w14:val="none"/>
               </w:rPr>
               <w:t>2.35</w:t>
@@ -12229,18 +13872,16 @@
               <w:rPr>
                 <w:rFonts w:ascii="Times New Roman" w:eastAsia="Times New Roman" w:hAnsi="Times New Roman" w:cs="Times New Roman"/>
                 <w:kern w:val="0"/>
-                <w:lang/>
-                <w14:ligatures w14:val="none"/>
-              </w:rPr>
-            </w:pPr>
-            <w:r>
-              <w:rPr>
-                <w:rFonts w:ascii="Helvetica Neue" w:eastAsia="Times New Roman" w:hAnsi="Helvetica Neue" w:cs="Times New Roman"/>
-                <w:color w:val="000000"/>
-                <w:kern w:val="0"/>
-                <w:sz w:val="15"/>
-                <w:szCs w:val="15"/>
-                <w:lang/>
+                <w14:ligatures w14:val="none"/>
+              </w:rPr>
+            </w:pPr>
+            <w:r>
+              <w:rPr>
+                <w:rFonts w:ascii="Helvetica Neue" w:eastAsia="Times New Roman" w:hAnsi="Helvetica Neue" w:cs="Times New Roman"/>
+                <w:color w:val="000000"/>
+                <w:kern w:val="0"/>
+                <w:sz w:val="15"/>
+                <w:szCs w:val="15"/>
                 <w14:ligatures w14:val="none"/>
               </w:rPr>
               <w:t>1.55</w:t>
@@ -12271,18 +13912,16 @@
               <w:rPr>
                 <w:rFonts w:ascii="Times New Roman" w:eastAsia="Times New Roman" w:hAnsi="Times New Roman" w:cs="Times New Roman"/>
                 <w:kern w:val="0"/>
-                <w:lang/>
-                <w14:ligatures w14:val="none"/>
-              </w:rPr>
-            </w:pPr>
-            <w:r>
-              <w:rPr>
-                <w:rFonts w:ascii="Helvetica Neue" w:eastAsia="Times New Roman" w:hAnsi="Helvetica Neue" w:cs="Times New Roman"/>
-                <w:color w:val="000000"/>
-                <w:kern w:val="0"/>
-                <w:sz w:val="15"/>
-                <w:szCs w:val="15"/>
-                <w:lang/>
+                <w14:ligatures w14:val="none"/>
+              </w:rPr>
+            </w:pPr>
+            <w:r>
+              <w:rPr>
+                <w:rFonts w:ascii="Helvetica Neue" w:eastAsia="Times New Roman" w:hAnsi="Helvetica Neue" w:cs="Times New Roman"/>
+                <w:color w:val="000000"/>
+                <w:kern w:val="0"/>
+                <w:sz w:val="15"/>
+                <w:szCs w:val="15"/>
                 <w14:ligatures w14:val="none"/>
               </w:rPr>
               <w:t>1</w:t>
@@ -12752,7 +14391,6 @@
                 <w:kern w:val="0"/>
                 <w:sz w:val="20"/>
                 <w:szCs w:val="20"/>
-                <w:lang/>
                 <w14:ligatures w14:val="none"/>
               </w:rPr>
             </w:pPr>
@@ -12765,7 +14403,6 @@
                 <w:kern w:val="0"/>
                 <w:sz w:val="20"/>
                 <w:szCs w:val="20"/>
-                <w:lang/>
                 <w14:ligatures w14:val="none"/>
               </w:rPr>
               <w:t>Statistic</w:t>
@@ -12798,7 +14435,6 @@
                 <w:kern w:val="0"/>
                 <w:sz w:val="20"/>
                 <w:szCs w:val="20"/>
-                <w:lang/>
                 <w14:ligatures w14:val="none"/>
               </w:rPr>
             </w:pPr>
@@ -12811,7 +14447,6 @@
                 <w:kern w:val="0"/>
                 <w:sz w:val="20"/>
                 <w:szCs w:val="20"/>
-                <w:lang/>
                 <w14:ligatures w14:val="none"/>
               </w:rPr>
               <w:t>Value</w:t>
@@ -12849,7 +14484,6 @@
                 <w:kern w:val="0"/>
                 <w:sz w:val="20"/>
                 <w:szCs w:val="20"/>
-                <w:lang/>
                 <w14:ligatures w14:val="none"/>
               </w:rPr>
             </w:pPr>
@@ -12862,7 +14496,6 @@
                 <w:kern w:val="0"/>
                 <w:sz w:val="20"/>
                 <w:szCs w:val="20"/>
-                <w:lang/>
                 <w14:ligatures w14:val="none"/>
               </w:rPr>
               <w:t>Skewness</w:t>
@@ -12894,7 +14527,6 @@
                 <w:kern w:val="0"/>
                 <w:sz w:val="20"/>
                 <w:szCs w:val="20"/>
-                <w:lang/>
                 <w14:ligatures w14:val="none"/>
               </w:rPr>
             </w:pPr>
@@ -12905,7 +14537,6 @@
                 <w:kern w:val="0"/>
                 <w:sz w:val="20"/>
                 <w:szCs w:val="20"/>
-                <w:lang/>
                 <w14:ligatures w14:val="none"/>
               </w:rPr>
               <w:t>0.317292179509407</w:t>
@@ -12943,7 +14574,6 @@
                 <w:kern w:val="0"/>
                 <w:sz w:val="20"/>
                 <w:szCs w:val="20"/>
-                <w:lang/>
                 <w14:ligatures w14:val="none"/>
               </w:rPr>
             </w:pPr>
@@ -12956,7 +14586,6 @@
                 <w:kern w:val="0"/>
                 <w:sz w:val="20"/>
                 <w:szCs w:val="20"/>
-                <w:lang/>
                 <w14:ligatures w14:val="none"/>
               </w:rPr>
               <w:t>Kurtosis</w:t>
@@ -12988,7 +14617,6 @@
                 <w:kern w:val="0"/>
                 <w:sz w:val="20"/>
                 <w:szCs w:val="20"/>
-                <w:lang/>
                 <w14:ligatures w14:val="none"/>
               </w:rPr>
             </w:pPr>
@@ -12999,7 +14627,6 @@
                 <w:kern w:val="0"/>
                 <w:sz w:val="20"/>
                 <w:szCs w:val="20"/>
-                <w:lang/>
                 <w14:ligatures w14:val="none"/>
               </w:rPr>
               <w:t>2.69511117112203</w:t>
@@ -13684,11 +15311,11 @@
     <w:name w:val="Normal"/>
     <w:qFormat/>
   </w:style>
-  <w:style w:type="paragraph" w:styleId="Ttulo1">
+  <w:style w:type="paragraph" w:styleId="Heading1">
     <w:name w:val="heading 1"/>
     <w:basedOn w:val="Normal"/>
     <w:next w:val="Normal"/>
-    <w:link w:val="Ttulo1Car"/>
+    <w:link w:val="Heading1Char"/>
     <w:uiPriority w:val="9"/>
     <w:qFormat/>
     <w:rsid w:val="002F1EE9"/>
@@ -13705,11 +15332,11 @@
       <w:szCs w:val="40"/>
     </w:rPr>
   </w:style>
-  <w:style w:type="paragraph" w:styleId="Ttulo2">
+  <w:style w:type="paragraph" w:styleId="Heading2">
     <w:name w:val="heading 2"/>
     <w:basedOn w:val="Normal"/>
     <w:next w:val="Normal"/>
-    <w:link w:val="Ttulo2Car"/>
+    <w:link w:val="Heading2Char"/>
     <w:uiPriority w:val="9"/>
     <w:semiHidden/>
     <w:unhideWhenUsed/>
@@ -13728,11 +15355,11 @@
       <w:szCs w:val="32"/>
     </w:rPr>
   </w:style>
-  <w:style w:type="paragraph" w:styleId="Ttulo3">
+  <w:style w:type="paragraph" w:styleId="Heading3">
     <w:name w:val="heading 3"/>
     <w:basedOn w:val="Normal"/>
     <w:next w:val="Normal"/>
-    <w:link w:val="Ttulo3Car"/>
+    <w:link w:val="Heading3Char"/>
     <w:uiPriority w:val="9"/>
     <w:semiHidden/>
     <w:unhideWhenUsed/>
@@ -13751,11 +15378,11 @@
       <w:szCs w:val="28"/>
     </w:rPr>
   </w:style>
-  <w:style w:type="paragraph" w:styleId="Ttulo4">
+  <w:style w:type="paragraph" w:styleId="Heading4">
     <w:name w:val="heading 4"/>
     <w:basedOn w:val="Normal"/>
     <w:next w:val="Normal"/>
-    <w:link w:val="Ttulo4Car"/>
+    <w:link w:val="Heading4Char"/>
     <w:uiPriority w:val="9"/>
     <w:semiHidden/>
     <w:unhideWhenUsed/>
@@ -13774,11 +15401,11 @@
       <w:color w:val="0F4761" w:themeColor="accent1" w:themeShade="BF"/>
     </w:rPr>
   </w:style>
-  <w:style w:type="paragraph" w:styleId="Ttulo5">
+  <w:style w:type="paragraph" w:styleId="Heading5">
     <w:name w:val="heading 5"/>
     <w:basedOn w:val="Normal"/>
     <w:next w:val="Normal"/>
-    <w:link w:val="Ttulo5Car"/>
+    <w:link w:val="Heading5Char"/>
     <w:uiPriority w:val="9"/>
     <w:semiHidden/>
     <w:unhideWhenUsed/>
@@ -13795,11 +15422,11 @@
       <w:color w:val="0F4761" w:themeColor="accent1" w:themeShade="BF"/>
     </w:rPr>
   </w:style>
-  <w:style w:type="paragraph" w:styleId="Ttulo6">
+  <w:style w:type="paragraph" w:styleId="Heading6">
     <w:name w:val="heading 6"/>
     <w:basedOn w:val="Normal"/>
     <w:next w:val="Normal"/>
-    <w:link w:val="Ttulo6Car"/>
+    <w:link w:val="Heading6Char"/>
     <w:uiPriority w:val="9"/>
     <w:semiHidden/>
     <w:unhideWhenUsed/>
@@ -13818,11 +15445,11 @@
       <w:color w:val="595959" w:themeColor="text1" w:themeTint="A6"/>
     </w:rPr>
   </w:style>
-  <w:style w:type="paragraph" w:styleId="Ttulo7">
+  <w:style w:type="paragraph" w:styleId="Heading7">
     <w:name w:val="heading 7"/>
     <w:basedOn w:val="Normal"/>
     <w:next w:val="Normal"/>
-    <w:link w:val="Ttulo7Car"/>
+    <w:link w:val="Heading7Char"/>
     <w:uiPriority w:val="9"/>
     <w:semiHidden/>
     <w:unhideWhenUsed/>
@@ -13839,11 +15466,11 @@
       <w:color w:val="595959" w:themeColor="text1" w:themeTint="A6"/>
     </w:rPr>
   </w:style>
-  <w:style w:type="paragraph" w:styleId="Ttulo8">
+  <w:style w:type="paragraph" w:styleId="Heading8">
     <w:name w:val="heading 8"/>
     <w:basedOn w:val="Normal"/>
     <w:next w:val="Normal"/>
-    <w:link w:val="Ttulo8Car"/>
+    <w:link w:val="Heading8Char"/>
     <w:uiPriority w:val="9"/>
     <w:semiHidden/>
     <w:unhideWhenUsed/>
@@ -13862,11 +15489,11 @@
       <w:color w:val="272727" w:themeColor="text1" w:themeTint="D8"/>
     </w:rPr>
   </w:style>
-  <w:style w:type="paragraph" w:styleId="Ttulo9">
+  <w:style w:type="paragraph" w:styleId="Heading9">
     <w:name w:val="heading 9"/>
     <w:basedOn w:val="Normal"/>
     <w:next w:val="Normal"/>
-    <w:link w:val="Ttulo9Car"/>
+    <w:link w:val="Heading9Char"/>
     <w:uiPriority w:val="9"/>
     <w:semiHidden/>
     <w:unhideWhenUsed/>
@@ -13883,13 +15510,13 @@
       <w:color w:val="272727" w:themeColor="text1" w:themeTint="D8"/>
     </w:rPr>
   </w:style>
-  <w:style w:type="character" w:default="1" w:styleId="Fuentedeprrafopredeter">
+  <w:style w:type="character" w:default="1" w:styleId="DefaultParagraphFont">
     <w:name w:val="Default Paragraph Font"/>
     <w:uiPriority w:val="1"/>
     <w:semiHidden/>
     <w:unhideWhenUsed/>
   </w:style>
-  <w:style w:type="table" w:default="1" w:styleId="Tablanormal">
+  <w:style w:type="table" w:default="1" w:styleId="TableNormal">
     <w:name w:val="Normal Table"/>
     <w:uiPriority w:val="99"/>
     <w:semiHidden/>
@@ -13904,16 +15531,16 @@
       </w:tblCellMar>
     </w:tblPr>
   </w:style>
-  <w:style w:type="numbering" w:default="1" w:styleId="Sinlista">
+  <w:style w:type="numbering" w:default="1" w:styleId="NoList">
     <w:name w:val="No List"/>
     <w:uiPriority w:val="99"/>
     <w:semiHidden/>
     <w:unhideWhenUsed/>
   </w:style>
-  <w:style w:type="character" w:customStyle="1" w:styleId="Ttulo1Car">
-    <w:name w:val="Título 1 Car"/>
-    <w:basedOn w:val="Fuentedeprrafopredeter"/>
-    <w:link w:val="Ttulo1"/>
+  <w:style w:type="character" w:customStyle="1" w:styleId="Heading1Char">
+    <w:name w:val="Heading 1 Char"/>
+    <w:basedOn w:val="DefaultParagraphFont"/>
+    <w:link w:val="Heading1"/>
     <w:uiPriority w:val="9"/>
     <w:rsid w:val="002F1EE9"/>
     <w:rPr>
@@ -13923,10 +15550,10 @@
       <w:szCs w:val="40"/>
     </w:rPr>
   </w:style>
-  <w:style w:type="character" w:customStyle="1" w:styleId="Ttulo2Car">
-    <w:name w:val="Título 2 Car"/>
-    <w:basedOn w:val="Fuentedeprrafopredeter"/>
-    <w:link w:val="Ttulo2"/>
+  <w:style w:type="character" w:customStyle="1" w:styleId="Heading2Char">
+    <w:name w:val="Heading 2 Char"/>
+    <w:basedOn w:val="DefaultParagraphFont"/>
+    <w:link w:val="Heading2"/>
     <w:uiPriority w:val="9"/>
     <w:semiHidden/>
     <w:rsid w:val="002F1EE9"/>
@@ -13937,10 +15564,10 @@
       <w:szCs w:val="32"/>
     </w:rPr>
   </w:style>
-  <w:style w:type="character" w:customStyle="1" w:styleId="Ttulo3Car">
-    <w:name w:val="Título 3 Car"/>
-    <w:basedOn w:val="Fuentedeprrafopredeter"/>
-    <w:link w:val="Ttulo3"/>
+  <w:style w:type="character" w:customStyle="1" w:styleId="Heading3Char">
+    <w:name w:val="Heading 3 Char"/>
+    <w:basedOn w:val="DefaultParagraphFont"/>
+    <w:link w:val="Heading3"/>
     <w:uiPriority w:val="9"/>
     <w:semiHidden/>
     <w:rsid w:val="002F1EE9"/>
@@ -13951,10 +15578,10 @@
       <w:szCs w:val="28"/>
     </w:rPr>
   </w:style>
-  <w:style w:type="character" w:customStyle="1" w:styleId="Ttulo4Car">
-    <w:name w:val="Título 4 Car"/>
-    <w:basedOn w:val="Fuentedeprrafopredeter"/>
-    <w:link w:val="Ttulo4"/>
+  <w:style w:type="character" w:customStyle="1" w:styleId="Heading4Char">
+    <w:name w:val="Heading 4 Char"/>
+    <w:basedOn w:val="DefaultParagraphFont"/>
+    <w:link w:val="Heading4"/>
     <w:uiPriority w:val="9"/>
     <w:semiHidden/>
     <w:rsid w:val="002F1EE9"/>
@@ -13965,10 +15592,10 @@
       <w:color w:val="0F4761" w:themeColor="accent1" w:themeShade="BF"/>
     </w:rPr>
   </w:style>
-  <w:style w:type="character" w:customStyle="1" w:styleId="Ttulo5Car">
-    <w:name w:val="Título 5 Car"/>
-    <w:basedOn w:val="Fuentedeprrafopredeter"/>
-    <w:link w:val="Ttulo5"/>
+  <w:style w:type="character" w:customStyle="1" w:styleId="Heading5Char">
+    <w:name w:val="Heading 5 Char"/>
+    <w:basedOn w:val="DefaultParagraphFont"/>
+    <w:link w:val="Heading5"/>
     <w:uiPriority w:val="9"/>
     <w:semiHidden/>
     <w:rsid w:val="002F1EE9"/>
@@ -13977,10 +15604,10 @@
       <w:color w:val="0F4761" w:themeColor="accent1" w:themeShade="BF"/>
     </w:rPr>
   </w:style>
-  <w:style w:type="character" w:customStyle="1" w:styleId="Ttulo6Car">
-    <w:name w:val="Título 6 Car"/>
-    <w:basedOn w:val="Fuentedeprrafopredeter"/>
-    <w:link w:val="Ttulo6"/>
+  <w:style w:type="character" w:customStyle="1" w:styleId="Heading6Char">
+    <w:name w:val="Heading 6 Char"/>
+    <w:basedOn w:val="DefaultParagraphFont"/>
+    <w:link w:val="Heading6"/>
     <w:uiPriority w:val="9"/>
     <w:semiHidden/>
     <w:rsid w:val="002F1EE9"/>
@@ -13991,10 +15618,10 @@
       <w:color w:val="595959" w:themeColor="text1" w:themeTint="A6"/>
     </w:rPr>
   </w:style>
-  <w:style w:type="character" w:customStyle="1" w:styleId="Ttulo7Car">
-    <w:name w:val="Título 7 Car"/>
-    <w:basedOn w:val="Fuentedeprrafopredeter"/>
-    <w:link w:val="Ttulo7"/>
+  <w:style w:type="character" w:customStyle="1" w:styleId="Heading7Char">
+    <w:name w:val="Heading 7 Char"/>
+    <w:basedOn w:val="DefaultParagraphFont"/>
+    <w:link w:val="Heading7"/>
     <w:uiPriority w:val="9"/>
     <w:semiHidden/>
     <w:rsid w:val="002F1EE9"/>
@@ -14003,10 +15630,10 @@
       <w:color w:val="595959" w:themeColor="text1" w:themeTint="A6"/>
     </w:rPr>
   </w:style>
-  <w:style w:type="character" w:customStyle="1" w:styleId="Ttulo8Car">
-    <w:name w:val="Título 8 Car"/>
-    <w:basedOn w:val="Fuentedeprrafopredeter"/>
-    <w:link w:val="Ttulo8"/>
+  <w:style w:type="character" w:customStyle="1" w:styleId="Heading8Char">
+    <w:name w:val="Heading 8 Char"/>
+    <w:basedOn w:val="DefaultParagraphFont"/>
+    <w:link w:val="Heading8"/>
     <w:uiPriority w:val="9"/>
     <w:semiHidden/>
     <w:rsid w:val="002F1EE9"/>
@@ -14017,10 +15644,10 @@
       <w:color w:val="272727" w:themeColor="text1" w:themeTint="D8"/>
     </w:rPr>
   </w:style>
-  <w:style w:type="character" w:customStyle="1" w:styleId="Ttulo9Car">
-    <w:name w:val="Título 9 Car"/>
-    <w:basedOn w:val="Fuentedeprrafopredeter"/>
-    <w:link w:val="Ttulo9"/>
+  <w:style w:type="character" w:customStyle="1" w:styleId="Heading9Char">
+    <w:name w:val="Heading 9 Char"/>
+    <w:basedOn w:val="DefaultParagraphFont"/>
+    <w:link w:val="Heading9"/>
     <w:uiPriority w:val="9"/>
     <w:semiHidden/>
     <w:rsid w:val="002F1EE9"/>
@@ -14029,11 +15656,11 @@
       <w:color w:val="272727" w:themeColor="text1" w:themeTint="D8"/>
     </w:rPr>
   </w:style>
-  <w:style w:type="paragraph" w:styleId="Ttulo">
+  <w:style w:type="paragraph" w:styleId="Title">
     <w:name w:val="Title"/>
     <w:basedOn w:val="Normal"/>
     <w:next w:val="Normal"/>
-    <w:link w:val="TtuloCar"/>
+    <w:link w:val="TitleChar"/>
     <w:uiPriority w:val="10"/>
     <w:qFormat/>
     <w:rsid w:val="002F1EE9"/>
@@ -14049,10 +15676,10 @@
       <w:szCs w:val="56"/>
     </w:rPr>
   </w:style>
-  <w:style w:type="character" w:customStyle="1" w:styleId="TtuloCar">
-    <w:name w:val="Título Car"/>
-    <w:basedOn w:val="Fuentedeprrafopredeter"/>
-    <w:link w:val="Ttulo"/>
+  <w:style w:type="character" w:customStyle="1" w:styleId="TitleChar">
+    <w:name w:val="Title Char"/>
+    <w:basedOn w:val="DefaultParagraphFont"/>
+    <w:link w:val="Title"/>
     <w:uiPriority w:val="10"/>
     <w:rsid w:val="002F1EE9"/>
     <w:rPr>
@@ -14063,11 +15690,11 @@
       <w:szCs w:val="56"/>
     </w:rPr>
   </w:style>
-  <w:style w:type="paragraph" w:styleId="Subttulo">
+  <w:style w:type="paragraph" w:styleId="Subtitle">
     <w:name w:val="Subtitle"/>
     <w:basedOn w:val="Normal"/>
     <w:next w:val="Normal"/>
-    <w:link w:val="SubttuloCar"/>
+    <w:link w:val="SubtitleChar"/>
     <w:uiPriority w:val="11"/>
     <w:qFormat/>
     <w:rsid w:val="002F1EE9"/>
@@ -14084,10 +15711,10 @@
       <w:szCs w:val="28"/>
     </w:rPr>
   </w:style>
-  <w:style w:type="character" w:customStyle="1" w:styleId="SubttuloCar">
-    <w:name w:val="Subtítulo Car"/>
-    <w:basedOn w:val="Fuentedeprrafopredeter"/>
-    <w:link w:val="Subttulo"/>
+  <w:style w:type="character" w:customStyle="1" w:styleId="SubtitleChar">
+    <w:name w:val="Subtitle Char"/>
+    <w:basedOn w:val="DefaultParagraphFont"/>
+    <w:link w:val="Subtitle"/>
     <w:uiPriority w:val="11"/>
     <w:rsid w:val="002F1EE9"/>
     <w:rPr>
@@ -14098,11 +15725,11 @@
       <w:szCs w:val="28"/>
     </w:rPr>
   </w:style>
-  <w:style w:type="paragraph" w:styleId="Cita">
+  <w:style w:type="paragraph" w:styleId="Quote">
     <w:name w:val="Quote"/>
     <w:basedOn w:val="Normal"/>
     <w:next w:val="Normal"/>
-    <w:link w:val="CitaCar"/>
+    <w:link w:val="QuoteChar"/>
     <w:uiPriority w:val="29"/>
     <w:qFormat/>
     <w:rsid w:val="002F1EE9"/>
@@ -14116,10 +15743,10 @@
       <w:color w:val="404040" w:themeColor="text1" w:themeTint="BF"/>
     </w:rPr>
   </w:style>
-  <w:style w:type="character" w:customStyle="1" w:styleId="CitaCar">
-    <w:name w:val="Cita Car"/>
-    <w:basedOn w:val="Fuentedeprrafopredeter"/>
-    <w:link w:val="Cita"/>
+  <w:style w:type="character" w:customStyle="1" w:styleId="QuoteChar">
+    <w:name w:val="Quote Char"/>
+    <w:basedOn w:val="DefaultParagraphFont"/>
+    <w:link w:val="Quote"/>
     <w:uiPriority w:val="29"/>
     <w:rsid w:val="002F1EE9"/>
     <w:rPr>
@@ -14128,7 +15755,7 @@
       <w:color w:val="404040" w:themeColor="text1" w:themeTint="BF"/>
     </w:rPr>
   </w:style>
-  <w:style w:type="paragraph" w:styleId="Prrafodelista">
+  <w:style w:type="paragraph" w:styleId="ListParagraph">
     <w:name w:val="List Paragraph"/>
     <w:basedOn w:val="Normal"/>
     <w:uiPriority w:val="34"/>
@@ -14139,9 +15766,9 @@
       <w:contextualSpacing/>
     </w:pPr>
   </w:style>
-  <w:style w:type="character" w:styleId="nfasisintenso">
+  <w:style w:type="character" w:styleId="IntenseEmphasis">
     <w:name w:val="Intense Emphasis"/>
-    <w:basedOn w:val="Fuentedeprrafopredeter"/>
+    <w:basedOn w:val="DefaultParagraphFont"/>
     <w:uiPriority w:val="21"/>
     <w:qFormat/>
     <w:rsid w:val="002F1EE9"/>
@@ -14151,11 +15778,11 @@
       <w:color w:val="0F4761" w:themeColor="accent1" w:themeShade="BF"/>
     </w:rPr>
   </w:style>
-  <w:style w:type="paragraph" w:styleId="Citadestacada">
+  <w:style w:type="paragraph" w:styleId="IntenseQuote">
     <w:name w:val="Intense Quote"/>
     <w:basedOn w:val="Normal"/>
     <w:next w:val="Normal"/>
-    <w:link w:val="CitadestacadaCar"/>
+    <w:link w:val="IntenseQuoteChar"/>
     <w:uiPriority w:val="30"/>
     <w:qFormat/>
     <w:rsid w:val="002F1EE9"/>
@@ -14174,10 +15801,10 @@
       <w:color w:val="0F4761" w:themeColor="accent1" w:themeShade="BF"/>
     </w:rPr>
   </w:style>
-  <w:style w:type="character" w:customStyle="1" w:styleId="CitadestacadaCar">
-    <w:name w:val="Cita destacada Car"/>
-    <w:basedOn w:val="Fuentedeprrafopredeter"/>
-    <w:link w:val="Citadestacada"/>
+  <w:style w:type="character" w:customStyle="1" w:styleId="IntenseQuoteChar">
+    <w:name w:val="Intense Quote Char"/>
+    <w:basedOn w:val="DefaultParagraphFont"/>
+    <w:link w:val="IntenseQuote"/>
     <w:uiPriority w:val="30"/>
     <w:rsid w:val="002F1EE9"/>
     <w:rPr>
@@ -14186,9 +15813,9 @@
       <w:color w:val="0F4761" w:themeColor="accent1" w:themeShade="BF"/>
     </w:rPr>
   </w:style>
-  <w:style w:type="character" w:styleId="Referenciaintensa">
+  <w:style w:type="character" w:styleId="IntenseReference">
     <w:name w:val="Intense Reference"/>
-    <w:basedOn w:val="Fuentedeprrafopredeter"/>
+    <w:basedOn w:val="DefaultParagraphFont"/>
     <w:uiPriority w:val="32"/>
     <w:qFormat/>
     <w:rsid w:val="002F1EE9"/>
@@ -14200,10 +15827,10 @@
       <w:spacing w:val="5"/>
     </w:rPr>
   </w:style>
-  <w:style w:type="paragraph" w:styleId="Encabezado">
+  <w:style w:type="paragraph" w:styleId="Header">
     <w:name w:val="header"/>
     <w:basedOn w:val="Normal"/>
-    <w:link w:val="EncabezadoCar"/>
+    <w:link w:val="HeaderChar"/>
     <w:uiPriority w:val="99"/>
     <w:unhideWhenUsed/>
     <w:rsid w:val="00424255"/>
@@ -14215,17 +15842,17 @@
       <w:spacing w:after="0" w:line="240" w:lineRule="auto"/>
     </w:pPr>
   </w:style>
-  <w:style w:type="character" w:customStyle="1" w:styleId="EncabezadoCar">
-    <w:name w:val="Encabezado Car"/>
-    <w:basedOn w:val="Fuentedeprrafopredeter"/>
-    <w:link w:val="Encabezado"/>
+  <w:style w:type="character" w:customStyle="1" w:styleId="HeaderChar">
+    <w:name w:val="Header Char"/>
+    <w:basedOn w:val="DefaultParagraphFont"/>
+    <w:link w:val="Header"/>
     <w:uiPriority w:val="99"/>
     <w:rsid w:val="00424255"/>
   </w:style>
-  <w:style w:type="paragraph" w:styleId="Piedepgina">
+  <w:style w:type="paragraph" w:styleId="Footer">
     <w:name w:val="footer"/>
     <w:basedOn w:val="Normal"/>
-    <w:link w:val="PiedepginaCar"/>
+    <w:link w:val="FooterChar"/>
     <w:uiPriority w:val="99"/>
     <w:unhideWhenUsed/>
     <w:rsid w:val="00424255"/>
@@ -14237,10 +15864,10 @@
       <w:spacing w:after="0" w:line="240" w:lineRule="auto"/>
     </w:pPr>
   </w:style>
-  <w:style w:type="character" w:customStyle="1" w:styleId="PiedepginaCar">
-    <w:name w:val="Pie de página Car"/>
-    <w:basedOn w:val="Fuentedeprrafopredeter"/>
-    <w:link w:val="Piedepgina"/>
+  <w:style w:type="character" w:customStyle="1" w:styleId="FooterChar">
+    <w:name w:val="Footer Char"/>
+    <w:basedOn w:val="DefaultParagraphFont"/>
+    <w:link w:val="Footer"/>
     <w:uiPriority w:val="99"/>
     <w:rsid w:val="00424255"/>
   </w:style>
@@ -14277,17 +15904,17 @@
   </w:style>
   <w:style w:type="character" w:customStyle="1" w:styleId="normaltextrun">
     <w:name w:val="normaltextrun"/>
-    <w:basedOn w:val="Fuentedeprrafopredeter"/>
+    <w:basedOn w:val="DefaultParagraphFont"/>
     <w:rsid w:val="004C1576"/>
   </w:style>
   <w:style w:type="character" w:customStyle="1" w:styleId="eop">
     <w:name w:val="eop"/>
-    <w:basedOn w:val="Fuentedeprrafopredeter"/>
+    <w:basedOn w:val="DefaultParagraphFont"/>
     <w:rsid w:val="004C1576"/>
   </w:style>
   <w:style w:type="character" w:customStyle="1" w:styleId="wacimagecontainer">
     <w:name w:val="wacimagecontainer"/>
-    <w:basedOn w:val="Fuentedeprrafopredeter"/>
+    <w:basedOn w:val="DefaultParagraphFont"/>
     <w:rsid w:val="000F57F4"/>
   </w:style>
   <w:style w:type="paragraph" w:customStyle="1" w:styleId="font-claude-response-body">
@@ -14300,13 +15927,12 @@
     <w:rPr>
       <w:rFonts w:ascii="Times New Roman" w:eastAsia="Times New Roman" w:hAnsi="Times New Roman" w:cs="Times New Roman"/>
       <w:kern w:val="0"/>
-      <w:lang/>
       <w14:ligatures w14:val="none"/>
     </w:rPr>
   </w:style>
-  <w:style w:type="character" w:styleId="Fuerte">
+  <w:style w:type="character" w:styleId="Strong">
     <w:name w:val="Strong"/>
-    <w:basedOn w:val="Fuentedeprrafopredeter"/>
+    <w:basedOn w:val="DefaultParagraphFont"/>
     <w:uiPriority w:val="22"/>
     <w:qFormat/>
     <w:rsid w:val="00ED3FFB"/>

</xml_diff>